<commit_message>
docs(technique): documentation technique complétée (PDF de l'OM signé, restauration, cache RBAC)
Évolutions 1.3, §4.4 signatures de l'état sur le PDF de l'OM et clé de cache,
§4.7 purge de la matrice à la restauration et périmètre du dump, §6.2.1 cache
sans expiration, §7 exercice non consommé, §10 558 tests. Document régénéré
par generer_documentation_technique.py. Entrée CHANGELOG.

Co-Authored-By: Claude Opus 5.5 <noreply@anthropic.com>
Claude-Session: https://claude.ai/code/session_01MUfkbbz4qHVd6KNyyZzHX8
</commit_message>
<xml_diff>
--- a/docs/ANaTT_Documentation_Technique_Fonctionnelle.docx
+++ b/docs/ANaTT_Documentation_Technique_Fonctionnelle.docx
@@ -842,6 +842,100 @@
                 <w:sz w:val="19"/>
               </w:rPr>
               <w:t>§2.2, §10</w:t>
+            </w:r>
+          </w:p>
+        </w:tc>
+      </w:tr>
+      <w:tr>
+        <w:tc>
+          <w:tcPr>
+            <w:tcW w:type="dxa" w:w="2041"/>
+          </w:tcPr>
+          <w:p>
+            <w:r/>
+            <w:r>
+              <w:rPr>
+                <w:b w:val="0"/>
+                <w:sz w:val="19"/>
+              </w:rPr>
+              <w:t>PDF de l'OM</w:t>
+            </w:r>
+          </w:p>
+        </w:tc>
+        <w:tc>
+          <w:tcPr>
+            <w:tcW w:type="dxa" w:w="6009"/>
+          </w:tcPr>
+          <w:p>
+            <w:r/>
+            <w:r>
+              <w:rPr>
+                <w:b w:val="0"/>
+                <w:sz w:val="19"/>
+              </w:rPr>
+              <w:t>Reprend les signatures de l'état des avances qui couvre l'OM (instantané, paraphe archivé, même code de vérification) ; clé de cache incluant le statut de l'état.</w:t>
+            </w:r>
+          </w:p>
+        </w:tc>
+        <w:tc>
+          <w:tcPr>
+            <w:tcW w:type="dxa" w:w="1474"/>
+          </w:tcPr>
+          <w:p>
+            <w:r/>
+            <w:r>
+              <w:rPr>
+                <w:b w:val="0"/>
+                <w:sz w:val="19"/>
+              </w:rPr>
+              <w:t>§4.4</w:t>
+            </w:r>
+          </w:p>
+        </w:tc>
+      </w:tr>
+      <w:tr>
+        <w:tc>
+          <w:tcPr>
+            <w:tcW w:type="dxa" w:w="2041"/>
+          </w:tcPr>
+          <w:p>
+            <w:r/>
+            <w:r>
+              <w:rPr>
+                <w:b w:val="0"/>
+                <w:sz w:val="19"/>
+              </w:rPr>
+              <w:t>Restauration</w:t>
+            </w:r>
+          </w:p>
+        </w:tc>
+        <w:tc>
+          <w:tcPr>
+            <w:tcW w:type="dxa" w:w="6009"/>
+          </w:tcPr>
+          <w:p>
+            <w:r/>
+            <w:r>
+              <w:rPr>
+                <w:b w:val="0"/>
+                <w:sz w:val="19"/>
+              </w:rPr>
+              <w:t>db:restore purge la matrice des permissions mise en cache (rememberForever) ; settings.json et fichiers du disque local hors sauvegarde.</w:t>
+            </w:r>
+          </w:p>
+        </w:tc>
+        <w:tc>
+          <w:tcPr>
+            <w:tcW w:type="dxa" w:w="1474"/>
+          </w:tcPr>
+          <w:p>
+            <w:r/>
+            <w:r>
+              <w:rPr>
+                <w:b w:val="0"/>
+                <w:sz w:val="19"/>
+              </w:rPr>
+              <w:t>§4.7, §6.2.1</w:t>
             </w:r>
           </w:p>
         </w:tc>
@@ -7044,6 +7138,68 @@
                 <w:b w:val="0"/>
                 <w:sz w:val="19"/>
               </w:rPr>
+              <w:t>Système</w:t>
+            </w:r>
+          </w:p>
+        </w:tc>
+        <w:tc>
+          <w:tcPr>
+            <w:tcW w:type="dxa" w:w="4876"/>
+          </w:tcPr>
+          <w:p>
+            <w:r/>
+            <w:r>
+              <w:rPr>
+                <w:b w:val="0"/>
+                <w:sz w:val="19"/>
+              </w:rPr>
+              <w:t>Blocs de signature : signature portée par l'OM (circuit par OM, données héritées) en priorité, sinon celle de l'état des AVANCES qui couvre l'OM (PdfGenerator::etatSignataire).</w:t>
+            </w:r>
+          </w:p>
+        </w:tc>
+        <w:tc>
+          <w:tcPr>
+            <w:tcW w:type="dxa" w:w="2721"/>
+          </w:tcPr>
+          <w:p>
+            <w:r/>
+            <w:r>
+              <w:rPr>
+                <w:b w:val="0"/>
+                <w:sz w:val="19"/>
+              </w:rPr>
+              <w:t>Mêmes nom, fonction, paraphe archivé et code de vérification que l'état</w:t>
+            </w:r>
+          </w:p>
+        </w:tc>
+      </w:tr>
+      <w:tr>
+        <w:tc>
+          <w:tcPr>
+            <w:tcW w:type="dxa" w:w="454"/>
+          </w:tcPr>
+          <w:p>
+            <w:r/>
+            <w:r>
+              <w:rPr>
+                <w:b w:val="0"/>
+                <w:sz w:val="19"/>
+              </w:rPr>
+              <w:t>4</w:t>
+            </w:r>
+          </w:p>
+        </w:tc>
+        <w:tc>
+          <w:tcPr>
+            <w:tcW w:type="dxa" w:w="1474"/>
+          </w:tcPr>
+          <w:p>
+            <w:r/>
+            <w:r>
+              <w:rPr>
+                <w:b w:val="0"/>
+                <w:sz w:val="19"/>
+              </w:rPr>
               <w:t>Utilisateur</w:t>
             </w:r>
           </w:p>
@@ -7081,6 +7237,22 @@
       </w:tr>
     </w:tbl>
     <w:p/>
+    <w:p>
+      <w:pPr>
+        <w:pStyle w:val="ListBullet"/>
+      </w:pPr>
+      <w:r>
+        <w:t>Couverture par l'état : l'OM doit figurer dans le tableau lignes figé au récapitulatif (numero = reference_semo) ; un OM REJETE / ANNULE ou un état REJETE ne fournit aucune signature, et un brouillon n'en montre jamais.</w:t>
+      </w:r>
+    </w:p>
+    <w:p>
+      <w:pPr>
+        <w:pStyle w:val="ListBullet"/>
+      </w:pPr>
+      <w:r>
+        <w:t>Cache : ordres/OM-{ref}-{statut}[-ETAT-{statut_etat}].pdf — le statut de l'état entre dans la clé, pour qu'une signature apposée sur l'état régénère le PDF d'un OM resté au même statut. Tests : OmPdfSignaturesEtatTest.</w:t>
+      </w:r>
+    </w:p>
     <w:p>
       <w:pPr>
         <w:pStyle w:val="Heading2"/>
@@ -8063,6 +8235,68 @@
                 <w:b w:val="0"/>
                 <w:sz w:val="19"/>
               </w:rPr>
+              <w:t>Purge la matrice des permissions mise en cache (PermissionRepository::vider) : role_permissions vient d'être remplacée.</w:t>
+            </w:r>
+          </w:p>
+        </w:tc>
+        <w:tc>
+          <w:tcPr>
+            <w:tcW w:type="dxa" w:w="2494"/>
+          </w:tcPr>
+          <w:p>
+            <w:r/>
+            <w:r>
+              <w:rPr>
+                <w:b w:val="0"/>
+                <w:sz w:val="19"/>
+              </w:rPr>
+              <w:t>Droits de la sauvegarde effectifs dès la requête suivante</w:t>
+            </w:r>
+          </w:p>
+        </w:tc>
+      </w:tr>
+      <w:tr>
+        <w:tc>
+          <w:tcPr>
+            <w:tcW w:type="dxa" w:w="454"/>
+          </w:tcPr>
+          <w:p>
+            <w:r/>
+            <w:r>
+              <w:rPr>
+                <w:b w:val="0"/>
+                <w:sz w:val="19"/>
+              </w:rPr>
+              <w:t>6</w:t>
+            </w:r>
+          </w:p>
+        </w:tc>
+        <w:tc>
+          <w:tcPr>
+            <w:tcW w:type="dxa" w:w="1587"/>
+          </w:tcPr>
+          <w:p>
+            <w:r/>
+            <w:r>
+              <w:rPr>
+                <w:b w:val="0"/>
+                <w:sz w:val="19"/>
+              </w:rPr>
+              <w:t>Système</w:t>
+            </w:r>
+          </w:p>
+        </w:tc>
+        <w:tc>
+          <w:tcPr>
+            <w:tcW w:type="dxa" w:w="4989"/>
+          </w:tcPr>
+          <w:p>
+            <w:r/>
+            <w:r>
+              <w:rPr>
+                <w:b w:val="0"/>
+                <w:sz w:val="19"/>
+              </w:rPr>
               <w:t>Audit BACKUP_RESTORE écrit APRÈS la restauration (dans la base restaurée).</w:t>
             </w:r>
           </w:p>
@@ -8085,6 +8319,14 @@
       </w:tr>
     </w:tbl>
     <w:p/>
+    <w:p>
+      <w:pPr>
+        <w:pStyle w:val="ListBullet"/>
+      </w:pPr>
+      <w:r>
+        <w:t>Hors périmètre du dump : storage/app/settings.json (part d'avance, exercice, SMTP…), paraphes des signataires et fichiers produits (PDF, fichiers de paiement) sur le disque local. Une restauration ne les modifie pas ; leur sauvegarde relève de la copie de storage/.</w:t>
+      </w:r>
+    </w:p>
     <w:p>
       <w:pPr>
         <w:pStyle w:val="Heading1"/>
@@ -11493,7 +11735,7 @@
         <w:pStyle w:val="ListBullet"/>
       </w:pPr>
       <w:r>
-        <w:t>Niveau 1 — profil : table role_permissions (PermissionRepository, en cache, purgée à l'écriture) ; repli sur config/profils.php ; réinitialisable au défaut.</w:t>
+        <w:t>Niveau 1 — profil : table role_permissions (PermissionRepository, en cache sans expiration, purgée à l'écriture et après db:restore) ; repli sur config/profils.php ; réinitialisable au défaut. Toute modification de role_permissions hors application impose une purge du cache.</w:t>
       </w:r>
     </w:p>
     <w:p>
@@ -14160,7 +14402,7 @@
                 <w:b w:val="0"/>
                 <w:sz w:val="19"/>
               </w:rPr>
-              <w:t>Exercice courant (lecture publique)</w:t>
+              <w:t>Exercice courant (lecture publique) — exposé mais consommé par aucun écran ni rapport à ce jour (cf. docs/annee-fiscale.md)</w:t>
             </w:r>
           </w:p>
         </w:tc>
@@ -16163,7 +16405,7 @@
                 <w:b w:val="0"/>
                 <w:sz w:val="19"/>
               </w:rPr>
-              <w:t>API complète : circuits, scellés, idempotence, RBAC, amendement, paiements, sauvegardes</w:t>
+              <w:t>API complète : circuits, scellés, idempotence, RBAC, amendement, paiements, sauvegardes, PDF</w:t>
             </w:r>
           </w:p>
         </w:tc>
@@ -16178,7 +16420,7 @@
                 <w:b w:val="0"/>
                 <w:sz w:val="19"/>
               </w:rPr>
-              <w:t>552 tests au total</w:t>
+              <w:t>558 tests au total (66 fichiers)</w:t>
             </w:r>
           </w:p>
         </w:tc>

</xml_diff>

<commit_message>
PDF de l'OM amendé : cache invalidé, répartition réelle ; amendement-om.md à jour
- PdfGenerator : la clé de cache compte les amendements (-AMD{n}) — l'écran
  télécharge /pdf/download, qui servait le PDF d'avant l'amendement.
- Libellés de répartition tirés des montants de l'OM : avance engagée, reliquat
  ajusté, trop-perçu ; encadré du dernier amendement ; « Montant total dû » en
  cas de trop-perçu ; taux journalier affiché hors transport.
- tests/Feature/OmPdfAmendementTest.php (5 cas, échouent sans le correctif).
- docs/amendement-om.md : §4.6, §3 complété, note Phase 2 précisée, échec des
  générations en file, références. Clé de cache alignée dans circuits-validation,
  CLAUDE, AGENTS, openapi.yaml, parametrage-part-avance ; CHANGELOG, revue
  (défaut 16), compteurs (570), doc technique régénérée.

Co-Authored-By: Claude Opus 5.5 <noreply@anthropic.com>
Claude-Session: https://claude.ai/code/session_01MUfkbbz4qHVd6KNyyZzHX8
</commit_message>
<xml_diff>
--- a/docs/ANaTT_Documentation_Technique_Fonctionnelle.docx
+++ b/docs/ANaTT_Documentation_Technique_Fonctionnelle.docx
@@ -7250,7 +7250,15 @@
         <w:pStyle w:val="ListBullet"/>
       </w:pPr>
       <w:r>
-        <w:t>Cache : ordres/OM-{ref}-{statut}[-ETAT-{statut_etat}].pdf — le statut de l'état entre dans la clé, pour qu'une signature apposée sur l'état régénère le PDF d'un OM resté au même statut. Tests : OmPdfSignaturesEtatTest.</w:t>
+        <w:t>Cache : ordres/OM-{ref}-{statut}[-ETAT-{statut_etat}][-AMD{n}].pdf — le statut de l'état et le nombre d'amendements entrent dans la clé, pour qu'une signature apposée sur l'état ou un amendement régénère le PDF d'un OM resté au même statut. Tests : OmPdfSignaturesEtatTest, OmPdfAmendementTest.</w:t>
+      </w:r>
+    </w:p>
+    <w:p>
+      <w:pPr>
+        <w:pStyle w:val="ListBullet"/>
+      </w:pPr>
+      <w:r>
+        <w:t>Après un amendement, la répartition affichée suit les montants réels : « Avance engagée », « Reliquat (ajusté par amendement) » ou « Trop-perçu (à recouvrer par retenue sur salaire) », avec un encadré rappelant le dernier amendement ; le taux journalier affiché exclut le transport.</w:t>
       </w:r>
     </w:p>
     <w:p>
@@ -16420,7 +16428,7 @@
                 <w:b w:val="0"/>
                 <w:sz w:val="19"/>
               </w:rPr>
-              <w:t>565 tests au total (67 fichiers)</w:t>
+              <w:t>570 tests au total (68 fichiers)</w:t>
             </w:r>
           </w:p>
         </w:tc>

</xml_diff>

<commit_message>
docs(technique): documentation technique à jour (évolutions 1.3, files, OpenAPI, exploitation)
Complète les évolutions 1.3 (n° 12 à 18), décrit l'échec d'un gros lot,
l'accès au PDF de l'OM, le tri des sauvegardes et la référence openapi.yaml,
ajoute les consignes d'exploitation de la mise à jour et corrige les écarts
au code (Docker, Nginx, QUEUE_CONNECTION, stores/composables, GenererEtatJob).

Co-Authored-By: Claude Opus 5.5 <noreply@anthropic.com>
Claude-Session: https://claude.ai/code/session_01MUfkbbz4qHVd6KNyyZzHX8
</commit_message>
<xml_diff>
--- a/docs/ANaTT_Documentation_Technique_Fonctionnelle.docx
+++ b/docs/ANaTT_Documentation_Technique_Fonctionnelle.docx
@@ -940,6 +940,288 @@
           </w:p>
         </w:tc>
       </w:tr>
+      <w:tr>
+        <w:tc>
+          <w:tcPr>
+            <w:tcW w:type="dxa" w:w="2041"/>
+          </w:tcPr>
+          <w:p>
+            <w:r/>
+            <w:r>
+              <w:rPr>
+                <w:b w:val="0"/>
+                <w:sz w:val="19"/>
+              </w:rPr>
+              <w:t>Files d'attente</w:t>
+            </w:r>
+          </w:p>
+        </w:tc>
+        <w:tc>
+          <w:tcPr>
+            <w:tcW w:type="dxa" w:w="6009"/>
+          </w:tcPr>
+          <w:p>
+            <w:r/>
+            <w:r>
+              <w:rPr>
+                <w:b w:val="0"/>
+                <w:sz w:val="19"/>
+              </w:rPr>
+              <w:t>Échec définitif d'un gros lot : le lot passe ERREUR par LotPaiementService::marquerErreur (versements EN_ATTENTE, audit ERROR_LOT) ; la tâche Cron du worker nomme les trois files.</w:t>
+            </w:r>
+          </w:p>
+        </w:tc>
+        <w:tc>
+          <w:tcPr>
+            <w:tcW w:type="dxa" w:w="1474"/>
+          </w:tcPr>
+          <w:p>
+            <w:r/>
+            <w:r>
+              <w:rPr>
+                <w:b w:val="0"/>
+                <w:sz w:val="19"/>
+              </w:rPr>
+              <w:t>§4.3, §9.3</w:t>
+            </w:r>
+          </w:p>
+        </w:tc>
+      </w:tr>
+      <w:tr>
+        <w:tc>
+          <w:tcPr>
+            <w:tcW w:type="dxa" w:w="2041"/>
+          </w:tcPr>
+          <w:p>
+            <w:r/>
+            <w:r>
+              <w:rPr>
+                <w:b w:val="0"/>
+                <w:sz w:val="19"/>
+              </w:rPr>
+              <w:t>Sauvegardes</w:t>
+            </w:r>
+          </w:p>
+        </w:tc>
+        <w:tc>
+          <w:tcPr>
+            <w:tcW w:type="dxa" w:w="6009"/>
+          </w:tcPr>
+          <w:p>
+            <w:r/>
+            <w:r>
+              <w:rPr>
+                <w:b w:val="0"/>
+                <w:sz w:val="19"/>
+              </w:rPr>
+              <w:t>Liste triée par date du fichier (la plus récente en tête), et non plus par nom.</w:t>
+            </w:r>
+          </w:p>
+        </w:tc>
+        <w:tc>
+          <w:tcPr>
+            <w:tcW w:type="dxa" w:w="1474"/>
+          </w:tcPr>
+          <w:p>
+            <w:r/>
+            <w:r>
+              <w:rPr>
+                <w:b w:val="0"/>
+                <w:sz w:val="19"/>
+              </w:rPr>
+              <w:t>§4.7</w:t>
+            </w:r>
+          </w:p>
+        </w:tc>
+      </w:tr>
+      <w:tr>
+        <w:tc>
+          <w:tcPr>
+            <w:tcW w:type="dxa" w:w="2041"/>
+          </w:tcPr>
+          <w:p>
+            <w:r/>
+            <w:r>
+              <w:rPr>
+                <w:b w:val="0"/>
+                <w:sz w:val="19"/>
+              </w:rPr>
+              <w:t>Référence API</w:t>
+            </w:r>
+          </w:p>
+        </w:tc>
+        <w:tc>
+          <w:tcPr>
+            <w:tcW w:type="dxa" w:w="6009"/>
+          </w:tcPr>
+          <w:p>
+            <w:r/>
+            <w:r>
+              <w:rPr>
+                <w:b w:val="0"/>
+                <w:sz w:val="19"/>
+              </w:rPr>
+              <w:t>backend/docs/openapi.yaml réécrite sur les routes réelles (96 opérations, permission x-permission) et verrouillée par OpenApiTest.</w:t>
+            </w:r>
+          </w:p>
+        </w:tc>
+        <w:tc>
+          <w:tcPr>
+            <w:tcW w:type="dxa" w:w="1474"/>
+          </w:tcPr>
+          <w:p>
+            <w:r/>
+            <w:r>
+              <w:rPr>
+                <w:b w:val="0"/>
+                <w:sz w:val="19"/>
+              </w:rPr>
+              <w:t>§7.1, §10</w:t>
+            </w:r>
+          </w:p>
+        </w:tc>
+      </w:tr>
+      <w:tr>
+        <w:tc>
+          <w:tcPr>
+            <w:tcW w:type="dxa" w:w="2041"/>
+          </w:tcPr>
+          <w:p>
+            <w:r/>
+            <w:r>
+              <w:rPr>
+                <w:b w:val="0"/>
+                <w:sz w:val="19"/>
+              </w:rPr>
+              <w:t>Amendement</w:t>
+            </w:r>
+          </w:p>
+        </w:tc>
+        <w:tc>
+          <w:tcPr>
+            <w:tcW w:type="dxa" w:w="6009"/>
+          </w:tcPr>
+          <w:p>
+            <w:r/>
+            <w:r>
+              <w:rPr>
+                <w:b w:val="0"/>
+                <w:sz w:val="19"/>
+              </w:rPr>
+              <w:t>Deux amendements dans la même seconde : le dernier est départagé par l'id (PDF, document de retenue, journal de la fiche).</w:t>
+            </w:r>
+          </w:p>
+        </w:tc>
+        <w:tc>
+          <w:tcPr>
+            <w:tcW w:type="dxa" w:w="1474"/>
+          </w:tcPr>
+          <w:p>
+            <w:r/>
+            <w:r>
+              <w:rPr>
+                <w:b w:val="0"/>
+                <w:sz w:val="19"/>
+              </w:rPr>
+              <w:t>§4.4</w:t>
+            </w:r>
+          </w:p>
+        </w:tc>
+      </w:tr>
+      <w:tr>
+        <w:tc>
+          <w:tcPr>
+            <w:tcW w:type="dxa" w:w="2041"/>
+          </w:tcPr>
+          <w:p>
+            <w:r/>
+            <w:r>
+              <w:rPr>
+                <w:b w:val="0"/>
+                <w:sz w:val="19"/>
+              </w:rPr>
+              <w:t>Fiche de l'OM</w:t>
+            </w:r>
+          </w:p>
+        </w:tc>
+        <w:tc>
+          <w:tcPr>
+            <w:tcW w:type="dxa" w:w="6009"/>
+          </w:tcPr>
+          <w:p>
+            <w:r/>
+            <w:r>
+              <w:rPr>
+                <w:b w:val="0"/>
+                <w:sz w:val="19"/>
+              </w:rPr>
+              <w:t>Lien « PDF de l'OM » vers l'écran du PDF officiel (OM-07), seul accès depuis l'interface une fois l'OM validé.</w:t>
+            </w:r>
+          </w:p>
+        </w:tc>
+        <w:tc>
+          <w:tcPr>
+            <w:tcW w:type="dxa" w:w="1474"/>
+          </w:tcPr>
+          <w:p>
+            <w:r/>
+            <w:r>
+              <w:rPr>
+                <w:b w:val="0"/>
+                <w:sz w:val="19"/>
+              </w:rPr>
+              <w:t>§4.4</w:t>
+            </w:r>
+          </w:p>
+        </w:tc>
+      </w:tr>
+      <w:tr>
+        <w:tc>
+          <w:tcPr>
+            <w:tcW w:type="dxa" w:w="2041"/>
+          </w:tcPr>
+          <w:p>
+            <w:r/>
+            <w:r>
+              <w:rPr>
+                <w:b w:val="0"/>
+                <w:sz w:val="19"/>
+              </w:rPr>
+              <w:t>Code mort</w:t>
+            </w:r>
+          </w:p>
+        </w:tc>
+        <w:tc>
+          <w:tcPr>
+            <w:tcW w:type="dxa" w:w="6009"/>
+          </w:tcPr>
+          <w:p>
+            <w:r/>
+            <w:r>
+              <w:rPr>
+                <w:b w:val="0"/>
+                <w:sz w:val="19"/>
+              </w:rPr>
+              <w:t>Form Requests StoreOrdreMissionRequest / UpdateOrdreMissionRequest supprimées (les OM ne se créent que via /missions).</w:t>
+            </w:r>
+          </w:p>
+        </w:tc>
+        <w:tc>
+          <w:tcPr>
+            <w:tcW w:type="dxa" w:w="1474"/>
+          </w:tcPr>
+          <w:p>
+            <w:r/>
+            <w:r>
+              <w:rPr>
+                <w:b w:val="0"/>
+                <w:sz w:val="19"/>
+              </w:rPr>
+              <w:t>§2.3, §9.5</w:t>
+            </w:r>
+          </w:p>
+        </w:tc>
+      </w:tr>
     </w:tbl>
     <w:p/>
     <w:p>
@@ -1546,7 +1828,7 @@
               <w:rPr>
                 <w:sz w:val="20"/>
               </w:rPr>
-              <w:t>SPA Vue 3 (frontend) → API REST Laravel 12 (backend) → base MySQL. Communication HTTP/HTTPS avec tokens Bearer (Sanctum). Files de travaux (queue) pour les générations volumineuses (fichiers de paiement, états). Déploiement : WampServer ou Docker Compose (dev) ; serveur Linux + Nginx (prod).</w:t>
+              <w:t>SPA Vue 3 (frontend) → API REST Laravel 12 (backend) → base MySQL. Communication HTTP/HTTPS avec tokens Bearer (Sanctum). Files de travaux (queue) pour les générations volumineuses (gros lots de paiement, exports de rapports). Déploiement : WampServer + start-dev.ps1 (dev) ; hébergement cPanel mutualisé (prod, DEPLOY-CPANEL.md).</w:t>
             </w:r>
           </w:p>
         </w:tc>
@@ -2677,7 +2959,7 @@
                 <w:color w:val="FFFFFF"/>
                 <w:sz w:val="18"/>
               </w:rPr>
-              <w:t xml:space="preserve">    src/stores/            Pinia (auth, missions, notifications)</w:t>
+              <w:t xml:space="preserve">    src/stores/            Pinia (auth, notifications, ordres-mission)</w:t>
             </w:r>
           </w:p>
           <w:p>
@@ -2687,7 +2969,7 @@
                 <w:color w:val="FFFFFF"/>
                 <w:sz w:val="18"/>
               </w:rPr>
-              <w:t xml:space="preserve">    src/composables/       Logique réutilisable (useApi, useAuth, useMissions...)</w:t>
+              <w:t xml:space="preserve">    src/composables/       Logique réutilisable (useApi, useAuth, usePartAvance, useSearch, useToast)</w:t>
             </w:r>
           </w:p>
           <w:p>
@@ -2727,7 +3009,7 @@
                 <w:color w:val="FFFFFF"/>
                 <w:sz w:val="18"/>
               </w:rPr>
-              <w:t xml:space="preserve">    app/Models/            Modèles Eloquent</w:t>
+              <w:t xml:space="preserve">    app/Http/Requests/     Form Requests (validation des écritures)</w:t>
             </w:r>
           </w:p>
           <w:p>
@@ -2737,7 +3019,7 @@
                 <w:color w:val="FFFFFF"/>
                 <w:sz w:val="18"/>
               </w:rPr>
-              <w:t xml:space="preserve">    app/Services/          Logique métier (calcul, lots, barème, rapports, audit)</w:t>
+              <w:t xml:space="preserve">    app/Models/            Modèles Eloquent</w:t>
             </w:r>
           </w:p>
           <w:p>
@@ -2747,7 +3029,7 @@
                 <w:color w:val="FFFFFF"/>
                 <w:sz w:val="18"/>
               </w:rPr>
-              <w:t xml:space="preserve">    app/Services/Paiement/  Générateurs MTN (.txt) et Moov (.xlsx)</w:t>
+              <w:t xml:space="preserve">    app/Services/          Logique métier (calcul, lots, barème, rapports, audit)</w:t>
             </w:r>
           </w:p>
           <w:p>
@@ -2757,7 +3039,7 @@
                 <w:color w:val="FFFFFF"/>
                 <w:sz w:val="18"/>
               </w:rPr>
-              <w:t xml:space="preserve">    app/Support/Permissions  Source unique des clés de permission (RBAC)</w:t>
+              <w:t xml:space="preserve">    app/Services/Paiement/  Générateurs MTN (.txt) et Moov (.xlsx)</w:t>
             </w:r>
           </w:p>
           <w:p>
@@ -2767,7 +3049,7 @@
                 <w:color w:val="FFFFFF"/>
                 <w:sz w:val="18"/>
               </w:rPr>
-              <w:t xml:space="preserve">    app/Support/PermissionRepository  Matrice effective (table role_permissions, cache)</w:t>
+              <w:t xml:space="preserve">    app/Support/Permissions  Source unique des clés de permission (RBAC)</w:t>
             </w:r>
           </w:p>
           <w:p>
@@ -2777,7 +3059,7 @@
                 <w:color w:val="FFFFFF"/>
                 <w:sz w:val="18"/>
               </w:rPr>
-              <w:t xml:space="preserve">    app/Console/Commands/  db:backup / db:restore</w:t>
+              <w:t xml:space="preserve">    app/Support/PermissionRepository  Matrice effective (table role_permissions, cache)</w:t>
             </w:r>
           </w:p>
           <w:p>
@@ -2787,7 +3069,27 @@
                 <w:color w:val="FFFFFF"/>
                 <w:sz w:val="18"/>
               </w:rPr>
-              <w:t xml:space="preserve">    app/Jobs/              Tâches asynchrones (génération de lots, états)</w:t>
+              <w:t xml:space="preserve">    app/Console/Commands/  db:backup / db:restore</w:t>
+            </w:r>
+          </w:p>
+          <w:p>
+            <w:r>
+              <w:rPr>
+                <w:rFonts w:ascii="Consolas" w:hAnsi="Consolas"/>
+                <w:color w:val="FFFFFF"/>
+                <w:sz w:val="18"/>
+              </w:rPr>
+              <w:t xml:space="preserve">    app/Jobs/              Tâches asynchrones (gros lots, exports de rapports, e-mails)</w:t>
+            </w:r>
+          </w:p>
+          <w:p>
+            <w:r>
+              <w:rPr>
+                <w:rFonts w:ascii="Consolas" w:hAnsi="Consolas"/>
+                <w:color w:val="FFFFFF"/>
+                <w:sz w:val="18"/>
+              </w:rPr>
+              <w:t xml:space="preserve">    docs/openapi.yaml      Référence API (verrouillée par tests/Feature/OpenApiTest.php)</w:t>
             </w:r>
           </w:p>
           <w:p>
@@ -6897,6 +7199,14 @@
     <w:p/>
     <w:p>
       <w:pPr>
+        <w:pStyle w:val="ListBullet"/>
+      </w:pPr>
+      <w:r>
+        <w:t>Gros lot en file (GenererLotPaiementJob, file « paiements ») : mêmes règles que la génération directe (LotPaiementService::generer). En cas d'échec définitif (après 3 tentatives, ou dès le premier échec en QUEUE_CONNECTION=sync), le suivi passe ERREUR et le dernier lot GENERE/ERREUR de la clé passe en ERREUR par LotPaiementService::marquerErreur, comme l'action manuelle : versements EN_ATTENTE, coordonnées rafraîchies, audit ERROR_LOT. Un lot CONFIRME n'est jamais touché. Détail : backend/docs/queues.md.</w:t>
+      </w:r>
+    </w:p>
+    <w:p>
+      <w:pPr>
         <w:pStyle w:val="Heading2"/>
       </w:pPr>
       <w:r>
@@ -7029,7 +7339,7 @@
                 <w:b w:val="0"/>
                 <w:sz w:val="19"/>
               </w:rPr>
-              <w:t>Ouvre la fiche d'un OM et clique « Aperçu/Télécharger PDF ».</w:t>
+              <w:t>Ouvre la fiche d'un OM, clique « PDF de l'OM » (écran OM-07, /ordres/:id/pdf) puis « Télécharger PDF ».</w:t>
             </w:r>
           </w:p>
         </w:tc>
@@ -7259,6 +7569,22 @@
       </w:pPr>
       <w:r>
         <w:t>Après un amendement, la répartition affichée suit les montants réels : « Avance engagée », « Reliquat (ajusté par amendement) » ou « Trop-perçu (à recouvrer par retenue sur salaire) », avec un encadré rappelant le dernier amendement ; le taux journalier affiché exclut le transport.</w:t>
+      </w:r>
+    </w:p>
+    <w:p>
+      <w:pPr>
+        <w:pStyle w:val="ListBullet"/>
+      </w:pPr>
+      <w:r>
+        <w:t>Dernier amendement : tri par amende_le puis id décroissants (deux amendements dans la même seconde restent ordonnés). Même ordre pour le document de retenue (motif) et le journal de la fiche OM.</w:t>
+      </w:r>
+    </w:p>
+    <w:p>
+      <w:pPr>
+        <w:pStyle w:val="ListBullet"/>
+      </w:pPr>
+      <w:r>
+        <w:t>Accès : le lien « PDF de l'OM » de la fiche est le seul chemin vers le PDF officiel ; « Télécharger le brouillon » (filigrané) n'est proposé que tant que l'OM n'est ni VALIDE ni SOLDE.</w:t>
       </w:r>
     </w:p>
     <w:p>
@@ -8057,7 +8383,7 @@
                 <w:b w:val="0"/>
                 <w:sz w:val="19"/>
               </w:rPr>
-              <w:t>Télécharge une sauvegarde (GET /api/admin/backups/:name/download).</w:t>
+              <w:t>Consulte la liste (GET /api/admin/backups, triée par date du fichier, la plus récente en tête) et télécharge une sauvegarde (GET /api/admin/backups/:name/download).</w:t>
             </w:r>
           </w:p>
         </w:tc>
@@ -12187,7 +12513,7 @@
               <w:rPr>
                 <w:sz w:val="20"/>
               </w:rPr>
-              <w:t>Préfixe : /api. Authentification : header Authorization: Bearer {token}. Format JSON. Autorisation par middleware permission:{clé}. Throttling sur login, API, paiement et export.</w:t>
+              <w:t>Préfixe : /api. Authentification : header Authorization: Bearer {token}. Format JSON. Autorisation par middleware permission:{clé}. Throttling sur login, API, paiement et export. Référence exhaustive : backend/docs/openapi.yaml (OpenAPI 3, 96 opérations, chacune avec sa clé x-permission) ; OpenApiTest vérifie que chaque route y figure, sans opération en trop, avec la permission exigée par le middleware. Les tableaux ci-dessous en sont un résumé.</w:t>
             </w:r>
           </w:p>
         </w:tc>
@@ -15526,7 +15852,7 @@
                 <w:b w:val="0"/>
                 <w:sz w:val="19"/>
               </w:rPr>
-              <w:t>WampServer ou Docker Compose — données de test</w:t>
+              <w:t>WampServer + start-dev.ps1 / stop-dev.ps1 — données de test</w:t>
             </w:r>
           </w:p>
         </w:tc>
@@ -15620,7 +15946,7 @@
                 <w:b w:val="0"/>
                 <w:sz w:val="19"/>
               </w:rPr>
-              <w:t>Usage opérationnel ANaTT</w:t>
+              <w:t>Hébergement cPanel mutualisé (FTP, phpMyAdmin, Cron, AutoSSL)</w:t>
             </w:r>
           </w:p>
         </w:tc>
@@ -15789,7 +16115,7 @@
                 <w:b w:val="0"/>
                 <w:sz w:val="19"/>
               </w:rPr>
-              <w:t>« database » pour fonctionner sans Redis</w:t>
+              <w:t>Production mutualisée : file / file / sync (aucun worker ni Redis) ; database ou redis si un worker traite la file</w:t>
             </w:r>
           </w:p>
         </w:tc>
@@ -16082,7 +16408,7 @@
                 <w:color w:val="FFFFFF"/>
                 <w:sz w:val="18"/>
               </w:rPr>
-              <w:t>php artisan queue:work --queue=paiements,etats,default --tries=3   # générations asynchrones</w:t>
+              <w:t>php artisan queue:work --queue=paiements,etats,default --tries=3   # worker (si QUEUE_CONNECTION ≠ sync)</w:t>
             </w:r>
           </w:p>
           <w:p>
@@ -16092,7 +16418,7 @@
                 <w:color w:val="FFFFFF"/>
                 <w:sz w:val="18"/>
               </w:rPr>
-              <w:t>php artisan schedule:run           # cron chaque minute : db:backup 02:00, purge des tokens</w:t>
+              <w:t>#   Cron mutualisé (QUEUE_CONNECTION=database) : même ligne + --stop-when-empty, chaque minute</w:t>
             </w:r>
           </w:p>
           <w:p>
@@ -16102,7 +16428,7 @@
                 <w:color w:val="FFFFFF"/>
                 <w:sz w:val="18"/>
               </w:rPr>
-              <w:t>php artisan db:restore &lt;fichier&gt;   # restauration (sauvegarde de sécurité préalable)</w:t>
+              <w:t>php artisan schedule:run           # cron chaque minute : db:backup 02:00, purge des tokens</w:t>
             </w:r>
           </w:p>
           <w:p>
@@ -16112,6 +16438,7 @@
                 <w:color w:val="FFFFFF"/>
                 <w:sz w:val="18"/>
               </w:rPr>
+              <w:t>php artisan db:restore &lt;fichier&gt;   # restauration (sauvegarde de sécurité préalable)</w:t>
             </w:r>
           </w:p>
           <w:p>
@@ -16121,7 +16448,6 @@
                 <w:color w:val="FFFFFF"/>
                 <w:sz w:val="18"/>
               </w:rPr>
-              <w:t># Frontend (Vue)</w:t>
             </w:r>
           </w:p>
           <w:p>
@@ -16131,7 +16457,7 @@
                 <w:color w:val="FFFFFF"/>
                 <w:sz w:val="18"/>
               </w:rPr>
-              <w:t>cd frontend &amp;&amp; npm install &amp;&amp; npm run build</w:t>
+              <w:t># Frontend (Vue)</w:t>
             </w:r>
           </w:p>
           <w:p>
@@ -16141,6 +16467,7 @@
                 <w:color w:val="FFFFFF"/>
                 <w:sz w:val="18"/>
               </w:rPr>
+              <w:t>cd frontend &amp;&amp; npm install &amp;&amp; npm run build</w:t>
             </w:r>
           </w:p>
           <w:p>
@@ -16150,7 +16477,6 @@
                 <w:color w:val="FFFFFF"/>
                 <w:sz w:val="18"/>
               </w:rPr>
-              <w:t># Docker (alternative dev)</w:t>
             </w:r>
           </w:p>
           <w:p>
@@ -16160,7 +16486,17 @@
                 <w:color w:val="FFFFFF"/>
                 <w:sz w:val="18"/>
               </w:rPr>
-              <w:t>docker-compose up -d</w:t>
+              <w:t># Windows : environnement de dev complet (API, worker, Vite)</w:t>
+            </w:r>
+          </w:p>
+          <w:p>
+            <w:r>
+              <w:rPr>
+                <w:rFonts w:ascii="Consolas" w:hAnsi="Consolas"/>
+                <w:color w:val="FFFFFF"/>
+                <w:sz w:val="18"/>
+              </w:rPr>
+              <w:t>.\start-dev.ps1 [-Install -Fresh]   /   .\stop-dev.ps1</w:t>
             </w:r>
           </w:p>
         </w:tc>
@@ -16219,6 +16555,30 @@
     </w:p>
     <w:p>
       <w:pPr>
+        <w:pStyle w:val="ListBullet"/>
+      </w:pPr>
+      <w:r>
+        <w:t>Après la mise à jour, vider storage/app/private/ordres/ : un OM sans état ni amendement garde la même clé de cache et son ancien PDF afficherait le taux journalier transport compris. Les PDF se régénèrent à la demande.</w:t>
+      </w:r>
+    </w:p>
+    <w:p>
+      <w:pPr>
+        <w:pStyle w:val="ListBullet"/>
+      </w:pPr>
+      <w:r>
+        <w:t>Supprimer sur le serveur app/Http/Requests/StoreOrdreMissionRequest.php et UpdateOrdreMissionRequest.php : un envoi FTP n'efface pas les fichiers retirés du dépôt.</w:t>
+      </w:r>
+    </w:p>
+    <w:p>
+      <w:pPr>
+        <w:pStyle w:val="ListBullet"/>
+      </w:pPr>
+      <w:r>
+        <w:t>Si la file passe en QUEUE_CONNECTION=database : la tâche Cron queue:work doit nommer les trois files (--queue=paiements,etats,default), sinon les gros lots restent INTROUVABLE.</w:t>
+      </w:r>
+    </w:p>
+    <w:p>
+      <w:pPr>
         <w:pStyle w:val="Heading1"/>
       </w:pPr>
       <w:r>
@@ -16626,7 +16986,15 @@
         <w:pStyle w:val="ListBullet"/>
       </w:pPr>
       <w:r>
-        <w:t>Garde-fous croisés : RoutesPermissionsTest (aucune route API sans permission) et navigation.spec.ts (menu ↔ routes ↔ API cohérents).</w:t>
+        <w:t>Garde-fous croisés : RoutesPermissionsTest (aucune route API sans permission), OpenApiTest (openapi.yaml ↔ routes ↔ permissions) et navigation.spec.ts (menu ↔ routes ↔ API cohérents).</w:t>
+      </w:r>
+    </w:p>
+    <w:p>
+      <w:pPr>
+        <w:pStyle w:val="ListBullet"/>
+      </w:pPr>
+      <w:r>
+        <w:t>Recette sur l'API réelle (23/10/2026, base SQLite neuve, QUEUE_CONNECTION=sync) : 83/83 contrôles conformes ; scénario de démonstration (docs/SCENARIO-DEMO.md) rejoué, conforme.</w:t>
       </w:r>
     </w:p>
     <w:p>

</xml_diff>

<commit_message>
docs(technique) : documentation technique confrontée au code et régénérée (n° 1 à 32)
Co-Authored-By: Claude Opus 5.5 <noreply@anthropic.com>
Claude-Session: https://claude.ai/code/session_01MUfkbbz4qHVd6KNyyZzHX8
</commit_message>
<xml_diff>
--- a/docs/ANaTT_Documentation_Technique_Fonctionnelle.docx
+++ b/docs/ANaTT_Documentation_Technique_Fonctionnelle.docx
@@ -1222,6 +1222,382 @@
           </w:p>
         </w:tc>
       </w:tr>
+      <w:tr>
+        <w:tc>
+          <w:tcPr>
+            <w:tcW w:type="dxa" w:w="2041"/>
+          </w:tcPr>
+          <w:p>
+            <w:r/>
+            <w:r>
+              <w:rPr>
+                <w:b w:val="0"/>
+                <w:sz w:val="19"/>
+              </w:rPr>
+              <w:t>Solde d'un OM</w:t>
+            </w:r>
+          </w:p>
+        </w:tc>
+        <w:tc>
+          <w:tcPr>
+            <w:tcW w:type="dxa" w:w="6009"/>
+          </w:tcPr>
+          <w:p>
+            <w:r/>
+            <w:r>
+              <w:rPr>
+                <w:b w:val="0"/>
+                <w:sz w:val="19"/>
+              </w:rPr>
+              <w:t>SOLDE quand tous les versements NON NULS sont réglés (CONFIRME, ou RECOUVRE pour un trop-perçu) : à la confirmation d'un lot, au constat d'un recouvrement et après un amendement qui ramène le reliquat à 0. Une tranche nulle (part d'avance 0 ou 100 %) ne retient pas l'OM. Un OM exonéré est soldé dès sa validation, dans les deux circuits (n° 19, 23, 24, 26).</w:t>
+            </w:r>
+          </w:p>
+        </w:tc>
+        <w:tc>
+          <w:tcPr>
+            <w:tcW w:type="dxa" w:w="1474"/>
+          </w:tcPr>
+          <w:p>
+            <w:r/>
+            <w:r>
+              <w:rPr>
+                <w:b w:val="0"/>
+                <w:sz w:val="19"/>
+              </w:rPr>
+              <w:t>§4.3, §4.6</w:t>
+            </w:r>
+          </w:p>
+        </w:tc>
+      </w:tr>
+      <w:tr>
+        <w:tc>
+          <w:tcPr>
+            <w:tcW w:type="dxa" w:w="2041"/>
+          </w:tcPr>
+          <w:p>
+            <w:r/>
+            <w:r>
+              <w:rPr>
+                <w:b w:val="0"/>
+                <w:sz w:val="19"/>
+              </w:rPr>
+              <w:t>Exercice</w:t>
+            </w:r>
+          </w:p>
+        </w:tc>
+        <w:tc>
+          <w:tcPr>
+            <w:tcW w:type="dxa" w:w="6009"/>
+          </w:tcPr>
+          <w:p>
+            <w:r/>
+            <w:r>
+              <w:rPr>
+                <w:b w:val="0"/>
+                <w:sz w:val="19"/>
+              </w:rPr>
+              <w:t>L'écran Paramètres propose l'exercice déterminé par le mois de début, et non l'année civile (n° 20).</w:t>
+            </w:r>
+          </w:p>
+        </w:tc>
+        <w:tc>
+          <w:tcPr>
+            <w:tcW w:type="dxa" w:w="1474"/>
+          </w:tcPr>
+          <w:p>
+            <w:r/>
+            <w:r>
+              <w:rPr>
+                <w:b w:val="0"/>
+                <w:sz w:val="19"/>
+              </w:rPr>
+              <w:t>§9.2</w:t>
+            </w:r>
+          </w:p>
+        </w:tc>
+      </w:tr>
+      <w:tr>
+        <w:tc>
+          <w:tcPr>
+            <w:tcW w:type="dxa" w:w="2041"/>
+          </w:tcPr>
+          <w:p>
+            <w:r/>
+            <w:r>
+              <w:rPr>
+                <w:b w:val="0"/>
+                <w:sz w:val="19"/>
+              </w:rPr>
+              <w:t>Lot complémentaire</w:t>
+            </w:r>
+          </w:p>
+        </w:tc>
+        <w:tc>
+          <w:tcPr>
+            <w:tcW w:type="dxa" w:w="6009"/>
+          </w:tcPr>
+          <w:p>
+            <w:r/>
+            <w:r>
+              <w:rPr>
+                <w:b w:val="0"/>
+                <w:sz w:val="19"/>
+              </w:rPr>
+              <w:t>L'écran de génération propose « Générer le lot complémentaire » quand l'aperçu d'un lot confirmé compte encore des bénéficiaires (n° 21).</w:t>
+            </w:r>
+          </w:p>
+        </w:tc>
+        <w:tc>
+          <w:tcPr>
+            <w:tcW w:type="dxa" w:w="1474"/>
+          </w:tcPr>
+          <w:p>
+            <w:r/>
+            <w:r>
+              <w:rPr>
+                <w:b w:val="0"/>
+                <w:sz w:val="19"/>
+              </w:rPr>
+              <w:t>§4.3</w:t>
+            </w:r>
+          </w:p>
+        </w:tc>
+      </w:tr>
+      <w:tr>
+        <w:tc>
+          <w:tcPr>
+            <w:tcW w:type="dxa" w:w="2041"/>
+          </w:tcPr>
+          <w:p>
+            <w:r/>
+            <w:r>
+              <w:rPr>
+                <w:b w:val="0"/>
+                <w:sz w:val="19"/>
+              </w:rPr>
+              <w:t>Amendement</w:t>
+            </w:r>
+          </w:p>
+        </w:tc>
+        <w:tc>
+          <w:tcPr>
+            <w:tcW w:type="dxa" w:w="6009"/>
+          </w:tcPr>
+          <w:p>
+            <w:r/>
+            <w:r>
+              <w:rPr>
+                <w:b w:val="0"/>
+                <w:sz w:val="19"/>
+              </w:rPr>
+              <w:t>Refusé si le reliquat de l'OM est déjà CONFIRME (n° 22). Un OM SOLDE reste amendable hors reliquat payé ou trop-perçu recouvré ; il redevient VALIDE si un montant est de nouveau à régler (n° 28).</w:t>
+            </w:r>
+          </w:p>
+        </w:tc>
+        <w:tc>
+          <w:tcPr>
+            <w:tcW w:type="dxa" w:w="1474"/>
+          </w:tcPr>
+          <w:p>
+            <w:r/>
+            <w:r>
+              <w:rPr>
+                <w:b w:val="0"/>
+                <w:sz w:val="19"/>
+              </w:rPr>
+              <w:t>§4.6</w:t>
+            </w:r>
+          </w:p>
+        </w:tc>
+      </w:tr>
+      <w:tr>
+        <w:tc>
+          <w:tcPr>
+            <w:tcW w:type="dxa" w:w="2041"/>
+          </w:tcPr>
+          <w:p>
+            <w:r/>
+            <w:r>
+              <w:rPr>
+                <w:b w:val="0"/>
+                <w:sz w:val="19"/>
+              </w:rPr>
+              <w:t>Notifications</w:t>
+            </w:r>
+          </w:p>
+        </w:tc>
+        <w:tc>
+          <w:tcPr>
+            <w:tcW w:type="dxa" w:w="6009"/>
+          </w:tcPr>
+          <w:p>
+            <w:r/>
+            <w:r>
+              <w:rPr>
+                <w:b w:val="0"/>
+                <w:sz w:val="19"/>
+              </w:rPr>
+              <w:t>Adressées aux seuls comptes ACTIFS des profils système ; aucun e-mail vers un compte désactivé entre-temps (n° 27).</w:t>
+            </w:r>
+          </w:p>
+        </w:tc>
+        <w:tc>
+          <w:tcPr>
+            <w:tcW w:type="dxa" w:w="1474"/>
+          </w:tcPr>
+          <w:p>
+            <w:r/>
+            <w:r>
+              <w:rPr>
+                <w:b w:val="0"/>
+                <w:sz w:val="19"/>
+              </w:rPr>
+              <w:t>§4.2, §6.3</w:t>
+            </w:r>
+          </w:p>
+        </w:tc>
+      </w:tr>
+      <w:tr>
+        <w:tc>
+          <w:tcPr>
+            <w:tcW w:type="dxa" w:w="2041"/>
+          </w:tcPr>
+          <w:p>
+            <w:r/>
+            <w:r>
+              <w:rPr>
+                <w:b w:val="0"/>
+                <w:sz w:val="19"/>
+              </w:rPr>
+              <w:t>API</w:t>
+            </w:r>
+          </w:p>
+        </w:tc>
+        <w:tc>
+          <w:tcPr>
+            <w:tcW w:type="dxa" w:w="6009"/>
+          </w:tcPr>
+          <w:p>
+            <w:r/>
+            <w:r>
+              <w:rPr>
+                <w:b w:val="0"/>
+                <w:sz w:val="19"/>
+              </w:rPr>
+              <w:t>Toute erreur d'une route /api/* répond en JSON, même sans en-tête Accept : 405, 404, 403, 422 et 500, comme le 401 (n° 29). GET/PUT /admin/settings renvoient toujours un objet (n° 32).</w:t>
+            </w:r>
+          </w:p>
+        </w:tc>
+        <w:tc>
+          <w:tcPr>
+            <w:tcW w:type="dxa" w:w="1474"/>
+          </w:tcPr>
+          <w:p>
+            <w:r/>
+            <w:r>
+              <w:rPr>
+                <w:b w:val="0"/>
+                <w:sz w:val="19"/>
+              </w:rPr>
+              <w:t>§6.3, §7.6</w:t>
+            </w:r>
+          </w:p>
+        </w:tc>
+      </w:tr>
+      <w:tr>
+        <w:tc>
+          <w:tcPr>
+            <w:tcW w:type="dxa" w:w="2041"/>
+          </w:tcPr>
+          <w:p>
+            <w:r/>
+            <w:r>
+              <w:rPr>
+                <w:b w:val="0"/>
+                <w:sz w:val="19"/>
+              </w:rPr>
+              <w:t>Signatures</w:t>
+            </w:r>
+          </w:p>
+        </w:tc>
+        <w:tc>
+          <w:tcPr>
+            <w:tcW w:type="dxa" w:w="6009"/>
+          </w:tcPr>
+          <w:p>
+            <w:r/>
+            <w:r>
+              <w:rPr>
+                <w:b w:val="0"/>
+                <w:sz w:val="19"/>
+              </w:rPr>
+              <w:t>Nom et fonction figés à la signature : Paramètres › Signatures, sinon le compte du signataire (fonction posée par ComptesCircuitSeeder), sinon le libellé du poste (n° 30). ComptesCircuitSeeder ne rétrograde jamais un super administrateur (n° 31).</w:t>
+            </w:r>
+          </w:p>
+        </w:tc>
+        <w:tc>
+          <w:tcPr>
+            <w:tcW w:type="dxa" w:w="1474"/>
+          </w:tcPr>
+          <w:p>
+            <w:r/>
+            <w:r>
+              <w:rPr>
+                <w:b w:val="0"/>
+                <w:sz w:val="19"/>
+              </w:rPr>
+              <w:t>§3.5, §9.4</w:t>
+            </w:r>
+          </w:p>
+        </w:tc>
+      </w:tr>
+      <w:tr>
+        <w:tc>
+          <w:tcPr>
+            <w:tcW w:type="dxa" w:w="2041"/>
+          </w:tcPr>
+          <w:p>
+            <w:r/>
+            <w:r>
+              <w:rPr>
+                <w:b w:val="0"/>
+                <w:sz w:val="19"/>
+              </w:rPr>
+              <w:t>Référence API</w:t>
+            </w:r>
+          </w:p>
+        </w:tc>
+        <w:tc>
+          <w:tcPr>
+            <w:tcW w:type="dxa" w:w="6009"/>
+          </w:tcPr>
+          <w:p>
+            <w:r/>
+            <w:r>
+              <w:rPr>
+                <w:b w:val="0"/>
+                <w:sz w:val="19"/>
+              </w:rPr>
+              <w:t>openapi.yaml validée OpenAPI 3.0.3 et confrontée aux réponses réelles (routes GET et parcours d'écriture complet) le 25/10/2026.</w:t>
+            </w:r>
+          </w:p>
+        </w:tc>
+        <w:tc>
+          <w:tcPr>
+            <w:tcW w:type="dxa" w:w="1474"/>
+          </w:tcPr>
+          <w:p>
+            <w:r/>
+            <w:r>
+              <w:rPr>
+                <w:b w:val="0"/>
+                <w:sz w:val="19"/>
+              </w:rPr>
+              <w:t>§7.1</w:t>
+            </w:r>
+          </w:p>
+        </w:tc>
+      </w:tr>
     </w:tbl>
     <w:p/>
     <w:p>
@@ -1944,7 +2320,7 @@
                 <w:b w:val="0"/>
                 <w:sz w:val="19"/>
               </w:rPr>
-              <w:t>3.x (Composition API)</w:t>
+              <w:t>3.6 bêta (Composition API)</w:t>
             </w:r>
           </w:p>
         </w:tc>
@@ -1959,7 +2335,7 @@
                 <w:b w:val="0"/>
                 <w:sz w:val="19"/>
               </w:rPr>
-              <w:t>Framework JavaScript principal</w:t>
+              <w:t>Framework JavaScript principal — version figée par package-lock.json (3.6.0-beta.9) : installer avec npm ci</w:t>
             </w:r>
           </w:p>
         </w:tc>
@@ -2289,53 +2665,6 @@
                 <w:sz w:val="19"/>
               </w:rPr>
               <w:t>Graphiques du tableau de bord et des rapports</w:t>
-            </w:r>
-          </w:p>
-        </w:tc>
-      </w:tr>
-      <w:tr>
-        <w:tc>
-          <w:tcPr>
-            <w:tcW w:type="dxa" w:w="2608"/>
-          </w:tcPr>
-          <w:p>
-            <w:r/>
-            <w:r>
-              <w:rPr>
-                <w:b w:val="0"/>
-                <w:sz w:val="19"/>
-              </w:rPr>
-              <w:t>VuePDF</w:t>
-            </w:r>
-          </w:p>
-        </w:tc>
-        <w:tc>
-          <w:tcPr>
-            <w:tcW w:type="dxa" w:w="2268"/>
-          </w:tcPr>
-          <w:p>
-            <w:r/>
-            <w:r>
-              <w:rPr>
-                <w:b w:val="0"/>
-                <w:sz w:val="19"/>
-              </w:rPr>
-              <w:t>—</w:t>
-            </w:r>
-          </w:p>
-        </w:tc>
-        <w:tc>
-          <w:tcPr>
-            <w:tcW w:type="dxa" w:w="4649"/>
-          </w:tcPr>
-          <w:p>
-            <w:r/>
-            <w:r>
-              <w:rPr>
-                <w:b w:val="0"/>
-                <w:sz w:val="19"/>
-              </w:rPr>
-              <w:t>Aperçu PDF dans le navigateur</w:t>
             </w:r>
           </w:p>
         </w:tc>
@@ -2584,7 +2913,7 @@
                 <w:b w:val="0"/>
                 <w:sz w:val="19"/>
               </w:rPr>
-              <w:t>8.4+</w:t>
+              <w:t>8.4.x, 64 bits</w:t>
             </w:r>
           </w:p>
         </w:tc>
@@ -2599,7 +2928,7 @@
                 <w:b w:val="0"/>
                 <w:sz w:val="19"/>
               </w:rPr>
-              <w:t>Langage backend (minimum imposé par composer.lock : Symfony 8)</w:t>
+              <w:t>Langage backend : minimum imposé par composer.lock (Symfony 8, activitylog) ; 8.5 non pris en charge (PhpSpreadsheet déclare &lt; 8.5.0)</w:t>
             </w:r>
           </w:p>
         </w:tc>
@@ -5576,7 +5905,7 @@
         <w:pStyle w:val="ListBullet"/>
       </w:pPr>
       <w:r>
-        <w:t>Signatures (SUPER_ADMIN) : identités et paraphes scannés des titulaires imprimés sur l'état.</w:t>
+        <w:t>Signatures (SUPER_ADMIN) : identités et paraphes scannés des titulaires imprimés sur l'état. Nom et fonction sont figés à chaque signature, dans cet ordre : Paramètres › Signatures, sinon le compte du signataire, sinon le libellé du poste (« Le Directeur Général »…).</w:t>
       </w:r>
     </w:p>
     <w:p>
@@ -5649,7 +5978,7 @@
         <w:pStyle w:val="ListBullet"/>
       </w:pPr>
       <w:r>
-        <w:t>Lots complémentaires signalés par un badge « complémentaire n° N » dans la liste.</w:t>
+        <w:t>Lots complémentaires signalés par un badge « complémentaire n° N » dans la liste ; après confirmation d'un lot, le bouton devient « Générer le lot complémentaire » tant que l'aperçu compte un bénéficiaire.</w:t>
       </w:r>
     </w:p>
     <w:p>
@@ -6622,7 +6951,15 @@
           <w:i/>
           <w:color w:val="4B5563"/>
         </w:rPr>
-        <w:t>Circuit OM par OM (reprise de données) : POST /api/ordres/:id/valider (om.valider) et /api/ordres/:id/rejeter (om.rejeter) subsistent pour une mission dépourvue d'état ; ils sont refusés dès qu'un état existe (MissionService::exigerAbsenceDEtat). Le rejet annule les versements EN_ATTENTE de l'OM. La validation de l'état des avances ne repropage jamais VALIDE à un OM REJETE.</w:t>
+        <w:t>Circuit OM par OM (reprise de données) : POST /api/ordres/:id/valider (om.valider) et /api/ordres/:id/rejeter (om.rejeter) subsistent pour une mission dépourvue d'état ; ils sont refusés dès qu'un état existe (MissionService::exigerAbsenceDEtat). Le rejet annule les versements EN_ATTENTE de l'OM. La validation de l'état des avances ne repropage jamais VALIDE à un OM REJETE. Sur ce circuit, un OM exonéré (montant nul) passe directement SOLDE.</w:t>
+      </w:r>
+    </w:p>
+    <w:p>
+      <w:pPr>
+        <w:pStyle w:val="ListBullet"/>
+      </w:pPr>
+      <w:r>
+        <w:t>Notifications (cloche + e-mail, NotificationService::notifierRole), adressées aux seuls comptes ACTIFS du profil système concerné : le signataire de l'étape suivante, l'agent financier à la validation finale, le gestionnaire au rejet. Un rôle personnalisé ou un droit accordé individuellement autorise l'action sans être notifié.</w:t>
       </w:r>
     </w:p>
     <w:p>
@@ -7031,7 +7368,7 @@
                 <w:b w:val="0"/>
                 <w:sz w:val="19"/>
               </w:rPr>
-              <w:t>Lot + versements → CONFIRME (horodatés) ; OM soldé → SOLDE</w:t>
+              <w:t>Lot + versements → CONFIRME (horodatés) ; OM dont tous les versements non nuls sont réglés → SOLDE</w:t>
             </w:r>
           </w:p>
         </w:tc>
@@ -7203,6 +7540,14 @@
       </w:pPr>
       <w:r>
         <w:t>Gros lot en file (GenererLotPaiementJob, file « paiements ») : mêmes règles que la génération directe (LotPaiementService::generer). En cas d'échec définitif (après 3 tentatives, ou dès le premier échec en QUEUE_CONNECTION=sync), le suivi passe ERREUR et le dernier lot GENERE/ERREUR de la clé passe en ERREUR par LotPaiementService::marquerErreur, comme l'action manuelle : versements EN_ATTENTE, coordonnées rafraîchies, audit ERROR_LOT. Un lot CONFIRME n'est jamais touché. Détail : backend/docs/queues.md.</w:t>
+      </w:r>
+    </w:p>
+    <w:p>
+      <w:pPr>
+        <w:pStyle w:val="ListBullet"/>
+      </w:pPr>
+      <w:r>
+        <w:t>En QUEUE_CONNECTION=sync (production cPanel), le job tourne dans la requête : le gros lot répond 202 seulement si la génération réussit ; sinon l'erreur revient dans la réponse même (après failed()). L'écran ne se rafraîchit pas alors : recharger la page avant toute autre action.</w:t>
       </w:r>
     </w:p>
     <w:p>
@@ -7992,7 +8337,7 @@
                 <w:b w:val="0"/>
                 <w:sz w:val="19"/>
               </w:rPr>
-              <w:t>Refus si OM REJETE/ANNULE ; si un versement de l'OM est GENERE (fichier en attente de dépôt) ; si un état de tranche est CONTROLE/VISA_DAF (rejet guidé) ; si l'état des reliquats est VALIDE ; si un trop-perçu est déjà RECOUVRE.</w:t>
+              <w:t>Refus si OM REJETE/ANNULE ; si un versement de l'OM est GENERE (fichier en attente de dépôt) ; si un état de tranche est CONTROLE/VISA_DAF (rejet guidé) ; si l'état des reliquats est VALIDE ; si le reliquat est déjà CONFIRME (payé : avenant formel) ; si un trop-perçu est déjà RECOUVRE. Un OM SOLDE reste amendable hors ces deux derniers cas.</w:t>
             </w:r>
           </w:p>
         </w:tc>
@@ -8151,6 +8496,53 @@
                 <w:sz w:val="19"/>
               </w:rPr>
               <w:t>5</w:t>
+            </w:r>
+          </w:p>
+        </w:tc>
+        <w:tc>
+          <w:tcPr>
+            <w:tcW w:type="dxa" w:w="1587"/>
+          </w:tcPr>
+          <w:p>
+            <w:r/>
+            <w:r>
+              <w:rPr>
+                <w:b w:val="0"/>
+                <w:sz w:val="19"/>
+              </w:rPr>
+              <w:t>Statut</w:t>
+            </w:r>
+          </w:p>
+        </w:tc>
+        <w:tc>
+          <w:tcPr>
+            <w:tcW w:type="dxa" w:w="7483"/>
+          </w:tcPr>
+          <w:p>
+            <w:r/>
+            <w:r>
+              <w:rPr>
+                <w:b w:val="0"/>
+                <w:sz w:val="19"/>
+              </w:rPr>
+              <w:t>Un OM SOLDE à qui l'amendement recrée un montant à régler redevient VALIDE ; un reliquat ramené à 0, avance payée, solde l'OM (OrdreMission::solderSiRegle).</w:t>
+            </w:r>
+          </w:p>
+        </w:tc>
+      </w:tr>
+      <w:tr>
+        <w:tc>
+          <w:tcPr>
+            <w:tcW w:type="dxa" w:w="454"/>
+          </w:tcPr>
+          <w:p>
+            <w:r/>
+            <w:r>
+              <w:rPr>
+                <w:b w:val="0"/>
+                <w:sz w:val="19"/>
+              </w:rPr>
+              <w:t>6</w:t>
             </w:r>
           </w:p>
         </w:tc>
@@ -9663,7 +10055,54 @@
                 <w:b w:val="0"/>
                 <w:sz w:val="19"/>
               </w:rPr>
-              <w:t>Refusé tant qu'un versement de l'OM est GENERE (cf. §4.6).</w:t>
+              <w:t>Refusé tant qu'un versement de l'OM est GENERE, ou si son reliquat est CONFIRME (cf. §4.6).</w:t>
+            </w:r>
+          </w:p>
+        </w:tc>
+        <w:tc>
+          <w:tcPr>
+            <w:tcW w:type="dxa" w:w="2041"/>
+          </w:tcPr>
+          <w:p>
+            <w:r/>
+            <w:r>
+              <w:rPr>
+                <w:b w:val="0"/>
+                <w:sz w:val="19"/>
+              </w:rPr>
+              <w:t>API</w:t>
+            </w:r>
+          </w:p>
+        </w:tc>
+      </w:tr>
+      <w:tr>
+        <w:tc>
+          <w:tcPr>
+            <w:tcW w:type="dxa" w:w="2041"/>
+          </w:tcPr>
+          <w:p>
+            <w:r/>
+            <w:r>
+              <w:rPr>
+                <w:b w:val="0"/>
+                <w:sz w:val="19"/>
+              </w:rPr>
+              <w:t>Solde</w:t>
+            </w:r>
+          </w:p>
+        </w:tc>
+        <w:tc>
+          <w:tcPr>
+            <w:tcW w:type="dxa" w:w="5443"/>
+          </w:tcPr>
+          <w:p>
+            <w:r/>
+            <w:r>
+              <w:rPr>
+                <w:b w:val="0"/>
+                <w:sz w:val="19"/>
+              </w:rPr>
+              <w:t>OM SOLDE quand tous ses versements non nuls sont CONFIRME ou RECOUVRE ; OM exonéré soldé à sa validation.</w:t>
             </w:r>
           </w:p>
         </w:tc>
@@ -12181,7 +12620,15 @@
         <w:pStyle w:val="ListBullet"/>
       </w:pPr>
       <w:r>
-        <w:t>Toute route /api/* non authentifiée répond 401 JSON, même sans en-tête Accept (aucune redirection vers une page de login).</w:t>
+        <w:t>Toute erreur d'une route /api/* répond en JSON, même sans en-tête Accept : 401 (aucune redirection vers une page de login), 405, 404, 403, 422 et 500 (bootstrap/app.php).</w:t>
+      </w:r>
+    </w:p>
+    <w:p>
+      <w:pPr>
+        <w:pStyle w:val="ListBullet"/>
+      </w:pPr>
+      <w:r>
+        <w:t>Notifications et e-mails réservés aux comptes actifs ; un compte désactivé n'en reçoit plus.</w:t>
       </w:r>
     </w:p>
     <w:p>
@@ -12513,7 +12960,7 @@
               <w:rPr>
                 <w:sz w:val="20"/>
               </w:rPr>
-              <w:t>Préfixe : /api. Authentification : header Authorization: Bearer {token}. Format JSON. Autorisation par middleware permission:{clé}. Throttling sur login, API, paiement et export. Référence exhaustive : backend/docs/openapi.yaml (OpenAPI 3, 96 opérations, chacune avec sa clé x-permission) ; OpenApiTest vérifie que chaque route y figure, sans opération en trop, avec la permission exigée par le middleware. Les tableaux ci-dessous en sont un résumé.</w:t>
+              <w:t>Préfixe : /api. Authentification : header Authorization: Bearer {token}. Format JSON. Autorisation par middleware permission:{clé}. Throttling sur login, API, paiement et export. Référence exhaustive : backend/docs/openapi.yaml (OpenAPI 3, 96 opérations, chacune avec sa clé x-permission) ; OpenApiTest vérifie que chaque route y figure, sans opération en trop, avec la permission exigée par le middleware. Le 25/10/2026, le document a été validé OpenAPI 3.0.3 et les réponses réelles confrontées aux schémas (routes GET et parcours d'écriture complet). Les tableaux ci-dessous en sont un résumé.</w:t>
             </w:r>
           </w:p>
         </w:tc>
@@ -15346,7 +15793,7 @@
                 <w:b w:val="0"/>
                 <w:sz w:val="19"/>
               </w:rPr>
-              <w:t>404</w:t>
+              <w:t>404 / 405</w:t>
             </w:r>
           </w:p>
         </w:tc>
@@ -15361,7 +15808,7 @@
                 <w:b w:val="0"/>
                 <w:sz w:val="19"/>
               </w:rPr>
-              <w:t>Introuvable</w:t>
+              <w:t>Introuvable / méthode non permise</w:t>
             </w:r>
           </w:p>
         </w:tc>
@@ -15376,7 +15823,7 @@
                 <w:b w:val="0"/>
                 <w:sz w:val="19"/>
               </w:rPr>
-              <w:t>Ressource inexistante</w:t>
+              <w:t>Ressource ou route inexistante / ex. GET sur /api/auth/login (toujours en JSON)</w:t>
             </w:r>
           </w:p>
         </w:tc>
@@ -16275,7 +16722,135 @@
                 <w:b w:val="0"/>
                 <w:sz w:val="19"/>
               </w:rPr>
-              <w:t>Domaines SPA autorisés</w:t>
+              <w:t>Laissée vide : authentification par jeton Bearer, sans cookie inter-domaines</w:t>
+            </w:r>
+          </w:p>
+        </w:tc>
+      </w:tr>
+      <w:tr>
+        <w:tc>
+          <w:tcPr>
+            <w:tcW w:type="dxa" w:w="4082"/>
+          </w:tcPr>
+          <w:p>
+            <w:r/>
+            <w:r>
+              <w:rPr>
+                <w:b w:val="0"/>
+                <w:sz w:val="19"/>
+              </w:rPr>
+              <w:t>FRONTEND_URL / CORS_ALLOWED_ORIGINS</w:t>
+            </w:r>
+          </w:p>
+        </w:tc>
+        <w:tc>
+          <w:tcPr>
+            <w:tcW w:type="dxa" w:w="5443"/>
+          </w:tcPr>
+          <w:p>
+            <w:r/>
+            <w:r>
+              <w:rPr>
+                <w:b w:val="0"/>
+                <w:sz w:val="19"/>
+              </w:rPr>
+              <w:t>Racine du SPA (liens des e-mails de réinitialisation) / origine autorisée</w:t>
+            </w:r>
+          </w:p>
+        </w:tc>
+      </w:tr>
+      <w:tr>
+        <w:tc>
+          <w:tcPr>
+            <w:tcW w:type="dxa" w:w="4082"/>
+          </w:tcPr>
+          <w:p>
+            <w:r/>
+            <w:r>
+              <w:rPr>
+                <w:b w:val="0"/>
+                <w:sz w:val="19"/>
+              </w:rPr>
+              <w:t>MTN_COMPTE / PAIEMENT_ASYNC_SEUIL</w:t>
+            </w:r>
+          </w:p>
+        </w:tc>
+        <w:tc>
+          <w:tcPr>
+            <w:tcW w:type="dxa" w:w="5443"/>
+          </w:tcPr>
+          <w:p>
+            <w:r/>
+            <w:r>
+              <w:rPr>
+                <w:b w:val="0"/>
+                <w:sz w:val="19"/>
+              </w:rPr>
+              <w:t>Compte payeur de l'en-tête MTN (HDR) / seuil de bascule en file (50)</w:t>
+            </w:r>
+          </w:p>
+        </w:tc>
+      </w:tr>
+      <w:tr>
+        <w:tc>
+          <w:tcPr>
+            <w:tcW w:type="dxa" w:w="4082"/>
+          </w:tcPr>
+          <w:p>
+            <w:r/>
+            <w:r>
+              <w:rPr>
+                <w:b w:val="0"/>
+                <w:sz w:val="19"/>
+              </w:rPr>
+              <w:t>WORKFLOW_SEPARATION_TACHES</w:t>
+            </w:r>
+          </w:p>
+        </w:tc>
+        <w:tc>
+          <w:tcPr>
+            <w:tcW w:type="dxa" w:w="5443"/>
+          </w:tcPr>
+          <w:p>
+            <w:r/>
+            <w:r>
+              <w:rPr>
+                <w:b w:val="0"/>
+                <w:sz w:val="19"/>
+              </w:rPr>
+              <w:t>Séparation des tâches du circuit (true par défaut)</w:t>
+            </w:r>
+          </w:p>
+        </w:tc>
+      </w:tr>
+      <w:tr>
+        <w:tc>
+          <w:tcPr>
+            <w:tcW w:type="dxa" w:w="4082"/>
+          </w:tcPr>
+          <w:p>
+            <w:r/>
+            <w:r>
+              <w:rPr>
+                <w:b w:val="0"/>
+                <w:sz w:val="19"/>
+              </w:rPr>
+              <w:t>CONTROLEUR_* / DAF_* / DG_*</w:t>
+            </w:r>
+          </w:p>
+        </w:tc>
+        <w:tc>
+          <w:tcPr>
+            <w:tcW w:type="dxa" w:w="5443"/>
+          </w:tcPr>
+          <w:p>
+            <w:r/>
+            <w:r>
+              <w:rPr>
+                <w:b w:val="0"/>
+                <w:sz w:val="19"/>
+              </w:rPr>
+              <w:t>Comptes nominatifs créés par ComptesCircuitSeeder (NAME, EMAIL, FONCTION)</w:t>
             </w:r>
           </w:p>
         </w:tc>
@@ -16519,6 +17094,15 @@
           <w:color w:val="4B5563"/>
         </w:rPr>
         <w:t>En environnement local/testing, le seeder crée un compte par profil (mot de passe « password ») : superadmin@, admin@, gestion@, finance@, controle@, daf@, dg@, lecteur@anatt.bj. Ces comptes ne sont JAMAIS créés en production.</w:t>
+      </w:r>
+    </w:p>
+    <w:p>
+      <w:r>
+        <w:rPr>
+          <w:b w:val="0"/>
+          <w:i w:val="0"/>
+        </w:rPr>
+        <w:t>En production, les signataires du circuit se créent par php artisan db:seed --class=ComptesCircuitSeeder --force : mot de passe temporaire affiché une seule fois, changement imposé à la première connexion. Le seeder ne réinitialise aucun mot de passe et ne rétrograde jamais un super administrateur.</w:t>
       </w:r>
     </w:p>
     <w:p>
@@ -16542,7 +17126,7 @@
         <w:pStyle w:val="ListBullet"/>
       </w:pPr>
       <w:r>
-        <w:t>Procédure sans SSH : DEPLOY-CPANEL.md et docs/runbook-mise-a-jour-cron.md (PHP 8.4 obligatoire).</w:t>
+        <w:t>Procédure sans SSH : DEPLOY-CPANEL.md et docs/runbook-mise-a-jour-cron.md (PHP 8.4.x 64 bits obligatoire, ni 8.3 ni 8.5). Les correctifs n° 17 à 32 ne portent que sur le code : aucune autre migration, vendor/ inchangé, SPA à redéployer.</w:t>
       </w:r>
     </w:p>
     <w:p>
@@ -16726,7 +17310,7 @@
                 <w:b w:val="0"/>
                 <w:sz w:val="19"/>
               </w:rPr>
-              <w:t>≈ 130 tests</w:t>
+              <w:t>129 tests</w:t>
             </w:r>
           </w:p>
         </w:tc>
@@ -16788,7 +17372,7 @@
                 <w:b w:val="0"/>
                 <w:sz w:val="19"/>
               </w:rPr>
-              <w:t>573 tests au total (68 fichiers)</w:t>
+              <w:t>589 tests au total (68 fichiers)</w:t>
             </w:r>
           </w:p>
         </w:tc>
@@ -16850,7 +17434,7 @@
                 <w:b w:val="0"/>
                 <w:sz w:val="19"/>
               </w:rPr>
-              <w:t>120 tests / 27 fichiers</w:t>
+              <w:t>123 tests</w:t>
             </w:r>
           </w:p>
         </w:tc>
@@ -16994,7 +17578,15 @@
         <w:pStyle w:val="ListBullet"/>
       </w:pPr>
       <w:r>
-        <w:t>Recette sur l'API réelle (23/10/2026, base SQLite neuve, QUEUE_CONNECTION=sync) : 83/83 contrôles conformes ; scénario de démonstration (docs/SCENARIO-DEMO.md) rejoué, conforme.</w:t>
+        <w:t>Recette sur l'API réelle (23/10/2026, base SQLite neuve, QUEUE_CONNECTION=sync) : 83/83 contrôles conformes ; scénario de démonstration (docs/SCENARIO-DEMO.md) rejoué, conforme. Le 25/10, réponses réelles de l'API confrontées aux schémas d'openapi.yaml (openapi-core) : conformes après le n° 32.</w:t>
+      </w:r>
+    </w:p>
+    <w:p>
+      <w:pPr>
+        <w:pStyle w:val="ListBullet"/>
+      </w:pPr>
+      <w:r>
+        <w:t>Défauts relevés par la revue d'octobre 2026 : 32, tous corrigés avec un test vu en échec sans le correctif (index : CHANGELOG.md ; détail : docs/revue-projet-2026-10.md §3). Points ouverts : §7 du rapport.</w:t>
       </w:r>
     </w:p>
     <w:p>

</xml_diff>

<commit_message>
feat : décisions D1 à D4 (notifications par droits effectifs, heure du Bénin, dépendances, écran de génération)
- D1 : NotificationService::notifier vise les comptes actifs dont les permissions
  effectives portent la clé de l'étape (rôles personnalisés et droits individuels
  compris, retraits respectés, SUPER_ADMIN exclu, une notification par compte).
- D2 : fuseau Africa/Porto-Novo (APP_TIMEZONE) ; migration qui décale d'une heure
  les horodatages existants (même instant), réversible ; caches purgés avant migrate
  dans les procédures de déploiement.
- D3 : retrait de @vueuse/core, lucide-vue-next et vue-pdf-embed (inutilisés).
- D4 : PaiementGeneration.vue recharge le lot après l'échec d'une génération.
- Documentation et notes de version 1.4 alignées.

Co-Authored-By: Claude Opus 5.5 <noreply@anthropic.com>
Claude-Session: https://claude.ai/code/session_01MUfkbbz4qHVd6KNyyZzHX8
</commit_message>
<xml_diff>
--- a/docs/ANaTT_Documentation_Technique_Fonctionnelle.docx
+++ b/docs/ANaTT_Documentation_Technique_Fonctionnelle.docx
@@ -3022,7 +3022,7 @@
                 <w:b w:val="0"/>
                 <w:sz w:val="19"/>
               </w:rPr>
-              <w:t>Base de données (SQLite en tests)</w:t>
+              <w:t>Base de données (SQLite en tests) ; horodatages à l'heure du Bénin (Africa/Porto-Novo), API en UTC</w:t>
             </w:r>
           </w:p>
         </w:tc>
@@ -6959,7 +6959,7 @@
         <w:pStyle w:val="ListBullet"/>
       </w:pPr>
       <w:r>
-        <w:t>Notifications (cloche + e-mail, NotificationService::notifierRole), adressées aux seuls comptes ACTIFS du profil système concerné : le signataire de l'étape suivante, l'agent financier à la validation finale, le gestionnaire au rejet. Un rôle personnalisé ou un droit accordé individuellement autorise l'action sans être notifié.</w:t>
+        <w:t>Notifications (cloche + e-mail, NotificationService::notifier), adressées aux comptes ACTIFS qui détiennent la permission de l'étape suivante dans leurs droits EFFECTIFS (profil, rôle personnalisé, accords et retraits individuels) : om.valider / om.viser / om.approuver pour le signataire suivant, paiements.generer à la validation finale, om.retranscrire au rejet. Le SUPER_ADMIN n'est pas visé ; un compte visé à deux titres ne reçoit qu'une notification.</w:t>
       </w:r>
     </w:p>
     <w:p>
@@ -7547,7 +7547,7 @@
         <w:pStyle w:val="ListBullet"/>
       </w:pPr>
       <w:r>
-        <w:t>En QUEUE_CONNECTION=sync (production cPanel), le job tourne dans la requête : le gros lot répond 202 seulement si la génération réussit ; sinon l'erreur revient dans la réponse même (après failed()). L'écran ne se rafraîchit pas alors : recharger la page avant toute autre action.</w:t>
+        <w:t>En QUEUE_CONNECTION=sync (production cPanel), le job tourne dans la requête : le gros lot répond 202 seulement si la génération réussit ; sinon l'erreur revient dans la réponse même (après failed()). L'écran recharge alors le lot : un lot passé en ERREUR n'offre plus « Confirmer ».</w:t>
       </w:r>
     </w:p>
     <w:p>
@@ -17372,7 +17372,7 @@
                 <w:b w:val="0"/>
                 <w:sz w:val="19"/>
               </w:rPr>
-              <w:t>589 tests au total (68 fichiers)</w:t>
+              <w:t>598 tests au total (68 fichiers)</w:t>
             </w:r>
           </w:p>
         </w:tc>
@@ -17434,7 +17434,7 @@
                 <w:b w:val="0"/>
                 <w:sz w:val="19"/>
               </w:rPr>
-              <w:t>123 tests</w:t>
+              <w:t>124 tests</w:t>
             </w:r>
           </w:p>
         </w:tc>

</xml_diff>

<commit_message>
fix(ui) : bandeau AppAlert, libellés avance / reliquat après amendement, modèles de notification
- AppAlert : le contenu du slot forme un seul bloc (le bandeau de l'écran
  Signatures était coupé en colonnes par le flex).
- Fiche OM et aperçu PDF : libellés de la répartition alignés sur le PDF
  officiel (utils/repartition.ts, miroir de PdfGenerator::libellesRepartition) :
  pourcentage réel de l'OM, avance engagée, reliquat ajusté ou trop-perçu.
- Configuration e-mail : les 7 notifications réelles de NotificationContenu,
  avec la permission des destinataires ; NotificationModelesEcranTest verrouille
  la cohérence écran / backend.
- Galerie des écrans recapturée ; documentation et compteurs de tests.

Co-Authored-By: Claude Opus 5.5 <noreply@anthropic.com>
Claude-Session: https://claude.ai/code/session_01MUfkbbz4qHVd6KNyyZzHX8
</commit_message>
<xml_diff>
--- a/docs/ANaTT_Documentation_Technique_Fonctionnelle.docx
+++ b/docs/ANaTT_Documentation_Technique_Fonctionnelle.docx
@@ -17372,7 +17372,7 @@
                 <w:b w:val="0"/>
                 <w:sz w:val="19"/>
               </w:rPr>
-              <w:t>598 tests au total (68 fichiers)</w:t>
+              <w:t>599 tests au total (68 fichiers)</w:t>
             </w:r>
           </w:p>
         </w:tc>
@@ -17434,7 +17434,7 @@
                 <w:b w:val="0"/>
                 <w:sz w:val="19"/>
               </w:rPr>
-              <w:t>124 tests</w:t>
+              <w:t>133 tests</w:t>
             </w:r>
           </w:p>
         </w:tc>

</xml_diff>

<commit_message>
docs(technique) : documentation technique 1.4 (décisions D1 à D4, mise à jour d'une instance)
- Chapitre « Évolutions de la version 1.4 » : notifications par droits effectifs,
  heure du Bénin et migration des horodatages, dépendances retirées, écran de
  génération, correctifs d'interface, galerie des écrans, tests.
- Structure, fiche OM, destinataires des notifications, APP_TIMEZONE, npm ci,
  purge des caches avant migrate, §9.6 mise à jour 1.4, §10 tests.

Co-Authored-By: Claude Opus 5.5 <noreply@anthropic.com>
Claude-Session: https://claude.ai/code/session_01MUfkbbz4qHVd6KNyyZzHX8
</commit_message>
<xml_diff>
--- a/docs/ANaTT_Documentation_Technique_Fonctionnelle.docx
+++ b/docs/ANaTT_Documentation_Technique_Fonctionnelle.docx
@@ -156,7 +156,7 @@
           <w:b/>
           <w:color w:val="B8891A"/>
         </w:rPr>
-        <w:t>Version 1.3.0  •  Octobre 2026</w:t>
+        <w:t>Version 1.4.0  •  Octobre 2026</w:t>
       </w:r>
     </w:p>
     <w:p>
@@ -204,6 +204,420 @@
         <w:pStyle w:val="Heading1"/>
       </w:pPr>
       <w:r>
+        <w:t>Évolutions de la version 1.4 (26-27 octobre 2026)</w:t>
+      </w:r>
+    </w:p>
+    <w:p>
+      <w:r>
+        <w:rPr>
+          <w:b w:val="0"/>
+          <w:i w:val="0"/>
+        </w:rPr>
+        <w:t>Cette version applique les quatre décisions du §7.1 de la revue (docs/revue-projet-2026-10.md), corrige trois défauts d'interface et remplace les maquettes d'août 2026 par les écrans réels.</w:t>
+      </w:r>
+    </w:p>
+    <w:tbl>
+      <w:tblPr>
+        <w:tblStyle w:val="TableGrid"/>
+        <w:tblW w:type="auto" w:w="0"/>
+        <w:jc w:val="center"/>
+        <w:tblLayout w:type="fixed"/>
+        <w:tblLook w:firstColumn="1" w:firstRow="1" w:lastColumn="0" w:lastRow="0" w:noHBand="0" w:noVBand="1" w:val="04A0"/>
+      </w:tblPr>
+      <w:tblGrid>
+        <w:gridCol w:w="2041"/>
+        <w:gridCol w:w="6009"/>
+        <w:gridCol w:w="1474"/>
+      </w:tblGrid>
+      <w:tr>
+        <w:tc>
+          <w:tcPr>
+            <w:tcW w:type="dxa" w:w="2041"/>
+            <w:shd w:val="clear" w:fill="1D9E4F"/>
+          </w:tcPr>
+          <w:p>
+            <w:r/>
+            <w:r>
+              <w:rPr>
+                <w:b/>
+                <w:color w:val="FFFFFF"/>
+                <w:sz w:val="20"/>
+              </w:rPr>
+              <w:t>Domaine</w:t>
+            </w:r>
+          </w:p>
+        </w:tc>
+        <w:tc>
+          <w:tcPr>
+            <w:tcW w:type="dxa" w:w="6009"/>
+            <w:shd w:val="clear" w:fill="1D9E4F"/>
+          </w:tcPr>
+          <w:p>
+            <w:r/>
+            <w:r>
+              <w:rPr>
+                <w:b/>
+                <w:color w:val="FFFFFF"/>
+                <w:sz w:val="20"/>
+              </w:rPr>
+              <w:t>Évolution</w:t>
+            </w:r>
+          </w:p>
+        </w:tc>
+        <w:tc>
+          <w:tcPr>
+            <w:tcW w:type="dxa" w:w="1474"/>
+            <w:shd w:val="clear" w:fill="1D9E4F"/>
+          </w:tcPr>
+          <w:p>
+            <w:r/>
+            <w:r>
+              <w:rPr>
+                <w:b/>
+                <w:color w:val="FFFFFF"/>
+                <w:sz w:val="20"/>
+              </w:rPr>
+              <w:t>Référence</w:t>
+            </w:r>
+          </w:p>
+        </w:tc>
+      </w:tr>
+      <w:tr>
+        <w:tc>
+          <w:tcPr>
+            <w:tcW w:type="dxa" w:w="2041"/>
+          </w:tcPr>
+          <w:p>
+            <w:r/>
+            <w:r>
+              <w:rPr>
+                <w:b w:val="0"/>
+                <w:sz w:val="19"/>
+              </w:rPr>
+              <w:t>Notifications (D1)</w:t>
+            </w:r>
+          </w:p>
+        </w:tc>
+        <w:tc>
+          <w:tcPr>
+            <w:tcW w:type="dxa" w:w="6009"/>
+          </w:tcPr>
+          <w:p>
+            <w:r/>
+            <w:r>
+              <w:rPr>
+                <w:b w:val="0"/>
+                <w:sz w:val="19"/>
+              </w:rPr>
+              <w:t>NotificationService::notifier vise les comptes actifs dont les permissions EFFECTIVES portent la clé de l'étape (om.valider / om.viser / om.approuver, paiements.generer, paiements.confirmer, om.retranscrire, utilisateurs.gerer) : rôles personnalisés et droits individuels compris, retraits respectés, SUPER_ADMIN exclu, une notification par compte.</w:t>
+            </w:r>
+          </w:p>
+        </w:tc>
+        <w:tc>
+          <w:tcPr>
+            <w:tcW w:type="dxa" w:w="1474"/>
+          </w:tcPr>
+          <w:p>
+            <w:r/>
+            <w:r>
+              <w:rPr>
+                <w:b w:val="0"/>
+                <w:sz w:val="19"/>
+              </w:rPr>
+              <w:t>§4.2, §6.3</w:t>
+            </w:r>
+          </w:p>
+        </w:tc>
+      </w:tr>
+      <w:tr>
+        <w:tc>
+          <w:tcPr>
+            <w:tcW w:type="dxa" w:w="2041"/>
+          </w:tcPr>
+          <w:p>
+            <w:r/>
+            <w:r>
+              <w:rPr>
+                <w:b w:val="0"/>
+                <w:sz w:val="19"/>
+              </w:rPr>
+              <w:t>Fuseau horaire (D2)</w:t>
+            </w:r>
+          </w:p>
+        </w:tc>
+        <w:tc>
+          <w:tcPr>
+            <w:tcW w:type="dxa" w:w="6009"/>
+          </w:tcPr>
+          <w:p>
+            <w:r/>
+            <w:r>
+              <w:rPr>
+                <w:b w:val="0"/>
+                <w:sz w:val="19"/>
+              </w:rPr>
+              <w:t>config/app.php : APP_TIMEZONE, défaut Africa/Porto-Novo (UTC+1). Migration 2026_10_26_090000_passer_horodatages_au_fuseau_applicatif : +1 h sur toutes les colonnes DATETIME / TIMESTAMP (même instant, scellés inchangés), down() −1 h. L'API sérialise toujours en UTC.</w:t>
+            </w:r>
+          </w:p>
+        </w:tc>
+        <w:tc>
+          <w:tcPr>
+            <w:tcW w:type="dxa" w:w="1474"/>
+          </w:tcPr>
+          <w:p>
+            <w:r/>
+            <w:r>
+              <w:rPr>
+                <w:b w:val="0"/>
+                <w:sz w:val="19"/>
+              </w:rPr>
+              <w:t>§2.2, §9.2, §9.6</w:t>
+            </w:r>
+          </w:p>
+        </w:tc>
+      </w:tr>
+      <w:tr>
+        <w:tc>
+          <w:tcPr>
+            <w:tcW w:type="dxa" w:w="2041"/>
+          </w:tcPr>
+          <w:p>
+            <w:r/>
+            <w:r>
+              <w:rPr>
+                <w:b w:val="0"/>
+                <w:sz w:val="19"/>
+              </w:rPr>
+              <w:t>Dépendances (D3)</w:t>
+            </w:r>
+          </w:p>
+        </w:tc>
+        <w:tc>
+          <w:tcPr>
+            <w:tcW w:type="dxa" w:w="6009"/>
+          </w:tcPr>
+          <w:p>
+            <w:r/>
+            <w:r>
+              <w:rPr>
+                <w:b w:val="0"/>
+                <w:sz w:val="19"/>
+              </w:rPr>
+              <w:t>vue-pdf-embed, lucide-vue-next et @vueuse/core retirés (inutilisés) ; Vue reste en 3.6.0-beta.9.</w:t>
+            </w:r>
+          </w:p>
+        </w:tc>
+        <w:tc>
+          <w:tcPr>
+            <w:tcW w:type="dxa" w:w="1474"/>
+          </w:tcPr>
+          <w:p>
+            <w:r/>
+            <w:r>
+              <w:rPr>
+                <w:b w:val="0"/>
+                <w:sz w:val="19"/>
+              </w:rPr>
+              <w:t>§2.2</w:t>
+            </w:r>
+          </w:p>
+        </w:tc>
+      </w:tr>
+      <w:tr>
+        <w:tc>
+          <w:tcPr>
+            <w:tcW w:type="dxa" w:w="2041"/>
+          </w:tcPr>
+          <w:p>
+            <w:r/>
+            <w:r>
+              <w:rPr>
+                <w:b w:val="0"/>
+                <w:sz w:val="19"/>
+              </w:rPr>
+              <w:t>Écran de génération (D4)</w:t>
+            </w:r>
+          </w:p>
+        </w:tc>
+        <w:tc>
+          <w:tcPr>
+            <w:tcW w:type="dxa" w:w="6009"/>
+          </w:tcPr>
+          <w:p>
+            <w:r/>
+            <w:r>
+              <w:rPr>
+                <w:b w:val="0"/>
+                <w:sz w:val="19"/>
+              </w:rPr>
+              <w:t>PaiementGeneration.vue recharge le lot après l'échec d'une génération.</w:t>
+            </w:r>
+          </w:p>
+        </w:tc>
+        <w:tc>
+          <w:tcPr>
+            <w:tcW w:type="dxa" w:w="1474"/>
+          </w:tcPr>
+          <w:p>
+            <w:r/>
+            <w:r>
+              <w:rPr>
+                <w:b w:val="0"/>
+                <w:sz w:val="19"/>
+              </w:rPr>
+              <w:t>§4.3</w:t>
+            </w:r>
+          </w:p>
+        </w:tc>
+      </w:tr>
+      <w:tr>
+        <w:tc>
+          <w:tcPr>
+            <w:tcW w:type="dxa" w:w="2041"/>
+          </w:tcPr>
+          <w:p>
+            <w:r/>
+            <w:r>
+              <w:rPr>
+                <w:b w:val="0"/>
+                <w:sz w:val="19"/>
+              </w:rPr>
+              <w:t>Interface</w:t>
+            </w:r>
+          </w:p>
+        </w:tc>
+        <w:tc>
+          <w:tcPr>
+            <w:tcW w:type="dxa" w:w="6009"/>
+          </w:tcPr>
+          <w:p>
+            <w:r/>
+            <w:r>
+              <w:rPr>
+                <w:b w:val="0"/>
+                <w:sz w:val="19"/>
+              </w:rPr>
+              <w:t>AppAlert : contenu du slot en un seul bloc (bandeau de l'écran Signatures). Fiche et aperçu d'un OM : libellés de la répartition alignés sur le PDF (utils/repartition.ts, miroir de PdfGenerator::libellesRepartition). Configuration e-mail : les 7 notifications de NotificationContenu.</w:t>
+            </w:r>
+          </w:p>
+        </w:tc>
+        <w:tc>
+          <w:tcPr>
+            <w:tcW w:type="dxa" w:w="1474"/>
+          </w:tcPr>
+          <w:p>
+            <w:r/>
+            <w:r>
+              <w:rPr>
+                <w:b w:val="0"/>
+                <w:sz w:val="19"/>
+              </w:rPr>
+              <w:t>§3.4, §4.4</w:t>
+            </w:r>
+          </w:p>
+        </w:tc>
+      </w:tr>
+      <w:tr>
+        <w:tc>
+          <w:tcPr>
+            <w:tcW w:type="dxa" w:w="2041"/>
+          </w:tcPr>
+          <w:p>
+            <w:r/>
+            <w:r>
+              <w:rPr>
+                <w:b w:val="0"/>
+                <w:sz w:val="19"/>
+              </w:rPr>
+              <w:t>Maquettes</w:t>
+            </w:r>
+          </w:p>
+        </w:tc>
+        <w:tc>
+          <w:tcPr>
+            <w:tcW w:type="dxa" w:w="6009"/>
+          </w:tcPr>
+          <w:p>
+            <w:r/>
+            <w:r>
+              <w:rPr>
+                <w:b w:val="0"/>
+                <w:sz w:val="19"/>
+              </w:rPr>
+              <w:t>Galerie et pages d'écran tirées des captures de l'application réelle (docs/capturer_ecrans.cjs, docs/generer_maquettes.py) ; remplacent les maquettes d'août 2026.</w:t>
+            </w:r>
+          </w:p>
+        </w:tc>
+        <w:tc>
+          <w:tcPr>
+            <w:tcW w:type="dxa" w:w="1474"/>
+          </w:tcPr>
+          <w:p>
+            <w:r/>
+            <w:r>
+              <w:rPr>
+                <w:b w:val="0"/>
+                <w:sz w:val="19"/>
+              </w:rPr>
+              <w:t>§2.3</w:t>
+            </w:r>
+          </w:p>
+        </w:tc>
+      </w:tr>
+      <w:tr>
+        <w:tc>
+          <w:tcPr>
+            <w:tcW w:type="dxa" w:w="2041"/>
+          </w:tcPr>
+          <w:p>
+            <w:r/>
+            <w:r>
+              <w:rPr>
+                <w:b w:val="0"/>
+                <w:sz w:val="19"/>
+              </w:rPr>
+              <w:t>Tests</w:t>
+            </w:r>
+          </w:p>
+        </w:tc>
+        <w:tc>
+          <w:tcPr>
+            <w:tcW w:type="dxa" w:w="6009"/>
+          </w:tcPr>
+          <w:p>
+            <w:r/>
+            <w:r>
+              <w:rPr>
+                <w:b w:val="0"/>
+                <w:sz w:val="19"/>
+              </w:rPr>
+              <w:t>FuseauHoraireTest, NotificationModelesEcranTest (écran e-mail ↔ NotificationContenu), tests des destinataires ; Pest 599, Vitest 133.</w:t>
+            </w:r>
+          </w:p>
+        </w:tc>
+        <w:tc>
+          <w:tcPr>
+            <w:tcW w:type="dxa" w:w="1474"/>
+          </w:tcPr>
+          <w:p>
+            <w:r/>
+            <w:r>
+              <w:rPr>
+                <w:b w:val="0"/>
+                <w:sz w:val="19"/>
+              </w:rPr>
+              <w:t>§10</w:t>
+            </w:r>
+          </w:p>
+        </w:tc>
+      </w:tr>
+    </w:tbl>
+    <w:p/>
+    <w:p>
+      <w:pPr>
+        <w:pStyle w:val="Heading1"/>
+      </w:pPr>
+      <w:r>
         <w:t>Évolutions de la version 1.3 (octobre 2026)</w:t>
       </w:r>
     </w:p>
@@ -1437,7 +1851,7 @@
                 <w:b w:val="0"/>
                 <w:sz w:val="19"/>
               </w:rPr>
-              <w:t>Adressées aux seuls comptes ACTIFS des profils système ; aucun e-mail vers un compte désactivé entre-temps (n° 27).</w:t>
+              <w:t>Adressées aux seuls comptes ACTIFS (alors des profils système, droits effectifs depuis la 1.4) ; aucun e-mail vers un compte désactivé entre-temps (n° 27).</w:t>
             </w:r>
           </w:p>
         </w:tc>
@@ -3308,7 +3722,7 @@
                 <w:color w:val="FFFFFF"/>
                 <w:sz w:val="18"/>
               </w:rPr>
-              <w:t xml:space="preserve">    src/utils/permissions.ts  Miroir RBAC frontend (guards + directive v-permission)</w:t>
+              <w:t xml:space="preserve">    src/utils/             permissions (miroir RBAC : guards + v-permission), benin, exercice,</w:t>
             </w:r>
           </w:p>
           <w:p>
@@ -3318,7 +3732,7 @@
                 <w:color w:val="FFFFFF"/>
                 <w:sz w:val="18"/>
               </w:rPr>
-              <w:t xml:space="preserve">  backend/                 API Laravel 12</w:t>
+              <w:t xml:space="preserve">                           repartition (libellés avance / reliquat, miroir de PdfGenerator)</w:t>
             </w:r>
           </w:p>
           <w:p>
@@ -3328,7 +3742,7 @@
                 <w:color w:val="FFFFFF"/>
                 <w:sz w:val="18"/>
               </w:rPr>
-              <w:t xml:space="preserve">    app/Http/Controllers/Api/  Contrôleurs REST</w:t>
+              <w:t xml:space="preserve">  backend/                 API Laravel 12</w:t>
             </w:r>
           </w:p>
           <w:p>
@@ -3338,7 +3752,7 @@
                 <w:color w:val="FFFFFF"/>
                 <w:sz w:val="18"/>
               </w:rPr>
-              <w:t xml:space="preserve">    app/Http/Requests/     Form Requests (validation des écritures)</w:t>
+              <w:t xml:space="preserve">    app/Http/Controllers/Api/  Contrôleurs REST</w:t>
             </w:r>
           </w:p>
           <w:p>
@@ -3348,7 +3762,7 @@
                 <w:color w:val="FFFFFF"/>
                 <w:sz w:val="18"/>
               </w:rPr>
-              <w:t xml:space="preserve">    app/Models/            Modèles Eloquent</w:t>
+              <w:t xml:space="preserve">    app/Http/Requests/     Form Requests (validation des écritures)</w:t>
             </w:r>
           </w:p>
           <w:p>
@@ -3358,7 +3772,7 @@
                 <w:color w:val="FFFFFF"/>
                 <w:sz w:val="18"/>
               </w:rPr>
-              <w:t xml:space="preserve">    app/Services/          Logique métier (calcul, lots, barème, rapports, audit)</w:t>
+              <w:t xml:space="preserve">    app/Models/            Modèles Eloquent</w:t>
             </w:r>
           </w:p>
           <w:p>
@@ -3368,7 +3782,7 @@
                 <w:color w:val="FFFFFF"/>
                 <w:sz w:val="18"/>
               </w:rPr>
-              <w:t xml:space="preserve">    app/Services/Paiement/  Générateurs MTN (.txt) et Moov (.xlsx)</w:t>
+              <w:t xml:space="preserve">    app/Services/          Logique métier (calcul, lots, barème, rapports, audit)</w:t>
             </w:r>
           </w:p>
           <w:p>
@@ -3378,7 +3792,7 @@
                 <w:color w:val="FFFFFF"/>
                 <w:sz w:val="18"/>
               </w:rPr>
-              <w:t xml:space="preserve">    app/Support/Permissions  Source unique des clés de permission (RBAC)</w:t>
+              <w:t xml:space="preserve">    app/Services/Paiement/  Générateurs MTN (.txt) et Moov (.xlsx)</w:t>
             </w:r>
           </w:p>
           <w:p>
@@ -3388,7 +3802,7 @@
                 <w:color w:val="FFFFFF"/>
                 <w:sz w:val="18"/>
               </w:rPr>
-              <w:t xml:space="preserve">    app/Support/PermissionRepository  Matrice effective (table role_permissions, cache)</w:t>
+              <w:t xml:space="preserve">    app/Support/Permissions  Source unique des clés de permission (RBAC)</w:t>
             </w:r>
           </w:p>
           <w:p>
@@ -3398,7 +3812,7 @@
                 <w:color w:val="FFFFFF"/>
                 <w:sz w:val="18"/>
               </w:rPr>
-              <w:t xml:space="preserve">    app/Console/Commands/  db:backup / db:restore</w:t>
+              <w:t xml:space="preserve">    app/Support/PermissionRepository  Matrice effective (table role_permissions, cache)</w:t>
             </w:r>
           </w:p>
           <w:p>
@@ -3408,7 +3822,7 @@
                 <w:color w:val="FFFFFF"/>
                 <w:sz w:val="18"/>
               </w:rPr>
-              <w:t xml:space="preserve">    app/Jobs/              Tâches asynchrones (gros lots, exports de rapports, e-mails)</w:t>
+              <w:t xml:space="preserve">    app/Console/Commands/  db:backup / db:restore</w:t>
             </w:r>
           </w:p>
           <w:p>
@@ -3418,7 +3832,7 @@
                 <w:color w:val="FFFFFF"/>
                 <w:sz w:val="18"/>
               </w:rPr>
-              <w:t xml:space="preserve">    docs/openapi.yaml      Référence API (verrouillée par tests/Feature/OpenApiTest.php)</w:t>
+              <w:t xml:space="preserve">    app/Jobs/              Tâches asynchrones (gros lots, exports de rapports, e-mails)</w:t>
             </w:r>
           </w:p>
           <w:p>
@@ -3428,7 +3842,27 @@
                 <w:color w:val="FFFFFF"/>
                 <w:sz w:val="18"/>
               </w:rPr>
+              <w:t xml:space="preserve">    docs/openapi.yaml      Référence API (verrouillée par tests/Feature/OpenApiTest.php)</w:t>
+            </w:r>
+          </w:p>
+          <w:p>
+            <w:r>
+              <w:rPr>
+                <w:rFonts w:ascii="Consolas" w:hAnsi="Consolas"/>
+                <w:color w:val="FFFFFF"/>
+                <w:sz w:val="18"/>
+              </w:rPr>
               <w:t xml:space="preserve">  docs/                    Documentation (.docx + scripts générateurs)</w:t>
+            </w:r>
+          </w:p>
+          <w:p>
+            <w:r>
+              <w:rPr>
+                <w:rFonts w:ascii="Consolas" w:hAnsi="Consolas"/>
+                <w:color w:val="FFFFFF"/>
+                <w:sz w:val="18"/>
+              </w:rPr>
+              <w:t xml:space="preserve">    00_galerie_index.html…  Galerie des écrans réels (captures docs/ecrans/, generer_maquettes.py)</w:t>
             </w:r>
           </w:p>
           <w:p>
@@ -5856,7 +6290,7 @@
         <w:pStyle w:val="ListBullet"/>
       </w:pPr>
       <w:r>
-        <w:t>Détail d'un OM : mission, bénéficiaire, montants, versements, journal des amendements ; renvoie vers l'état de la mission. Boutons Valider / Rejeter uniquement pour une mission SANS état (repli). Amender (om.retranscrire). Brouillon PDF de l'OM et historique d'audit (OM-08).</w:t>
+        <w:t>Détail d'un OM : mission, bénéficiaire, montants, versements, journal des amendements ; renvoie vers l'état de la mission. Boutons Valider / Rejeter uniquement pour une mission SANS état (repli). Amender (om.retranscrire). Brouillon PDF de l'OM et historique d'audit (OM-08). Après un amendement, la fiche et l'aperçu OM-07 affichent les libellés du PDF officiel (« Avance engagée », « Reliquat (ajusté par amendement) », « Trop-perçu ») ; sinon le pourcentage réel de l'OM (utils/repartition.ts).</w:t>
       </w:r>
     </w:p>
     <w:p>
@@ -8572,7 +9006,7 @@
                 <w:b w:val="0"/>
                 <w:sz w:val="19"/>
               </w:rPr>
-              <w:t>Ligne om_amendements (avant / après, delta, motif, auteur) + audit AMEND_OM ; notification « trop-perçu » à l'agent financier si reliquat &lt; 0.</w:t>
+              <w:t>Ligne om_amendements (avant / après, delta, motif, auteur) + audit AMEND_OM ; notification « trop-perçu » aux détenteurs de paiements.confirmer si reliquat &lt; 0.</w:t>
             </w:r>
           </w:p>
         </w:tc>
@@ -12628,7 +13062,7 @@
         <w:pStyle w:val="ListBullet"/>
       </w:pPr>
       <w:r>
-        <w:t>Notifications et e-mails réservés aux comptes actifs ; un compte désactivé n'en reçoit plus.</w:t>
+        <w:t>Notifications et e-mails réservés aux comptes actifs détenant la permission de l'étape (droits effectifs) ; un compte désactivé n'en reçoit plus, le SUPER_ADMIN n'est pas visé.</w:t>
       </w:r>
     </w:p>
     <w:p>
@@ -16515,6 +16949,38 @@
                 <w:b w:val="0"/>
                 <w:sz w:val="19"/>
               </w:rPr>
+              <w:t>APP_TIMEZONE</w:t>
+            </w:r>
+          </w:p>
+        </w:tc>
+        <w:tc>
+          <w:tcPr>
+            <w:tcW w:type="dxa" w:w="5443"/>
+          </w:tcPr>
+          <w:p>
+            <w:r/>
+            <w:r>
+              <w:rPr>
+                <w:b w:val="0"/>
+                <w:sz w:val="19"/>
+              </w:rPr>
+              <w:t>Fuseau de l'application : Africa/Porto-Novo par défaut (heure du Bénin). À fixer AVANT la migration du fuseau ; UTC la rend sans effet</w:t>
+            </w:r>
+          </w:p>
+        </w:tc>
+      </w:tr>
+      <w:tr>
+        <w:tc>
+          <w:tcPr>
+            <w:tcW w:type="dxa" w:w="4082"/>
+          </w:tcPr>
+          <w:p>
+            <w:r/>
+            <w:r>
+              <w:rPr>
+                <w:b w:val="0"/>
+                <w:sz w:val="19"/>
+              </w:rPr>
               <w:t>DB_DATABASE / DB_USERNAME / DB_PASSWORD</w:t>
             </w:r>
           </w:p>
@@ -16973,7 +17439,7 @@
                 <w:color w:val="FFFFFF"/>
                 <w:sz w:val="18"/>
               </w:rPr>
-              <w:t>php artisan config:cache &amp;&amp; php artisan route:cache</w:t>
+              <w:t>php artisan config:cache &amp;&amp; php artisan route:cache   # mise à jour : optimize:clear AVANT migrate</w:t>
             </w:r>
           </w:p>
           <w:p>
@@ -17042,7 +17508,7 @@
                 <w:color w:val="FFFFFF"/>
                 <w:sz w:val="18"/>
               </w:rPr>
-              <w:t>cd frontend &amp;&amp; npm install &amp;&amp; npm run build</w:t>
+              <w:t>cd frontend &amp;&amp; npm ci &amp;&amp; npm run build      # npm ci : garde la bêta Vue figée par le lock</w:t>
             </w:r>
           </w:p>
           <w:p>
@@ -17163,6 +17629,46 @@
     </w:p>
     <w:p>
       <w:pPr>
+        <w:pStyle w:val="Heading2"/>
+      </w:pPr>
+      <w:r>
+        <w:t>9.6 Mise à jour d'une instance (version 1.4)</w:t>
+      </w:r>
+    </w:p>
+    <w:p>
+      <w:pPr>
+        <w:pStyle w:val="ListBullet"/>
+      </w:pPr>
+      <w:r>
+        <w:t>Migration à jouer : 2026_10_26_090000_passer_horodatages_au_fuseau_applicatif (34 migrations en tout). Elle décale d'une heure les date-heures existantes ; à jouer une seule fois, application EN MAINTENANCE pendant l'envoi du code et la migration (une écriture intermédiaire serait décalée deux fois).</w:t>
+      </w:r>
+    </w:p>
+    <w:p>
+      <w:pPr>
+        <w:pStyle w:val="ListBullet"/>
+      </w:pPr>
+      <w:r>
+        <w:t>Purger les caches AVANT migrate (optimize:clear) : avec une configuration en cache encore en UTC, la migration ne décalerait rien. Les commandes de DEPLOY-CPANEL.md et du runbook enchaînent désormais optimize:clear → migrate → optimize:clear.</w:t>
+      </w:r>
+    </w:p>
+    <w:p>
+      <w:pPr>
+        <w:pStyle w:val="ListBullet"/>
+      </w:pPr>
+      <w:r>
+        <w:t>Contrôle : un date_paiement relevé avant la mise à jour a pris une heure en base, et l'écran affiche la même heure qu'avant (docs/checklist-post-deploiement.md §06, Version 1.4).</w:t>
+      </w:r>
+    </w:p>
+    <w:p>
+      <w:pPr>
+        <w:pStyle w:val="ListBullet"/>
+      </w:pPr>
+      <w:r>
+        <w:t>vendor/ inchangé ; SPA à redéployer (dépendances retirées, écran de génération, correctifs d'interface).</w:t>
+      </w:r>
+    </w:p>
+    <w:p>
+      <w:pPr>
         <w:pStyle w:val="Heading1"/>
       </w:pPr>
       <w:r>
@@ -17372,7 +17878,7 @@
                 <w:b w:val="0"/>
                 <w:sz w:val="19"/>
               </w:rPr>
-              <w:t>599 tests au total (68 fichiers)</w:t>
+              <w:t>599 tests au total (70 fichiers)</w:t>
             </w:r>
           </w:p>
         </w:tc>
@@ -17570,7 +18076,15 @@
         <w:pStyle w:val="ListBullet"/>
       </w:pPr>
       <w:r>
-        <w:t>Garde-fous croisés : RoutesPermissionsTest (aucune route API sans permission), OpenApiTest (openapi.yaml ↔ routes ↔ permissions) et navigation.spec.ts (menu ↔ routes ↔ API cohérents).</w:t>
+        <w:t>Garde-fous croisés : RoutesPermissionsTest (aucune route API sans permission), OpenApiTest (openapi.yaml ↔ routes ↔ permissions), NotificationModelesEcranTest (écran Configuration e-mail ↔ NotificationContenu) et navigation.spec.ts (menu ↔ routes ↔ API cohérents).</w:t>
+      </w:r>
+    </w:p>
+    <w:p>
+      <w:pPr>
+        <w:pStyle w:val="ListBullet"/>
+      </w:pPr>
+      <w:r>
+        <w:t>Fuseau : FuseauHoraireTest (heure du Bénin, rapport du 1er du mois à 0 h 30, sérialisation UTC, migration aller-retour) ; migration éprouvée sur MariaDB avec les données de démonstration.</w:t>
       </w:r>
     </w:p>
     <w:p>
@@ -17586,7 +18100,7 @@
         <w:pStyle w:val="ListBullet"/>
       </w:pPr>
       <w:r>
-        <w:t>Défauts relevés par la revue d'octobre 2026 : 32, tous corrigés avec un test vu en échec sans le correctif (index : CHANGELOG.md ; détail : docs/revue-projet-2026-10.md §3). Points ouverts : §7 du rapport.</w:t>
+        <w:t>Défauts relevés par la revue d'octobre 2026 : 32, tous corrigés avec un test vu en échec sans le correctif (index : CHANGELOG.md ; détail : docs/revue-projet-2026-10.md §3). Les quatre décisions du §7.1 sont appliquées depuis la 1.4.</w:t>
       </w:r>
     </w:p>
     <w:p>

</xml_diff>

<commit_message>
docs(déploiement) : mise en maintenance sans SSH ; le SPA ouvre l'écran Maintenance sur un 503
- useApi.ts : un 503 (php artisan down) ouvre l'écran Maintenance avec retour à la
  page demandée ; auparavant les écrans échouaient sans message (test
  maintenance-503.spec.ts, rouge avant le correctif).
- DEPLOY-CPANEL.md : § B bis (artisan down par Cron, comportement éprouvé),
  migration terminée par artisan up, notes 1.4 complétées, APP_TIMEZONE,
  Paramètres › Sauvegardes, dépannage, en-tête relu.
- Runbook (étape 3 bis), checklist, AGENTS.md, compteurs, documentation technique.

Co-Authored-By: Claude Opus 5.5 <noreply@anthropic.com>
Claude-Session: https://claude.ai/code/session_01MUfkbbz4qHVd6KNyyZzHX8
</commit_message>
<xml_diff>
--- a/docs/ANaTT_Documentation_Technique_Fonctionnelle.docx
+++ b/docs/ANaTT_Documentation_Technique_Fonctionnelle.docx
@@ -591,7 +591,7 @@
                 <w:b w:val="0"/>
                 <w:sz w:val="19"/>
               </w:rPr>
-              <w:t>FuseauHoraireTest, NotificationModelesEcranTest (écran e-mail ↔ NotificationContenu), tests des destinataires ; Pest 599, Vitest 133.</w:t>
+              <w:t>FuseauHoraireTest, NotificationModelesEcranTest (écran e-mail ↔ NotificationContenu), tests des destinataires, écran Maintenance sur 503 ; Pest 599, Vitest 135.</w:t>
             </w:r>
           </w:p>
         </w:tc>
@@ -17940,7 +17940,7 @@
                 <w:b w:val="0"/>
                 <w:sz w:val="19"/>
               </w:rPr>
-              <w:t>133 tests</w:t>
+              <w:t>135 tests</w:t>
             </w:r>
           </w:p>
         </w:tc>

</xml_diff>

<commit_message>
fix : part d'avance de la mission sur l'écran de l'état et la génération ; thème vert confirmé
L'écran d'un état de paiement et le sélecteur de tranche de la génération
affichaient la part courante, même pour une mission retranscrite avec une
autre part (montants justes, pourcentage faux). Mission::partAvanceReelle()
tire la part des OM (hors rejetés/annulés et OM amendés à avance engagée,
règle de libellesRepartition), exposée en part_avance sur l'état, le
récapitulatif et l'aperçu d'un lot ; repli sur le réglage si exonérée.

Chaîne des montants vérifiée à 55 % (ChaineMontantsPartAvanceTest) : OM,
versements, états des avances et des reliquats, aperçus MTN/Moov, puis
réglage changé sans effet sur la mission.

Règle n° 6 tranchée : l'app de gestion reste au vert ANaTT ; couleurs
app.primary / app.sidebar, inutilisées, retirées de tailwind.config.js.

Co-Authored-By: Claude Opus 5.5 <noreply@anthropic.com>
Claude-Session: https://claude.ai/code/session_01MUfkbbz4qHVd6KNyyZzHX8
</commit_message>
<xml_diff>
--- a/docs/ANaTT_Documentation_Technique_Fonctionnelle.docx
+++ b/docs/ANaTT_Documentation_Technique_Fonctionnelle.docx
@@ -17878,7 +17878,7 @@
                 <w:b w:val="0"/>
                 <w:sz w:val="19"/>
               </w:rPr>
-              <w:t>599 tests au total (70 fichiers)</w:t>
+              <w:t>606 tests au total (72 fichiers)</w:t>
             </w:r>
           </w:p>
         </w:tc>
@@ -17940,7 +17940,7 @@
                 <w:b w:val="0"/>
                 <w:sz w:val="19"/>
               </w:rPr>
-              <w:t>135 tests</w:t>
+              <w:t>139 tests</w:t>
             </w:r>
           </w:p>
         </w:tc>

</xml_diff>

<commit_message>
docs : mise à jour finale pour les réglages appliqués, les écrans testés et le contrat OpenAPI
CHANGELOG ; CLAUDE.md (§1, §5 ADM-04, §7 réglages et route publique) ;
AGENTS.md ; README et compteurs (Pest 652 / 74 fichiers, Vitest 194) ;
DEPLOY-CPANEL.md (note de version, précaution HTTPS, dépannage) ;
checklist §06 ; workflows par profil et RBAC (notifications coupables) ;
revue (#175, #176, dette levée) ; guide utilisateur et documentation
technique régénérés ; galerie des écrans recapturée.

Co-Authored-By: Claude Opus 5.5 <noreply@anthropic.com>
Claude-Session: https://claude.ai/code/session_01MUfkbbz4qHVd6KNyyZzHX8
</commit_message>
<xml_diff>
--- a/docs/ANaTT_Documentation_Technique_Fonctionnelle.docx
+++ b/docs/ANaTT_Documentation_Technique_Fonctionnelle.docx
@@ -592,6 +592,194 @@
                 <w:sz w:val="19"/>
               </w:rPr>
               <w:t>FuseauHoraireTest, NotificationModelesEcranTest (écran e-mail ↔ NotificationContenu), tests des destinataires, écran Maintenance sur 503 ; Pest 599, Vitest 135.</w:t>
+            </w:r>
+          </w:p>
+        </w:tc>
+        <w:tc>
+          <w:tcPr>
+            <w:tcW w:type="dxa" w:w="1474"/>
+          </w:tcPr>
+          <w:p>
+            <w:r/>
+            <w:r>
+              <w:rPr>
+                <w:b w:val="0"/>
+                <w:sz w:val="19"/>
+              </w:rPr>
+              <w:t>§10</w:t>
+            </w:r>
+          </w:p>
+        </w:tc>
+      </w:tr>
+      <w:tr>
+        <w:tc>
+          <w:tcPr>
+            <w:tcW w:type="dxa" w:w="2041"/>
+          </w:tcPr>
+          <w:p>
+            <w:r/>
+            <w:r>
+              <w:rPr>
+                <w:b w:val="0"/>
+                <w:sz w:val="19"/>
+              </w:rPr>
+              <w:t>Part de la mission (27/10)</w:t>
+            </w:r>
+          </w:p>
+        </w:tc>
+        <w:tc>
+          <w:tcPr>
+            <w:tcW w:type="dxa" w:w="6009"/>
+          </w:tcPr>
+          <w:p>
+            <w:r/>
+            <w:r>
+              <w:rPr>
+                <w:b w:val="0"/>
+                <w:sz w:val="19"/>
+              </w:rPr>
+              <w:t>Mission::partAvanceReelle (Σ avances / Σ montants des OM, hors rejetés, annulés et amendés à avance engagée), exposée en part_avance (état, récapitulatif, aperçu d'un lot) : l'écran de l'état et le choix de la tranche affichent la part des OM, pas le réglage du jour. Chaîne des montants vérifiée à 55 %.</w:t>
+            </w:r>
+          </w:p>
+        </w:tc>
+        <w:tc>
+          <w:tcPr>
+            <w:tcW w:type="dxa" w:w="1474"/>
+          </w:tcPr>
+          <w:p>
+            <w:r/>
+            <w:r>
+              <w:rPr>
+                <w:b w:val="0"/>
+                <w:sz w:val="19"/>
+              </w:rPr>
+              <w:t>§5</w:t>
+            </w:r>
+          </w:p>
+        </w:tc>
+      </w:tr>
+      <w:tr>
+        <w:tc>
+          <w:tcPr>
+            <w:tcW w:type="dxa" w:w="2041"/>
+          </w:tcPr>
+          <w:p>
+            <w:r/>
+            <w:r>
+              <w:rPr>
+                <w:b w:val="0"/>
+                <w:sz w:val="19"/>
+              </w:rPr>
+              <w:t>Réglages de Paramètres (28/10)</w:t>
+            </w:r>
+          </w:p>
+        </w:tc>
+        <w:tc>
+          <w:tcPr>
+            <w:tcW w:type="dxa" w:w="6009"/>
+          </w:tcPr>
+          <w:p>
+            <w:r/>
+            <w:r>
+              <w:rPr>
+                <w:b w:val="0"/>
+                <w:sz w:val="19"/>
+              </w:rPr>
+              <w:t>Appliqués par le serveur (App\Support\Parametres, cache 60 s, absents = comportement d'avant, 422 hors domaine) : opérateurs MTN / Moov (génération refusée), tentatives de connexion (limiteur login), durée de session (callback Sanctum, remplace SANCTUM_EXPIRATION), HTTPS forcé (middleware ForcerHttps), connexions échouées journalisées (LOGIN_ECHEC), mode maintenance (middleware MaintenanceApplication : 503 sauf SUPER_ADMIN), notifications par type, nom de l'application (route publique GET /admin/parametres/application, titre de l'onglet, objet des e-mails).</w:t>
+            </w:r>
+          </w:p>
+        </w:tc>
+        <w:tc>
+          <w:tcPr>
+            <w:tcW w:type="dxa" w:w="1474"/>
+          </w:tcPr>
+          <w:p>
+            <w:r/>
+            <w:r>
+              <w:rPr>
+                <w:b w:val="0"/>
+                <w:sz w:val="19"/>
+              </w:rPr>
+              <w:t>§6, §7</w:t>
+            </w:r>
+          </w:p>
+        </w:tc>
+      </w:tr>
+      <w:tr>
+        <w:tc>
+          <w:tcPr>
+            <w:tcW w:type="dxa" w:w="2041"/>
+          </w:tcPr>
+          <w:p>
+            <w:r/>
+            <w:r>
+              <w:rPr>
+                <w:b w:val="0"/>
+                <w:sz w:val="19"/>
+              </w:rPr>
+              <w:t>Contrat d'API (28/10)</w:t>
+            </w:r>
+          </w:p>
+        </w:tc>
+        <w:tc>
+          <w:tcPr>
+            <w:tcW w:type="dxa" w:w="6009"/>
+          </w:tcPr>
+          <w:p>
+            <w:r/>
+            <w:r>
+              <w:rPr>
+                <w:b w:val="0"/>
+                <w:sz w:val="19"/>
+              </w:rPr>
+              <w:t>OpenApiReponsesTest : réponses réelles d'une trentaine de routes validées contre openapi.yaml en mode strict (validateur tests/Support/OpenApiSchema.php, sans dépendance) ; openapi.yaml complété (pagination, régularisations, LignePerDiem, Signataire, enveloppe message).</w:t>
+            </w:r>
+          </w:p>
+        </w:tc>
+        <w:tc>
+          <w:tcPr>
+            <w:tcW w:type="dxa" w:w="1474"/>
+          </w:tcPr>
+          <w:p>
+            <w:r/>
+            <w:r>
+              <w:rPr>
+                <w:b w:val="0"/>
+                <w:sz w:val="19"/>
+              </w:rPr>
+              <w:t>§7, §10</w:t>
+            </w:r>
+          </w:p>
+        </w:tc>
+      </w:tr>
+      <w:tr>
+        <w:tc>
+          <w:tcPr>
+            <w:tcW w:type="dxa" w:w="2041"/>
+          </w:tcPr>
+          <w:p>
+            <w:r/>
+            <w:r>
+              <w:rPr>
+                <w:b w:val="0"/>
+                <w:sz w:val="19"/>
+              </w:rPr>
+              <w:t>Tests (28/10)</w:t>
+            </w:r>
+          </w:p>
+        </w:tc>
+        <w:tc>
+          <w:tcPr>
+            <w:tcW w:type="dxa" w:w="6009"/>
+          </w:tcPr>
+          <w:p>
+            <w:r/>
+            <w:r>
+              <w:rPr>
+                <w:b w:val="0"/>
+                <w:sz w:val="19"/>
+              </w:rPr>
+              <w:t>45 tests des écrans critiques (saisie de mission, état, signatures, matrice des permissions) ; agent en double signalé dès la saisie ; message français sur un 429. Pest 652, Vitest 194.</w:t>
             </w:r>
           </w:p>
         </w:tc>
@@ -17878,7 +18066,7 @@
                 <w:b w:val="0"/>
                 <w:sz w:val="19"/>
               </w:rPr>
-              <w:t>606 tests au total (72 fichiers)</w:t>
+              <w:t>652 tests au total (74 fichiers)</w:t>
             </w:r>
           </w:p>
         </w:tc>
@@ -17940,7 +18128,7 @@
                 <w:b w:val="0"/>
                 <w:sz w:val="19"/>
               </w:rPr>
-              <w:t>139 tests</w:t>
+              <w:t>194 tests</w:t>
             </w:r>
           </w:p>
         </w:tc>
@@ -18076,7 +18264,7 @@
         <w:pStyle w:val="ListBullet"/>
       </w:pPr>
       <w:r>
-        <w:t>Garde-fous croisés : RoutesPermissionsTest (aucune route API sans permission), OpenApiTest (openapi.yaml ↔ routes ↔ permissions), NotificationModelesEcranTest (écran Configuration e-mail ↔ NotificationContenu) et navigation.spec.ts (menu ↔ routes ↔ API cohérents).</w:t>
+        <w:t>Garde-fous croisés : RoutesPermissionsTest (aucune route API sans permission), OpenApiTest (openapi.yaml ↔ routes ↔ permissions), OpenApiReponsesTest (réponses réelles ↔ schémas d'openapi.yaml, mode strict), NotificationModelesEcranTest (utils/notifications.ts ↔ NotificationContenu, utilisé par les écrans e-mail et Paramètres), ReglagesExploitationTest (chaque réglage de Paramètres appliqué) et navigation.spec.ts (menu ↔ routes ↔ API cohérents).</w:t>
       </w:r>
     </w:p>
     <w:p>
@@ -18092,7 +18280,7 @@
         <w:pStyle w:val="ListBullet"/>
       </w:pPr>
       <w:r>
-        <w:t>Recette sur l'API réelle (23/10/2026, base SQLite neuve, QUEUE_CONNECTION=sync) : 83/83 contrôles conformes ; scénario de démonstration (docs/SCENARIO-DEMO.md) rejoué, conforme, puis de nouveau le 27/10 en version 1.4 (mêmes fichiers et montants, notifications de chaque signataire). Le 25/10, réponses réelles de l'API confrontées aux schémas d'openapi.yaml (openapi-core) : conformes après le n° 32.</w:t>
+        <w:t>Recette sur l'API réelle (23/10/2026, base SQLite neuve, QUEUE_CONNECTION=sync) : 83/83 contrôles conformes ; scénario de démonstration (docs/SCENARIO-DEMO.md) rejoué, conforme, puis de nouveau le 27/10 en version 1.4 (mêmes fichiers et montants, notifications de chaque signataire). Le 25/10, réponses réelles de l'API confrontées aux schémas d'openapi.yaml (openapi-core) : conformes après le n° 32 ; vérification automatisée en CI depuis le 28/10 (OpenApiReponsesTest).</w:t>
       </w:r>
     </w:p>
     <w:p>

</xml_diff>

<commit_message>
SPA : une erreur passagère ne déconnecte plus au rechargement
fetchUser() appelait logout() sur toute erreur de /auth/me : un 429
(limite de 60 requêtes/min), un 500 ou une coupure réseau au
rechargement d'une page déconnectait l'utilisateur, et logout()
révoquait son jeton côté serveur — la session était perdue pour de bon.

- seul un 401 (jeton expiré ou révoqué) met fin à la session ;
- sinon fetchUser() relance l'erreur sans toucher au jeton, et le garde
  de navigation ouvre l'écran d'erreur (503 : écran Maintenance) en
  gardant la page demandée ;
- « Réessayer » de l'écran 500 revient à cette page (chemin interne
  seulement) au lieu de recharger /500 ; accents rétablis.

Tests : session-erreur-passagere.spec.ts (8, vus en échec avant) ;
Vitest 205, Playwright 3. CLAUDE.md, CHANGELOG, README et documentation
technique mis à jour.

Co-Authored-By: Claude Opus 5.5 <noreply@anthropic.com>
Claude-Session: https://claude.ai/code/session_01MUfkbbz4qHVd6KNyyZzHX8
</commit_message>
<xml_diff>
--- a/docs/ANaTT_Documentation_Technique_Fonctionnelle.docx
+++ b/docs/ANaTT_Documentation_Technique_Fonctionnelle.docx
@@ -842,6 +842,53 @@
                 <w:sz w:val="19"/>
               </w:rPr>
               <w:t>§6, §7</w:t>
+            </w:r>
+          </w:p>
+        </w:tc>
+      </w:tr>
+      <w:tr>
+        <w:tc>
+          <w:tcPr>
+            <w:tcW w:type="dxa" w:w="2041"/>
+          </w:tcPr>
+          <w:p>
+            <w:r/>
+            <w:r>
+              <w:rPr>
+                <w:b w:val="0"/>
+                <w:sz w:val="19"/>
+              </w:rPr>
+              <w:t>Session (28/10)</w:t>
+            </w:r>
+          </w:p>
+        </w:tc>
+        <w:tc>
+          <w:tcPr>
+            <w:tcW w:type="dxa" w:w="6009"/>
+          </w:tcPr>
+          <w:p>
+            <w:r/>
+            <w:r>
+              <w:rPr>
+                <w:b w:val="0"/>
+                <w:sz w:val="19"/>
+              </w:rPr>
+              <w:t>Une erreur passagère de l'API au rechargement (429, 5xx, réseau) ne déconnecte plus : le jeton est gardé et l'écran d'erreur revient à la page demandée ; seul un 401 met fin à la session. Vitest 205.</w:t>
+            </w:r>
+          </w:p>
+        </w:tc>
+        <w:tc>
+          <w:tcPr>
+            <w:tcW w:type="dxa" w:w="1474"/>
+          </w:tcPr>
+          <w:p>
+            <w:r/>
+            <w:r>
+              <w:rPr>
+                <w:b w:val="0"/>
+                <w:sz w:val="19"/>
+              </w:rPr>
+              <w:t>§6</w:t>
             </w:r>
           </w:p>
         </w:tc>
@@ -18175,7 +18222,7 @@
                 <w:b w:val="0"/>
                 <w:sz w:val="19"/>
               </w:rPr>
-              <w:t>197 tests</w:t>
+              <w:t>205 tests</w:t>
             </w:r>
           </w:p>
         </w:tc>

</xml_diff>

<commit_message>
Documentation technique : session, messagerie, réponses 422 et 503
- §3.1 : session restaurée au rechargement, seul un 401 y met fin ;
- §6.3 : secret SMTP déchiffré seulement à l'envoi (APP_KEY changée :
  à ressaisir) ; session conservée sur erreur passagère ;
- §7.5 : routes settings/test-email et parametres/application ;
- §7.6 : forme des 422 (message générique + errors, dont l'écran affiche
  le motif) et code 503 (artisan down, mode maintenance) ;
- §10 : variantes messagerie et maintenance rejouées le 28/10 ;
- évolutions 1.4 : ligne « Messagerie, refus ».

.docx régénéré ; CHANGELOG mis à jour.

Co-Authored-By: Claude Opus 5.5 <noreply@anthropic.com>
Claude-Session: https://claude.ai/code/session_01MUfkbbz4qHVd6KNyyZzHX8
</commit_message>
<xml_diff>
--- a/docs/ANaTT_Documentation_Technique_Fonctionnelle.docx
+++ b/docs/ANaTT_Documentation_Technique_Fonctionnelle.docx
@@ -893,6 +893,53 @@
           </w:p>
         </w:tc>
       </w:tr>
+      <w:tr>
+        <w:tc>
+          <w:tcPr>
+            <w:tcW w:type="dxa" w:w="2041"/>
+          </w:tcPr>
+          <w:p>
+            <w:r/>
+            <w:r>
+              <w:rPr>
+                <w:b w:val="0"/>
+                <w:sz w:val="19"/>
+              </w:rPr>
+              <w:t>Messagerie, refus (28/10)</w:t>
+            </w:r>
+          </w:p>
+        </w:tc>
+        <w:tc>
+          <w:tcPr>
+            <w:tcW w:type="dxa" w:w="6009"/>
+          </w:tcPr>
+          <w:p>
+            <w:r/>
+            <w:r>
+              <w:rPr>
+                <w:b w:val="0"/>
+                <w:sz w:val="19"/>
+              </w:rPr>
+              <w:t>L'écran Messagerie affiche le motif d'un refus 422 (champ errors : port invalide, message du serveur SMTP) et non plus le message générique « Donnees invalides. ». Scénario de démo complété (§8.6 messagerie, §8.7 maintenance), rejoué sur l'API réelle.</w:t>
+            </w:r>
+          </w:p>
+        </w:tc>
+        <w:tc>
+          <w:tcPr>
+            <w:tcW w:type="dxa" w:w="1474"/>
+          </w:tcPr>
+          <w:p>
+            <w:r/>
+            <w:r>
+              <w:rPr>
+                <w:b w:val="0"/>
+                <w:sz w:val="19"/>
+              </w:rPr>
+              <w:t>§7.6, §10</w:t>
+            </w:r>
+          </w:p>
+        </w:tc>
+      </w:tr>
     </w:tbl>
     <w:p/>
     <w:p>
@@ -6458,6 +6505,15 @@
       </w:pPr>
       <w:r>
         <w:t>AUTH-03 — Réinitialisation : nouveau mot de passe via token.</w:t>
+      </w:r>
+    </w:p>
+    <w:p>
+      <w:r>
+        <w:rPr>
+          <w:b w:val="0"/>
+          <w:i w:val="0"/>
+        </w:rPr>
+        <w:t>Session restaurée au rechargement d'une page (stores/auth.ts → fetchUser, garde du routeur) : seul un 401 (jeton expiré ou révoqué) y met fin. Une erreur passagère de /auth/me (429, 5xx, réseau) garde le jeton et ouvre l'écran 500, dont « Réessayer » revient à la page demandée (chemin interne seulement) ; un 503 ouvre l'écran Maintenance. Avant le 28/10, toute erreur déconnectait et révoquait le jeton côté serveur.</w:t>
       </w:r>
     </w:p>
     <w:p>
@@ -13312,7 +13368,15 @@
         <w:pStyle w:val="ListBullet"/>
       </w:pPr>
       <w:r>
-        <w:t>Secret SMTP chiffré au repos et jamais réaffiché en clair (masque ********).</w:t>
+        <w:t>Secret SMTP chiffré au repos et jamais réaffiché en clair (masque ********) ; déchiffré seulement au moment d'envoyer (App\Support\Messagerie). Une APP_KEY changée le rend indéchiffrable : il est alors à ressaisir.</w:t>
+      </w:r>
+    </w:p>
+    <w:p>
+      <w:pPr>
+        <w:pStyle w:val="ListBullet"/>
+      </w:pPr>
+      <w:r>
+        <w:t>Session : seul un 401 met fin à une session restaurée ; une erreur passagère ne révoque plus le jeton (§3.1).</w:t>
       </w:r>
     </w:p>
     <w:p>
@@ -16198,7 +16262,7 @@
                 <w:b w:val="0"/>
                 <w:sz w:val="19"/>
               </w:rPr>
-              <w:t>—</w:t>
+              <w:t>GET / PUT</w:t>
             </w:r>
           </w:p>
         </w:tc>
@@ -16228,7 +16292,101 @@
                 <w:b w:val="0"/>
                 <w:sz w:val="19"/>
               </w:rPr>
-              <w:t>Paramètres système (parametres.gerer)</w:t>
+              <w:t>Paramètres système, liste blanche, valeurs validées (422 hors domaine) (parametres.gerer)</w:t>
+            </w:r>
+          </w:p>
+        </w:tc>
+      </w:tr>
+      <w:tr>
+        <w:tc>
+          <w:tcPr>
+            <w:tcW w:type="dxa" w:w="1361"/>
+          </w:tcPr>
+          <w:p>
+            <w:r/>
+            <w:r>
+              <w:rPr>
+                <w:b w:val="0"/>
+                <w:sz w:val="19"/>
+              </w:rPr>
+              <w:t>POST</w:t>
+            </w:r>
+          </w:p>
+        </w:tc>
+        <w:tc>
+          <w:tcPr>
+            <w:tcW w:type="dxa" w:w="4535"/>
+          </w:tcPr>
+          <w:p>
+            <w:r/>
+            <w:r>
+              <w:rPr>
+                <w:b w:val="0"/>
+                <w:sz w:val="19"/>
+              </w:rPr>
+              <w:t>/api/admin/settings/test-email</w:t>
+            </w:r>
+          </w:p>
+        </w:tc>
+        <w:tc>
+          <w:tcPr>
+            <w:tcW w:type="dxa" w:w="3628"/>
+          </w:tcPr>
+          <w:p>
+            <w:r/>
+            <w:r>
+              <w:rPr>
+                <w:b w:val="0"/>
+                <w:sz w:val="19"/>
+              </w:rPr>
+              <w:t>E-mail de test au compte connecté avec la configuration enregistrée ; 422 (champ smtpHost) avec le message du serveur SMTP en cas d'échec (parametres.gerer)</w:t>
+            </w:r>
+          </w:p>
+        </w:tc>
+      </w:tr>
+      <w:tr>
+        <w:tc>
+          <w:tcPr>
+            <w:tcW w:type="dxa" w:w="1361"/>
+          </w:tcPr>
+          <w:p>
+            <w:r/>
+            <w:r>
+              <w:rPr>
+                <w:b w:val="0"/>
+                <w:sz w:val="19"/>
+              </w:rPr>
+              <w:t>GET</w:t>
+            </w:r>
+          </w:p>
+        </w:tc>
+        <w:tc>
+          <w:tcPr>
+            <w:tcW w:type="dxa" w:w="4535"/>
+          </w:tcPr>
+          <w:p>
+            <w:r/>
+            <w:r>
+              <w:rPr>
+                <w:b w:val="0"/>
+                <w:sz w:val="19"/>
+              </w:rPr>
+              <w:t>/api/admin/parametres/application</w:t>
+            </w:r>
+          </w:p>
+        </w:tc>
+        <w:tc>
+          <w:tcPr>
+            <w:tcW w:type="dxa" w:w="3628"/>
+          </w:tcPr>
+          <w:p>
+            <w:r/>
+            <w:r>
+              <w:rPr>
+                <w:b w:val="0"/>
+                <w:sz w:val="19"/>
+              </w:rPr>
+              <w:t>Nom de l'application et opérateurs ouverts (lecture publique)</w:t>
             </w:r>
           </w:p>
         </w:tc>
@@ -16586,7 +16744,7 @@
                 <w:b w:val="0"/>
                 <w:sz w:val="19"/>
               </w:rPr>
-              <w:t>Champ requis manquant, données invalides</w:t>
+              <w:t>Champ requis manquant, données invalides. Corps : message générique « Donnees invalides. » + errors { champ: [motif] } — l'écran affiche le motif</w:t>
             </w:r>
           </w:p>
         </w:tc>
@@ -16728,6 +16886,53 @@
                 <w:sz w:val="19"/>
               </w:rPr>
               <w:t>Erreur interne inattendue</w:t>
+            </w:r>
+          </w:p>
+        </w:tc>
+      </w:tr>
+      <w:tr>
+        <w:tc>
+          <w:tcPr>
+            <w:tcW w:type="dxa" w:w="1814"/>
+          </w:tcPr>
+          <w:p>
+            <w:r/>
+            <w:r>
+              <w:rPr>
+                <w:b w:val="0"/>
+                <w:sz w:val="19"/>
+              </w:rPr>
+              <w:t>503</w:t>
+            </w:r>
+          </w:p>
+        </w:tc>
+        <w:tc>
+          <w:tcPr>
+            <w:tcW w:type="dxa" w:w="2948"/>
+          </w:tcPr>
+          <w:p>
+            <w:r/>
+            <w:r>
+              <w:rPr>
+                <w:b w:val="0"/>
+                <w:sz w:val="19"/>
+              </w:rPr>
+              <w:t>Service indisponible</w:t>
+            </w:r>
+          </w:p>
+        </w:tc>
+        <w:tc>
+          <w:tcPr>
+            <w:tcW w:type="dxa" w:w="4762"/>
+          </w:tcPr>
+          <w:p>
+            <w:r/>
+            <w:r>
+              <w:rPr>
+                <w:b w:val="0"/>
+                <w:sz w:val="19"/>
+              </w:rPr>
+              <w:t>artisan down (mise à jour) ou mode maintenance de Paramètres (sauf SUPER_ADMIN) ; le SPA ouvre l'écran Maintenance</w:t>
             </w:r>
           </w:p>
         </w:tc>
@@ -18374,7 +18579,7 @@
         <w:pStyle w:val="ListBullet"/>
       </w:pPr>
       <w:r>
-        <w:t>Recette sur l'API réelle (23/10/2026, base SQLite neuve, QUEUE_CONNECTION=sync) : 83/83 contrôles conformes ; scénario de démonstration (docs/SCENARIO-DEMO.md) rejoué, conforme, puis de nouveau le 27/10 en version 1.4 (mêmes fichiers et montants, notifications de chaque signataire). Le 25/10, réponses réelles de l'API confrontées aux schémas d'openapi.yaml (openapi-core) : conformes après le n° 32 ; vérification automatisée en CI depuis le 28/10 (OpenApiReponsesTest).</w:t>
+        <w:t>Recette sur l'API réelle (23/10/2026, base SQLite neuve, QUEUE_CONNECTION=sync) : 83/83 contrôles conformes ; scénario de démonstration (docs/SCENARIO-DEMO.md) rejoué, conforme, puis de nouveau le 27/10 en version 1.4 (mêmes fichiers et montants, notifications de chaque signataire). Le 25/10, réponses réelles de l'API confrontées aux schémas d'openapi.yaml (openapi-core) : conformes après le n° 32 ; vérification automatisée en CI depuis le 28/10 (OpenApiReponsesTest). Le 28/10, variantes messagerie et maintenance du scénario rejouées sur l'API réelle (MariaDB, base neuve) : elles ont révélé l'affichage du message générique des 422 à l'écran Messagerie, corrigé.</w:t>
       </w:r>
     </w:p>
     <w:p>

</xml_diff>

<commit_message>
Mise à jour finale de la documentation ; point du restant ; motif d'une réinitialisation refusée
Écart corrigé (n° 47) : sur la Matrice des permissions, une réinitialisation
de profil refusée (séparation ordonnateur/payeur) affichait « La
réinitialisation a échoué. » sans le motif ; RolesView le reprend comme ses
autres actions. Test roles-matrice.spec.ts (vu en échec avant) ; Vitest 211.

Guide utilisateur (§3.5 « Quand une action est refusée ») et documentation
technique régénérés ; docs/revue-projet-2026-10.md §8 : défauts n° 33 à 47,
état des documents, gestes d'exploitation, dette connue. DEPLOY-CPANEL,
runbook, checklist, CLAUDE.md, AGENTS.md, README, workflows par profil,
scénario de démo : motif de tout refus, en français (resources/lang/fr).

Co-Authored-By: Claude Opus 5.5 <noreply@anthropic.com>
Claude-Session: https://claude.ai/code/session_01MUfkbbz4qHVd6KNyyZzHX8
</commit_message>
<xml_diff>
--- a/docs/ANaTT_Documentation_Technique_Fonctionnelle.docx
+++ b/docs/ANaTT_Documentation_Technique_Fonctionnelle.docx
@@ -204,7 +204,7 @@
         <w:pStyle w:val="Heading1"/>
       </w:pPr>
       <w:r>
-        <w:t>Évolutions de la version 1.4 (26-27 octobre 2026)</w:t>
+        <w:t>Évolutions de la version 1.4 (26-28 octobre 2026)</w:t>
       </w:r>
     </w:p>
     <w:p>
@@ -983,6 +983,100 @@
                 <w:sz w:val="19"/>
               </w:rPr>
               <w:t>§7.6, §10</w:t>
+            </w:r>
+          </w:p>
+        </w:tc>
+      </w:tr>
+      <w:tr>
+        <w:tc>
+          <w:tcPr>
+            <w:tcW w:type="dxa" w:w="2041"/>
+          </w:tcPr>
+          <w:p>
+            <w:r/>
+            <w:r>
+              <w:rPr>
+                <w:b w:val="0"/>
+                <w:sz w:val="19"/>
+              </w:rPr>
+              <w:t>Refus expliqués (28/10)</w:t>
+            </w:r>
+          </w:p>
+        </w:tc>
+        <w:tc>
+          <w:tcPr>
+            <w:tcW w:type="dxa" w:w="6009"/>
+          </w:tcPr>
+          <w:p>
+            <w:r/>
+            <w:r>
+              <w:rPr>
+                <w:b w:val="0"/>
+                <w:sz w:val="19"/>
+              </w:rPr>
+              <w:t>getErrorMessage et l'intercepteur Axios d'un 422 donnent le premier motif de errors, sur tous les écrans (séparation des tâches, numéro d'état, gardes de l'amendement…), au lieu de « Donnees invalides. » affiché deux fois ; useToast n'empile plus un message identique. refus-motif.spec.ts.</w:t>
+            </w:r>
+          </w:p>
+        </w:tc>
+        <w:tc>
+          <w:tcPr>
+            <w:tcW w:type="dxa" w:w="1474"/>
+          </w:tcPr>
+          <w:p>
+            <w:r/>
+            <w:r>
+              <w:rPr>
+                <w:b w:val="0"/>
+                <w:sz w:val="19"/>
+              </w:rPr>
+              <w:t>§7.6</w:t>
+            </w:r>
+          </w:p>
+        </w:tc>
+      </w:tr>
+      <w:tr>
+        <w:tc>
+          <w:tcPr>
+            <w:tcW w:type="dxa" w:w="2041"/>
+          </w:tcPr>
+          <w:p>
+            <w:r/>
+            <w:r>
+              <w:rPr>
+                <w:b w:val="0"/>
+                <w:sz w:val="19"/>
+              </w:rPr>
+              <w:t>Messages de validation (28/10)</w:t>
+            </w:r>
+          </w:p>
+        </w:tc>
+        <w:tc>
+          <w:tcPr>
+            <w:tcW w:type="dxa" w:w="6009"/>
+          </w:tcPr>
+          <w:p>
+            <w:r/>
+            <w:r>
+              <w:rPr>
+                <w:b w:val="0"/>
+                <w:sz w:val="19"/>
+              </w:rPr>
+              <w:t>resources/lang/fr/validation.php : en production (APP_LOCALE=fr, APP_FALLBACK_LOCALE=fr), une règle générique renvoyait sa clé brute (« validation.unique »). Messages et noms de champs en français, déployés avec resources/. ValidationFrancaisTest (19 tests). Pest 690, Vitest 210 (211 le 29/10).</w:t>
+            </w:r>
+          </w:p>
+        </w:tc>
+        <w:tc>
+          <w:tcPr>
+            <w:tcW w:type="dxa" w:w="1474"/>
+          </w:tcPr>
+          <w:p>
+            <w:r/>
+            <w:r>
+              <w:rPr>
+                <w:b w:val="0"/>
+                <w:sz w:val="19"/>
+              </w:rPr>
+              <w:t>§7.6, §9.6</w:t>
             </w:r>
           </w:p>
         </w:tc>
@@ -16791,7 +16885,7 @@
                 <w:b w:val="0"/>
                 <w:sz w:val="19"/>
               </w:rPr>
-              <w:t>Champ requis manquant, données invalides. Corps : message générique « Donnees invalides. » + errors { champ: [motif] } — l'écran affiche le motif</w:t>
+              <w:t>Champ requis manquant, données invalides. Corps : message générique « Donnees invalides. » + errors { champ: [motif] }, motifs en français (resources/lang/fr) — l'écran affiche le premier motif (getErrorMessage)</w:t>
             </w:r>
           </w:p>
         </w:tc>
@@ -18203,6 +18297,14 @@
     </w:p>
     <w:p>
       <w:pPr>
+        <w:pStyle w:val="ListBullet"/>
+      </w:pPr>
+      <w:r>
+        <w:t>Correctifs des 27-29/10 (n° 33 à 47) : code seul, aucune migration de plus. Relire storage/app/settings.json avant l'envoi du code : les réglages de Paramètres et de Messagerie qu'il contient s'appliquent dès lors. Le nouveau fichier resources/lang/fr/validation.php part avec resources/, déjà envoyé à chaque mise à jour.</w:t>
+      </w:r>
+    </w:p>
+    <w:p>
+      <w:pPr>
         <w:pStyle w:val="Heading1"/>
       </w:pPr>
       <w:r>
@@ -18412,7 +18514,7 @@
                 <w:b w:val="0"/>
                 <w:sz w:val="19"/>
               </w:rPr>
-              <w:t>671 tests au total (75 fichiers)</w:t>
+              <w:t>690 tests au total (76 fichiers)</w:t>
             </w:r>
           </w:p>
         </w:tc>
@@ -18474,7 +18576,7 @@
                 <w:b w:val="0"/>
                 <w:sz w:val="19"/>
               </w:rPr>
-              <w:t>206 tests</w:t>
+              <w:t>211 tests</w:t>
             </w:r>
           </w:p>
         </w:tc>
@@ -18634,7 +18736,7 @@
         <w:pStyle w:val="ListBullet"/>
       </w:pPr>
       <w:r>
-        <w:t>Défauts relevés par la revue d'octobre 2026 : 32, tous corrigés avec un test vu en échec sans le correctif (index : CHANGELOG.md ; détail : docs/revue-projet-2026-10.md §3). Les quatre décisions du §7.1 sont appliquées depuis la 1.4.</w:t>
+        <w:t>Défauts relevés par la revue d'octobre 2026 : 32, puis 15 de plus du 27 au 29/10 (n° 33 à 47, en confrontant la documentation au code et à l'interface), tous corrigés avec un test vu en échec sans le correctif (index : CHANGELOG.md ; détail : docs/revue-projet-2026-10.md §3 et §8). Les quatre décisions du §7.1 sont appliquées depuis la 1.4.</w:t>
       </w:r>
     </w:p>
     <w:p>

</xml_diff>

<commit_message>
Galerie des écrans recapturée ; textes accentués ; icônes de la page 404
Écarts corrigés, relevés à la recapture :
- n° 48 : textes sans accents sur douze écrans (pages 403, 404, 500,
  maintenance, connexion, mot de passe oublié, utilisateurs, sauvegardes…)
  et dans six messages de l'API (« Agent cree avec succes. »…) ;
- n° 49 : page 404, une même icône tronquée pour les trois raccourcis ;
  « Dashboard » devient « Tableau de bord » (403, 404, 500).
Tests pages-systeme.spec.ts et ValidationFrancaisTest (vus en échec avant).

Galerie recapturée (46 écrans, 53 pages) ; navigateur de capture en
LANG=fr_FR.UTF-8 (champs de date dd/mm/yyyy). Guide utilisateur et
documentation technique régénérés ; revue §8, compteurs (Pest 691, Vitest 215).

Co-Authored-By: Claude Opus 5.5 <noreply@anthropic.com>
Claude-Session: https://claude.ai/code/session_01MUfkbbz4qHVd6KNyyZzHX8
</commit_message>
<xml_diff>
--- a/docs/ANaTT_Documentation_Technique_Fonctionnelle.docx
+++ b/docs/ANaTT_Documentation_Technique_Fonctionnelle.docx
@@ -1061,7 +1061,7 @@
                 <w:b w:val="0"/>
                 <w:sz w:val="19"/>
               </w:rPr>
-              <w:t>resources/lang/fr/validation.php : en production (APP_LOCALE=fr, APP_FALLBACK_LOCALE=fr), une règle générique renvoyait sa clé brute (« validation.unique »). Messages et noms de champs en français, déployés avec resources/. ValidationFrancaisTest (19 tests). Pest 690, Vitest 210 (211 le 29/10).</w:t>
+              <w:t>resources/lang/fr/validation.php : en production (APP_LOCALE=fr, APP_FALLBACK_LOCALE=fr), une règle générique renvoyait sa clé brute (« validation.unique »). Messages et noms de champs en français, déployés avec resources/. ValidationFrancaisTest (19 tests). Pest 690, Vitest 210 (691 / 215 le 29/10).</w:t>
             </w:r>
           </w:p>
         </w:tc>
@@ -18300,7 +18300,7 @@
         <w:pStyle w:val="ListBullet"/>
       </w:pPr>
       <w:r>
-        <w:t>Correctifs des 27-29/10 (n° 33 à 47) : code seul, aucune migration de plus. Relire storage/app/settings.json avant l'envoi du code : les réglages de Paramètres et de Messagerie qu'il contient s'appliquent dès lors. Le nouveau fichier resources/lang/fr/validation.php part avec resources/, déjà envoyé à chaque mise à jour.</w:t>
+        <w:t>Correctifs des 27-29/10 (n° 33 à 49) : code seul, aucune migration de plus. Relire storage/app/settings.json avant l'envoi du code : les réglages de Paramètres et de Messagerie qu'il contient s'appliquent dès lors. Le nouveau fichier resources/lang/fr/validation.php part avec resources/, déjà envoyé à chaque mise à jour.</w:t>
       </w:r>
     </w:p>
     <w:p>
@@ -18514,7 +18514,7 @@
                 <w:b w:val="0"/>
                 <w:sz w:val="19"/>
               </w:rPr>
-              <w:t>690 tests au total (76 fichiers)</w:t>
+              <w:t>691 tests au total (76 fichiers)</w:t>
             </w:r>
           </w:p>
         </w:tc>
@@ -18576,7 +18576,7 @@
                 <w:b w:val="0"/>
                 <w:sz w:val="19"/>
               </w:rPr>
-              <w:t>211 tests</w:t>
+              <w:t>215 tests</w:t>
             </w:r>
           </w:p>
         </w:tc>
@@ -18736,7 +18736,7 @@
         <w:pStyle w:val="ListBullet"/>
       </w:pPr>
       <w:r>
-        <w:t>Défauts relevés par la revue d'octobre 2026 : 32, puis 15 de plus du 27 au 29/10 (n° 33 à 47, en confrontant la documentation au code et à l'interface), tous corrigés avec un test vu en échec sans le correctif (index : CHANGELOG.md ; détail : docs/revue-projet-2026-10.md §3 et §8). Les quatre décisions du §7.1 sont appliquées depuis la 1.4.</w:t>
+        <w:t>Défauts relevés par la revue d'octobre 2026 : 32, puis 17 de plus du 27 au 29/10 (n° 33 à 49, en confrontant la documentation au code et à l'interface), tous corrigés avec un test vu en échec sans le correctif (index : CHANGELOG.md ; détail : docs/revue-projet-2026-10.md §3 et §8). Les quatre décisions du §7.1 sont appliquées depuis la 1.4.</w:t>
       </w:r>
     </w:p>
     <w:p>

</xml_diff>

<commit_message>
Documentation technique finale (chapitre 11, état du projet et reste à faire) ; clôture de la revue
Co-Authored-By: Claude Opus 5.5 <noreply@anthropic.com>
Claude-Session: https://claude.ai/code/session_01MUfkbbz4qHVd6KNyyZzHX8
</commit_message>
<xml_diff>
--- a/docs/ANaTT_Documentation_Technique_Fonctionnelle.docx
+++ b/docs/ANaTT_Documentation_Technique_Fonctionnelle.docx
@@ -204,7 +204,7 @@
         <w:pStyle w:val="Heading1"/>
       </w:pPr>
       <w:r>
-        <w:t>Évolutions de la version 1.4 (26-28 octobre 2026)</w:t>
+        <w:t>Évolutions de la version 1.4 (26-29 octobre 2026)</w:t>
       </w:r>
     </w:p>
     <w:p>
@@ -1077,6 +1077,100 @@
                 <w:sz w:val="19"/>
               </w:rPr>
               <w:t>§7.6, §9.6</w:t>
+            </w:r>
+          </w:p>
+        </w:tc>
+      </w:tr>
+      <w:tr>
+        <w:tc>
+          <w:tcPr>
+            <w:tcW w:type="dxa" w:w="2041"/>
+          </w:tcPr>
+          <w:p>
+            <w:r/>
+            <w:r>
+              <w:rPr>
+                <w:b w:val="0"/>
+                <w:sz w:val="19"/>
+              </w:rPr>
+              <w:t>Textes accentués (29/10)</w:t>
+            </w:r>
+          </w:p>
+        </w:tc>
+        <w:tc>
+          <w:tcPr>
+            <w:tcW w:type="dxa" w:w="6009"/>
+          </w:tcPr>
+          <w:p>
+            <w:r/>
+            <w:r>
+              <w:rPr>
+                <w:b w:val="0"/>
+                <w:sz w:val="19"/>
+              </w:rPr>
+              <w:t>Douze écrans (pages 403, 404, 500, maintenance, connexion, mot de passe, utilisateurs, sauvegardes…) et six messages de l'API (« Agent créé avec succès. »…) rédigés sans accents (n° 48). Sur la page 404, une même icône tronquée pour les trois raccourcis et « Dashboard » en anglais (n° 49). pages-systeme.spec.ts.</w:t>
+            </w:r>
+          </w:p>
+        </w:tc>
+        <w:tc>
+          <w:tcPr>
+            <w:tcW w:type="dxa" w:w="1474"/>
+          </w:tcPr>
+          <w:p>
+            <w:r/>
+            <w:r>
+              <w:rPr>
+                <w:b w:val="0"/>
+                <w:sz w:val="19"/>
+              </w:rPr>
+              <w:t>§3, §10</w:t>
+            </w:r>
+          </w:p>
+        </w:tc>
+      </w:tr>
+      <w:tr>
+        <w:tc>
+          <w:tcPr>
+            <w:tcW w:type="dxa" w:w="2041"/>
+          </w:tcPr>
+          <w:p>
+            <w:r/>
+            <w:r>
+              <w:rPr>
+                <w:b w:val="0"/>
+                <w:sz w:val="19"/>
+              </w:rPr>
+              <w:t>Galerie et scénario (29/10)</w:t>
+            </w:r>
+          </w:p>
+        </w:tc>
+        <w:tc>
+          <w:tcPr>
+            <w:tcW w:type="dxa" w:w="6009"/>
+          </w:tcPr>
+          <w:p>
+            <w:r/>
+            <w:r>
+              <w:rPr>
+                <w:b w:val="0"/>
+                <w:sz w:val="19"/>
+              </w:rPr>
+              <w:t>Galerie recapturée (46 écrans ; navigateur de capture en LANG=fr_FR.UTF-8, dates dd/mm/yyyy) ; scénario de démonstration rejoué sur l'API réelle, montants inchangés, étape A corrigée (indice ou salaire brut exigé, catégorie déduite).</w:t>
+            </w:r>
+          </w:p>
+        </w:tc>
+        <w:tc>
+          <w:tcPr>
+            <w:tcW w:type="dxa" w:w="1474"/>
+          </w:tcPr>
+          <w:p>
+            <w:r/>
+            <w:r>
+              <w:rPr>
+                <w:b w:val="0"/>
+                <w:sz w:val="19"/>
+              </w:rPr>
+              <w:t>§10, §11</w:t>
             </w:r>
           </w:p>
         </w:tc>
@@ -6712,7 +6806,7 @@
         <w:pStyle w:val="ListBullet"/>
       </w:pPr>
       <w:r>
-        <w:t>PERS-03 — Création : la catégorie d'indice (INDICE_SUP_800 / INDICE_400_799 / INDICE_INF_400) est déduite de l'indice ou du salaire.</w:t>
+        <w:t>PERS-03 — Création : la catégorie d'indice (INDICE_SUP_800 / INDICE_400_799 / INDICE_INF_400) est déduite de l'indice ou du salaire ; l'un des deux est exigé (422 sinon : « L'indice ou le salaire brut est requis pour déterminer la catégorie. »).</w:t>
       </w:r>
     </w:p>
     <w:p>
@@ -18728,7 +18822,7 @@
         <w:pStyle w:val="ListBullet"/>
       </w:pPr>
       <w:r>
-        <w:t>Recette sur l'API réelle (23/10/2026, base SQLite neuve, QUEUE_CONNECTION=sync) : 83/83 contrôles conformes ; scénario de démonstration (docs/SCENARIO-DEMO.md) rejoué, conforme, puis de nouveau le 27/10 en version 1.4 (mêmes fichiers et montants, notifications de chaque signataire). Le 25/10, réponses réelles de l'API confrontées aux schémas d'openapi.yaml (openapi-core) : conformes après le n° 32 ; vérification automatisée en CI depuis le 28/10 (OpenApiReponsesTest). Le 28/10, variantes messagerie et maintenance du scénario rejouées sur l'API réelle (MariaDB, base neuve) : elles ont révélé l'affichage du message générique des 422 à l'écran Messagerie, corrigé.</w:t>
+        <w:t>Recette sur l'API réelle (23/10/2026, base SQLite neuve, QUEUE_CONNECTION=sync) : 83/83 contrôles conformes ; scénario de démonstration (docs/SCENARIO-DEMO.md) rejoué, conforme, puis de nouveau le 27/10 en version 1.4 (mêmes fichiers et montants, notifications de chaque signataire). Le 25/10, réponses réelles de l'API confrontées aux schémas d'openapi.yaml (openapi-core) : conformes après le n° 32 ; vérification automatisée en CI depuis le 28/10 (OpenApiReponsesTest). Le 28/10, variantes messagerie et maintenance du scénario rejouées sur l'API réelle (MariaDB, base neuve) : elles ont révélé l'affichage du message générique des 422 à l'écran Messagerie, corrigé. Le 29/10, scénario complet rejoué de nouveau (MariaDB, base neuve, QUEUE_CONNECTION=sync) : état des avances 805 000, aperçus MTN 406 000 et Moov 399 000 ; refus vérifiés avec leur motif en français (agent en double, séparation des tâches, numéro manquant).</w:t>
       </w:r>
     </w:p>
     <w:p>
@@ -18753,6 +18847,390 @@
       </w:pPr>
       <w:r>
         <w:t>CI GitHub Actions (.github/workflows) : Lint, Pest, Vitest + type-check, Playwright, build dist.</w:t>
+      </w:r>
+    </w:p>
+    <w:p>
+      <w:r>
+        <w:br w:type="page"/>
+      </w:r>
+    </w:p>
+    <w:p>
+      <w:pPr>
+        <w:pStyle w:val="Heading1"/>
+      </w:pPr>
+      <w:r>
+        <w:t>11. État du projet et reste à faire (29/10/2026)</w:t>
+      </w:r>
+    </w:p>
+    <w:p>
+      <w:r>
+        <w:rPr>
+          <w:b w:val="0"/>
+          <w:i w:val="0"/>
+        </w:rPr>
+        <w:t>Le développement est terminé : 49 défauts relevés par la revue d'octobre 2026 et la relecture des documents (n° 1 à 49), tous corrigés avec un test ; quatre décisions (D1 à D4) appliquées ; aucune décision en attente. Tous les documents sont confrontés au code (détail et cartographie : docs/revue-projet-2026-10.md §8).</w:t>
+      </w:r>
+    </w:p>
+    <w:tbl>
+      <w:tblPr>
+        <w:tblStyle w:val="TableGrid"/>
+        <w:tblW w:type="auto" w:w="0"/>
+        <w:jc w:val="center"/>
+        <w:tblLayout w:type="fixed"/>
+        <w:tblLook w:firstColumn="1" w:firstRow="1" w:lastColumn="0" w:lastRow="0" w:noHBand="0" w:noVBand="1" w:val="04A0"/>
+      </w:tblPr>
+      <w:tblGrid>
+        <w:gridCol w:w="2948"/>
+        <w:gridCol w:w="6576"/>
+      </w:tblGrid>
+      <w:tr>
+        <w:tc>
+          <w:tcPr>
+            <w:tcW w:type="dxa" w:w="2948"/>
+            <w:shd w:val="clear" w:fill="1D9E4F"/>
+          </w:tcPr>
+          <w:p>
+            <w:r/>
+            <w:r>
+              <w:rPr>
+                <w:b/>
+                <w:color w:val="FFFFFF"/>
+                <w:sz w:val="20"/>
+              </w:rPr>
+              <w:t>Indicateur</w:t>
+            </w:r>
+          </w:p>
+        </w:tc>
+        <w:tc>
+          <w:tcPr>
+            <w:tcW w:type="dxa" w:w="6576"/>
+            <w:shd w:val="clear" w:fill="1D9E4F"/>
+          </w:tcPr>
+          <w:p>
+            <w:r/>
+            <w:r>
+              <w:rPr>
+                <w:b/>
+                <w:color w:val="FFFFFF"/>
+                <w:sz w:val="20"/>
+              </w:rPr>
+              <w:t>Valeur au 29/10/2026</w:t>
+            </w:r>
+          </w:p>
+        </w:tc>
+      </w:tr>
+      <w:tr>
+        <w:tc>
+          <w:tcPr>
+            <w:tcW w:type="dxa" w:w="2948"/>
+          </w:tcPr>
+          <w:p>
+            <w:r/>
+            <w:r>
+              <w:rPr>
+                <w:b w:val="0"/>
+                <w:sz w:val="19"/>
+              </w:rPr>
+              <w:t>Tests backend (Pest)</w:t>
+            </w:r>
+          </w:p>
+        </w:tc>
+        <w:tc>
+          <w:tcPr>
+            <w:tcW w:type="dxa" w:w="6576"/>
+          </w:tcPr>
+          <w:p>
+            <w:r/>
+            <w:r>
+              <w:rPr>
+                <w:b w:val="0"/>
+                <w:sz w:val="19"/>
+              </w:rPr>
+              <w:t>691 tests, 76 fichiers — API complète sur SQLite, contrat OpenAPI vérifié</w:t>
+            </w:r>
+          </w:p>
+        </w:tc>
+      </w:tr>
+      <w:tr>
+        <w:tc>
+          <w:tcPr>
+            <w:tcW w:type="dxa" w:w="2948"/>
+          </w:tcPr>
+          <w:p>
+            <w:r/>
+            <w:r>
+              <w:rPr>
+                <w:b w:val="0"/>
+                <w:sz w:val="19"/>
+              </w:rPr>
+              <w:t>Tests frontend (Vitest)</w:t>
+            </w:r>
+          </w:p>
+        </w:tc>
+        <w:tc>
+          <w:tcPr>
+            <w:tcW w:type="dxa" w:w="6576"/>
+          </w:tcPr>
+          <w:p>
+            <w:r/>
+            <w:r>
+              <w:rPr>
+                <w:b w:val="0"/>
+                <w:sz w:val="19"/>
+              </w:rPr>
+              <w:t>215 tests, 42 fichiers — vues, services, stores, navigation ↔ permissions</w:t>
+            </w:r>
+          </w:p>
+        </w:tc>
+      </w:tr>
+      <w:tr>
+        <w:tc>
+          <w:tcPr>
+            <w:tcW w:type="dxa" w:w="2948"/>
+          </w:tcPr>
+          <w:p>
+            <w:r/>
+            <w:r>
+              <w:rPr>
+                <w:b w:val="0"/>
+                <w:sz w:val="19"/>
+              </w:rPr>
+              <w:t>Tests de bout en bout (Playwright)</w:t>
+            </w:r>
+          </w:p>
+        </w:tc>
+        <w:tc>
+          <w:tcPr>
+            <w:tcW w:type="dxa" w:w="6576"/>
+          </w:tcPr>
+          <w:p>
+            <w:r/>
+            <w:r>
+              <w:rPr>
+                <w:b w:val="0"/>
+                <w:sz w:val="19"/>
+              </w:rPr>
+              <w:t>3 parcours critiques</w:t>
+            </w:r>
+          </w:p>
+        </w:tc>
+      </w:tr>
+      <w:tr>
+        <w:tc>
+          <w:tcPr>
+            <w:tcW w:type="dxa" w:w="2948"/>
+          </w:tcPr>
+          <w:p>
+            <w:r/>
+            <w:r>
+              <w:rPr>
+                <w:b w:val="0"/>
+                <w:sz w:val="19"/>
+              </w:rPr>
+              <w:t>Scénario de démonstration</w:t>
+            </w:r>
+          </w:p>
+        </w:tc>
+        <w:tc>
+          <w:tcPr>
+            <w:tcW w:type="dxa" w:w="6576"/>
+          </w:tcPr>
+          <w:p>
+            <w:r/>
+            <w:r>
+              <w:rPr>
+                <w:b w:val="0"/>
+                <w:sz w:val="19"/>
+              </w:rPr>
+              <w:t>Rejoué sur l'API réelle le 29/10, montants et fichiers inchangés</w:t>
+            </w:r>
+          </w:p>
+        </w:tc>
+      </w:tr>
+      <w:tr>
+        <w:tc>
+          <w:tcPr>
+            <w:tcW w:type="dxa" w:w="2948"/>
+          </w:tcPr>
+          <w:p>
+            <w:r/>
+            <w:r>
+              <w:rPr>
+                <w:b w:val="0"/>
+                <w:sz w:val="19"/>
+              </w:rPr>
+              <w:t>Galerie des écrans</w:t>
+            </w:r>
+          </w:p>
+        </w:tc>
+        <w:tc>
+          <w:tcPr>
+            <w:tcW w:type="dxa" w:w="6576"/>
+          </w:tcPr>
+          <w:p>
+            <w:r/>
+            <w:r>
+              <w:rPr>
+                <w:b w:val="0"/>
+                <w:sz w:val="19"/>
+              </w:rPr>
+              <w:t>46 écrans recapturés le 29/10 ; 53 pages</w:t>
+            </w:r>
+          </w:p>
+        </w:tc>
+      </w:tr>
+      <w:tr>
+        <w:tc>
+          <w:tcPr>
+            <w:tcW w:type="dxa" w:w="2948"/>
+          </w:tcPr>
+          <w:p>
+            <w:r/>
+            <w:r>
+              <w:rPr>
+                <w:b w:val="0"/>
+                <w:sz w:val="19"/>
+              </w:rPr>
+              <w:t>Migrations à jouer en 1.4</w:t>
+            </w:r>
+          </w:p>
+        </w:tc>
+        <w:tc>
+          <w:tcPr>
+            <w:tcW w:type="dxa" w:w="6576"/>
+          </w:tcPr>
+          <w:p>
+            <w:r/>
+            <w:r>
+              <w:rPr>
+                <w:b w:val="0"/>
+                <w:sz w:val="19"/>
+              </w:rPr>
+              <w:t>Une seule (fuseau horaire), application en maintenance</w:t>
+            </w:r>
+          </w:p>
+        </w:tc>
+      </w:tr>
+    </w:tbl>
+    <w:p/>
+    <w:p>
+      <w:pPr>
+        <w:pStyle w:val="Heading2"/>
+      </w:pPr>
+      <w:r>
+        <w:t>11.1 Reste à faire — exploitation (instance en ligne)</w:t>
+      </w:r>
+    </w:p>
+    <w:p>
+      <w:pPr>
+        <w:pStyle w:val="ListBullet"/>
+      </w:pPr>
+      <w:r>
+        <w:t>Mettre à jour l'instance vers la 1.4 avec docs/runbook-mise-a-jour-cron.md (maintenance, une migration, vendor/ inchangé, SPA à redéployer ; resources/lang/fr/validation.php part avec resources/).</w:t>
+      </w:r>
+    </w:p>
+    <w:p>
+      <w:pPr>
+        <w:pStyle w:val="ListBullet"/>
+      </w:pPr>
+      <w:r>
+        <w:t>Relire storage/app/settings.json avant d'envoyer le code : ses réglages (HTTPS forcé, maintenance, serveur SMTP…) s'appliquent dès lors.</w:t>
+      </w:r>
+    </w:p>
+    <w:p>
+      <w:pPr>
+        <w:pStyle w:val="ListBullet"/>
+      </w:pPr>
+      <w:r>
+        <w:t>Contrôler avec docs/checklist-post-deploiement.md §06 (lecture seule en production, création de données en recette).</w:t>
+      </w:r>
+    </w:p>
+    <w:p>
+      <w:pPr>
+        <w:pStyle w:val="ListBullet"/>
+      </w:pPr>
+      <w:r>
+        <w:t>Vider le cache des PDF d'OM (storage/app/private/ordres/) et envoyer un e-mail de test depuis Messagerie.</w:t>
+      </w:r>
+    </w:p>
+    <w:p>
+      <w:pPr>
+        <w:pStyle w:val="ListBullet"/>
+      </w:pPr>
+      <w:r>
+        <w:t>Éprouver la restauration d'une sauvegarde sur une base MySQL de recette.</w:t>
+      </w:r>
+    </w:p>
+    <w:p>
+      <w:pPr>
+        <w:pStyle w:val="ListBullet"/>
+      </w:pPr>
+      <w:r>
+        <w:t>Sauvegarder storage/ avec la base (réglages, paraphes et fichiers produits ne sont pas dans le dump).</w:t>
+      </w:r>
+    </w:p>
+    <w:p>
+      <w:pPr>
+        <w:pStyle w:val="ListBullet"/>
+      </w:pPr>
+      <w:r>
+        <w:t>Si la file passe en QUEUE_CONNECTION=database : tâche Cron queue:work nommant les trois files.</w:t>
+      </w:r>
+    </w:p>
+    <w:p>
+      <w:pPr>
+        <w:pStyle w:val="Heading2"/>
+      </w:pPr>
+      <w:r>
+        <w:t>11.2 Dette technique connue (sans effet sur le fonctionnement)</w:t>
+      </w:r>
+    </w:p>
+    <w:p>
+      <w:pPr>
+        <w:pStyle w:val="ListBullet"/>
+      </w:pPr>
+      <w:r>
+        <w:t>Correctifs sans test automatisé : minuteurs, page de maintenance, garde de route au rechargement, lockForUpdate sous MySQL.</w:t>
+      </w:r>
+    </w:p>
+    <w:p>
+      <w:pPr>
+        <w:pStyle w:val="ListBullet"/>
+      </w:pPr>
+      <w:r>
+        <w:t>Restauration et tri des sauvegardes couverts seulement par Pest (SQLite, simulation).</w:t>
+      </w:r>
+    </w:p>
+    <w:p>
+      <w:pPr>
+        <w:pStyle w:val="ListBullet"/>
+      </w:pPr>
+      <w:r>
+        <w:t>Scripts de recette (83 contrôles) et de rejeu de la démonstration non versionnés.</w:t>
+      </w:r>
+    </w:p>
+    <w:p>
+      <w:pPr>
+        <w:pStyle w:val="ListBullet"/>
+      </w:pPr>
+      <w:r>
+        <w:t>Trois écrans (barème, exports de rapports) affichent un message d'échec générique à côté du motif réel.</w:t>
+      </w:r>
+    </w:p>
+    <w:p>
+      <w:pPr>
+        <w:pStyle w:val="ListBullet"/>
+      </w:pPr>
+      <w:r>
+        <w:t>Vue reste en 3.6.0-beta.9 (figée par le lock) : passer à la 3.6 stable à sa sortie, CI rejouée.</w:t>
+      </w:r>
+    </w:p>
+    <w:p>
+      <w:pPr>
+        <w:pStyle w:val="ListBullet"/>
+      </w:pPr>
+      <w:r>
+        <w:t>Deux documents historiques (docs/deploiement-circuit-validation.md, docs/plan-validation-daf-dg.md) à archiver si le client le souhaite.</w:t>
       </w:r>
     </w:p>
     <w:p>

</xml_diff>

<commit_message>
Vue 3.5.44 stable épinglée (sortie de la 3.6 bêta) ; start-dev.ps1 en ASCII
- Documentation alignée : CLAUDE.md §2, AGENTS.md, README (racine, frontend/),
  documentation technique (tableau de la stack, commandes).
- Écart corrigé : start-dev.ps1 contenait trois tirets cadratins, illisibles
  sous Windows PowerShell 5.1 (lecture ANSI), contrairement à la règle
  d'AGENTS.md. Remplacés ; test scripts-dev-ascii.spec.ts (vu en échec avant).

Co-Authored-By: Claude Opus 5.5 <noreply@anthropic.com>
Claude-Session: https://claude.ai/code/session_01MUfkbbz4qHVd6KNyyZzHX8
</commit_message>
<xml_diff>
--- a/docs/ANaTT_Documentation_Technique_Fonctionnelle.docx
+++ b/docs/ANaTT_Documentation_Technique_Fonctionnelle.docx
@@ -3298,7 +3298,7 @@
                 <w:b w:val="0"/>
                 <w:sz w:val="19"/>
               </w:rPr>
-              <w:t>3.6 bêta (Composition API)</w:t>
+              <w:t>3.5.44 stable (Composition API)</w:t>
             </w:r>
           </w:p>
         </w:tc>
@@ -3313,7 +3313,7 @@
                 <w:b w:val="0"/>
                 <w:sz w:val="19"/>
               </w:rPr>
-              <w:t>Framework JavaScript principal — version figée par package-lock.json (3.6.0-beta.9) : installer avec npm ci</w:t>
+              <w:t>Framework JavaScript principal — version épinglée (sortie de la 3.6 bêta le 29/10/2026) : installer avec npm ci</w:t>
             </w:r>
           </w:p>
         </w:tc>
@@ -18230,7 +18230,7 @@
                 <w:color w:val="FFFFFF"/>
                 <w:sz w:val="18"/>
               </w:rPr>
-              <w:t>cd frontend &amp;&amp; npm ci &amp;&amp; npm run build      # npm ci : garde la bêta Vue figée par le lock</w:t>
+              <w:t>cd frontend &amp;&amp; npm ci &amp;&amp; npm run build      # npm ci : versions exactes du lock</w:t>
             </w:r>
           </w:p>
           <w:p>

</xml_diff>

<commit_message>
Dette technique soldée : revue §8, documentation technique, CHANGELOG, compteurs
- docs/revue-projet-2026-10.md §8 : défauts n° 50 à 55, dette soldée point par
  point (#195 à #199), clôture (sept jobs CI) ;
- documentation technique régénérée : chapitre 10 (tests MySQL, recette en
  CI), chapitre 11 (indicateurs, 11.2 « Dette technique : soldée ») ;
- CLAUDE.md, AGENTS.md, README (racine, backend/, frontend/) : Pest 702 dont 9
  sur MySQL réel, Vitest 241, recette 273 contrôles, scripts/recette/,
  tests/Mysql ;
- CHANGELOG.

Co-Authored-By: Claude Opus 5.5 <noreply@anthropic.com>
Claude-Session: https://claude.ai/code/session_01MUfkbbz4qHVd6KNyyZzHX8
</commit_message>
<xml_diff>
--- a/docs/ANaTT_Documentation_Technique_Fonctionnelle.docx
+++ b/docs/ANaTT_Documentation_Technique_Fonctionnelle.docx
@@ -403,7 +403,7 @@
                 <w:b w:val="0"/>
                 <w:sz w:val="19"/>
               </w:rPr>
-              <w:t>vue-pdf-embed, lucide-vue-next et @vueuse/core retirés (inutilisés) ; Vue reste en 3.6.0-beta.9.</w:t>
+              <w:t>vue-pdf-embed, lucide-vue-next et @vueuse/core retirés (inutilisés) ; Vue passée le 29/10 de 3.6.0-beta.9 à 3.5.44 stable, épinglée.</w:t>
             </w:r>
           </w:p>
         </w:tc>
@@ -18608,7 +18608,7 @@
                 <w:b w:val="0"/>
                 <w:sz w:val="19"/>
               </w:rPr>
-              <w:t>691 tests au total (76 fichiers)</w:t>
+              <w:t>702 tests (79 fichiers) : 693 sur SQLite + 9 sur MySQL réel</w:t>
             </w:r>
           </w:p>
         </w:tc>
@@ -18625,6 +18625,68 @@
                 <w:b w:val="0"/>
                 <w:sz w:val="19"/>
               </w:rPr>
+              <w:t>Intégrité MySQL</w:t>
+            </w:r>
+          </w:p>
+        </w:tc>
+        <w:tc>
+          <w:tcPr>
+            <w:tcW w:type="dxa" w:w="2381"/>
+          </w:tcPr>
+          <w:p>
+            <w:r/>
+            <w:r>
+              <w:rPr>
+                <w:b w:val="0"/>
+                <w:sz w:val="19"/>
+              </w:rPr>
+              <w:t>Pest — tests/Mysql (groupe mysql)</w:t>
+            </w:r>
+          </w:p>
+        </w:tc>
+        <w:tc>
+          <w:tcPr>
+            <w:tcW w:type="dxa" w:w="3742"/>
+          </w:tcPr>
+          <w:p>
+            <w:r/>
+            <w:r>
+              <w:rPr>
+                <w:b w:val="0"/>
+                <w:sz w:val="19"/>
+              </w:rPr>
+              <w:t>db:backup / db:restore réels (aller-retour, sauvegarde de sécurité, purge de la matrice, dump invalide), tri des sauvegardes, verrou lockForUpdate de l'amendement</w:t>
+            </w:r>
+          </w:p>
+        </w:tc>
+        <w:tc>
+          <w:tcPr>
+            <w:tcW w:type="dxa" w:w="1587"/>
+          </w:tcPr>
+          <w:p>
+            <w:r/>
+            <w:r>
+              <w:rPr>
+                <w:b w:val="0"/>
+                <w:sz w:val="19"/>
+              </w:rPr>
+              <w:t>9 tests (job CI sur MySQL 8)</w:t>
+            </w:r>
+          </w:p>
+        </w:tc>
+      </w:tr>
+      <w:tr>
+        <w:tc>
+          <w:tcPr>
+            <w:tcW w:type="dxa" w:w="1814"/>
+          </w:tcPr>
+          <w:p>
+            <w:r/>
+            <w:r>
+              <w:rPr>
+                <w:b w:val="0"/>
+                <w:sz w:val="19"/>
+              </w:rPr>
               <w:t>Unitaires frontend</w:t>
             </w:r>
           </w:p>
@@ -18655,7 +18717,7 @@
                 <w:b w:val="0"/>
                 <w:sz w:val="19"/>
               </w:rPr>
-              <w:t>Vues, services, stores, navigation ↔ permissions</w:t>
+              <w:t>Vues, services, stores, navigation ↔ permissions, minuteurs, page de maintenance</w:t>
             </w:r>
           </w:p>
         </w:tc>
@@ -18670,7 +18732,69 @@
                 <w:b w:val="0"/>
                 <w:sz w:val="19"/>
               </w:rPr>
-              <w:t>215 tests</w:t>
+              <w:t>241 tests</w:t>
+            </w:r>
+          </w:p>
+        </w:tc>
+      </w:tr>
+      <w:tr>
+        <w:tc>
+          <w:tcPr>
+            <w:tcW w:type="dxa" w:w="1814"/>
+          </w:tcPr>
+          <w:p>
+            <w:r/>
+            <w:r>
+              <w:rPr>
+                <w:b w:val="0"/>
+                <w:sz w:val="19"/>
+              </w:rPr>
+              <w:t>Recette API réelle</w:t>
+            </w:r>
+          </w:p>
+        </w:tc>
+        <w:tc>
+          <w:tcPr>
+            <w:tcW w:type="dxa" w:w="2381"/>
+          </w:tcPr>
+          <w:p>
+            <w:r/>
+            <w:r>
+              <w:rPr>
+                <w:b w:val="0"/>
+                <w:sz w:val="19"/>
+              </w:rPr>
+              <w:t>scripts/recette (Node, sans dépendance)</w:t>
+            </w:r>
+          </w:p>
+        </w:tc>
+        <w:tc>
+          <w:tcPr>
+            <w:tcW w:type="dxa" w:w="3742"/>
+          </w:tcPr>
+          <w:p>
+            <w:r/>
+            <w:r>
+              <w:rPr>
+                <w:b w:val="0"/>
+                <w:sz w:val="19"/>
+              </w:rPr>
+              <w:t>Rejeu du scénario de démonstration (119 contrôles) puis recette transverse : RBAC, erreurs JSON, fichiers MTN/Moov octet par octet, idempotence, lots complémentaires, régularisations (154)</w:t>
+            </w:r>
+          </w:p>
+        </w:tc>
+        <w:tc>
+          <w:tcPr>
+            <w:tcW w:type="dxa" w:w="1587"/>
+          </w:tcPr>
+          <w:p>
+            <w:r/>
+            <w:r>
+              <w:rPr>
+                <w:b w:val="0"/>
+                <w:sz w:val="19"/>
+              </w:rPr>
+              <w:t>273 contrôles (job CI)</w:t>
             </w:r>
           </w:p>
         </w:tc>
@@ -18822,7 +18946,7 @@
         <w:pStyle w:val="ListBullet"/>
       </w:pPr>
       <w:r>
-        <w:t>Recette sur l'API réelle (23/10/2026, base SQLite neuve, QUEUE_CONNECTION=sync) : 83/83 contrôles conformes ; scénario de démonstration (docs/SCENARIO-DEMO.md) rejoué, conforme, puis de nouveau le 27/10 en version 1.4 (mêmes fichiers et montants, notifications de chaque signataire). Le 25/10, réponses réelles de l'API confrontées aux schémas d'openapi.yaml (openapi-core) : conformes après le n° 32 ; vérification automatisée en CI depuis le 28/10 (OpenApiReponsesTest). Le 28/10, variantes messagerie et maintenance du scénario rejouées sur l'API réelle (MariaDB, base neuve) : elles ont révélé l'affichage du message générique des 422 à l'écran Messagerie, corrigé. Le 29/10, scénario complet rejoué de nouveau (MariaDB, base neuve, QUEUE_CONNECTION=sync) : état des avances 805 000, aperçus MTN 406 000 et Moov 399 000 ; refus vérifiés avec leur motif en français (agent en double, séparation des tâches, numéro manquant).</w:t>
+        <w:t>Recette sur l'API réelle (23/10/2026, base SQLite neuve, QUEUE_CONNECTION=sync) : 83/83 contrôles conformes ; scénario de démonstration (docs/SCENARIO-DEMO.md) rejoué, conforme, puis de nouveau le 27/10 en version 1.4 (mêmes fichiers et montants, notifications de chaque signataire). Le 25/10, réponses réelles de l'API confrontées aux schémas d'openapi.yaml (openapi-core) : conformes après le n° 32 ; vérification automatisée en CI depuis le 28/10 (OpenApiReponsesTest). Le 28/10, variantes messagerie et maintenance du scénario rejouées sur l'API réelle (MariaDB, base neuve) : elles ont révélé l'affichage du message générique des 422 à l'écran Messagerie, corrigé. Le 29/10, scénario complet rejoué de nouveau (MariaDB, base neuve, QUEUE_CONNECTION=sync) : état des avances 805 000, aperçus MTN 406 000 et Moov 399 000 ; refus vérifiés avec leur motif en français (agent en double, séparation des tâches, numéro manquant). Depuis le 29/10, ce rejeu et la recette transverse sont versionnés (scripts/recette/) et exécutés à chaque PR (job « Recette · API réelle », API servie par php artisan serve sur une base neuve).</w:t>
       </w:r>
     </w:p>
     <w:p>
@@ -18830,7 +18954,7 @@
         <w:pStyle w:val="ListBullet"/>
       </w:pPr>
       <w:r>
-        <w:t>Défauts relevés par la revue d'octobre 2026 : 32, puis 17 de plus du 27 au 29/10 (n° 33 à 49, en confrontant la documentation au code et à l'interface), tous corrigés avec un test vu en échec sans le correctif (index : CHANGELOG.md ; détail : docs/revue-projet-2026-10.md §3 et §8). Les quatre décisions du §7.1 sont appliquées depuis la 1.4.</w:t>
+        <w:t>Défauts relevés par la revue d'octobre 2026 : 32, puis 23 de plus du 27 au 29/10 (n° 33 à 55, en confrontant la documentation au code et à l'interface, puis en soldant la dette technique), tous corrigés avec un test vu en échec sans le correctif (index : CHANGELOG.md ; détail : docs/revue-projet-2026-10.md §3 et §8). Les quatre décisions du §7.1 sont appliquées depuis la 1.4.</w:t>
       </w:r>
     </w:p>
     <w:p>
@@ -18846,7 +18970,7 @@
         <w:pStyle w:val="ListBullet"/>
       </w:pPr>
       <w:r>
-        <w:t>CI GitHub Actions (.github/workflows) : Lint, Pest, Vitest + type-check, Playwright, build dist.</w:t>
+        <w:t>CI GitHub Actions (.github/workflows) : Lint, Pest (SQLite), Pest MySQL, Vitest + type-check, Playwright, Recette · API réelle, build dist.</w:t>
       </w:r>
     </w:p>
     <w:p>
@@ -18868,7 +18992,7 @@
           <w:b w:val="0"/>
           <w:i w:val="0"/>
         </w:rPr>
-        <w:t>Le développement est terminé : 49 défauts relevés par la revue d'octobre 2026 et la relecture des documents (n° 1 à 49), tous corrigés avec un test ; quatre décisions (D1 à D4) appliquées ; aucune décision en attente. Tous les documents sont confrontés au code (détail et cartographie : docs/revue-projet-2026-10.md §8).</w:t>
+        <w:t>Le développement est terminé : 55 défauts relevés par la revue d'octobre 2026, la relecture des documents et la résorption de la dette (n° 1 à 55), tous corrigés avec un test ; quatre décisions (D1 à D4) appliquées ; dette technique soldée ; aucune décision en attente. Tous les documents sont confrontés au code (détail et cartographie : docs/revue-projet-2026-10.md §8).</w:t>
       </w:r>
     </w:p>
     <w:tbl>
@@ -18946,7 +19070,7 @@
                 <w:b w:val="0"/>
                 <w:sz w:val="19"/>
               </w:rPr>
-              <w:t>691 tests, 76 fichiers — API complète sur SQLite, contrat OpenAPI vérifié</w:t>
+              <w:t>702 tests, 79 fichiers — API complète sur SQLite (693), contrat OpenAPI vérifié ; sauvegarde, restauration et verrous sur MySQL réel (9)</w:t>
             </w:r>
           </w:p>
         </w:tc>
@@ -18978,7 +19102,7 @@
                 <w:b w:val="0"/>
                 <w:sz w:val="19"/>
               </w:rPr>
-              <w:t>215 tests, 42 fichiers — vues, services, stores, navigation ↔ permissions</w:t>
+              <w:t>241 tests, 48 fichiers — vues, services, stores, navigation ↔ permissions</w:t>
             </w:r>
           </w:p>
         </w:tc>
@@ -18995,7 +19119,7 @@
                 <w:b w:val="0"/>
                 <w:sz w:val="19"/>
               </w:rPr>
-              <w:t>Tests de bout en bout (Playwright)</w:t>
+              <w:t>Recette sur l'API réelle</w:t>
             </w:r>
           </w:p>
         </w:tc>
@@ -19010,7 +19134,7 @@
                 <w:b w:val="0"/>
                 <w:sz w:val="19"/>
               </w:rPr>
-              <w:t>3 parcours critiques</w:t>
+              <w:t>273 contrôles en CI (rejeu du scénario 119 + recette transverse 154)</w:t>
             </w:r>
           </w:p>
         </w:tc>
@@ -19027,6 +19151,38 @@
                 <w:b w:val="0"/>
                 <w:sz w:val="19"/>
               </w:rPr>
+              <w:t>Tests de bout en bout (Playwright)</w:t>
+            </w:r>
+          </w:p>
+        </w:tc>
+        <w:tc>
+          <w:tcPr>
+            <w:tcW w:type="dxa" w:w="6576"/>
+          </w:tcPr>
+          <w:p>
+            <w:r/>
+            <w:r>
+              <w:rPr>
+                <w:b w:val="0"/>
+                <w:sz w:val="19"/>
+              </w:rPr>
+              <w:t>3 parcours critiques</w:t>
+            </w:r>
+          </w:p>
+        </w:tc>
+      </w:tr>
+      <w:tr>
+        <w:tc>
+          <w:tcPr>
+            <w:tcW w:type="dxa" w:w="2948"/>
+          </w:tcPr>
+          <w:p>
+            <w:r/>
+            <w:r>
+              <w:rPr>
+                <w:b w:val="0"/>
+                <w:sz w:val="19"/>
+              </w:rPr>
               <w:t>Scénario de démonstration</w:t>
             </w:r>
           </w:p>
@@ -19042,7 +19198,7 @@
                 <w:b w:val="0"/>
                 <w:sz w:val="19"/>
               </w:rPr>
-              <w:t>Rejoué sur l'API réelle le 29/10, montants et fichiers inchangés</w:t>
+              <w:t>Rejoué automatiquement à chaque PR (scripts/recette/rejeu-scenario.cjs), montants et fichiers inchangés</w:t>
             </w:r>
           </w:p>
         </w:tc>
@@ -19158,7 +19314,7 @@
         <w:pStyle w:val="ListBullet"/>
       </w:pPr>
       <w:r>
-        <w:t>Éprouver la restauration d'une sauvegarde sur une base MySQL de recette.</w:t>
+        <w:t>Éprouver une fois la restauration sur la base MySQL de l'hébergement (mécanisme vérifié en CI sur MySQL 8).</w:t>
       </w:r>
     </w:p>
     <w:p>
@@ -19182,55 +19338,225 @@
         <w:pStyle w:val="Heading2"/>
       </w:pPr>
       <w:r>
-        <w:t>11.2 Dette technique connue (sans effet sur le fonctionnement)</w:t>
+        <w:t>11.2 Dette technique : soldée le 29/10/2026</w:t>
       </w:r>
     </w:p>
+    <w:tbl>
+      <w:tblPr>
+        <w:tblStyle w:val="TableGrid"/>
+        <w:tblW w:type="auto" w:w="0"/>
+        <w:jc w:val="center"/>
+        <w:tblLayout w:type="fixed"/>
+        <w:tblLook w:firstColumn="1" w:firstRow="1" w:lastColumn="0" w:lastRow="0" w:noHBand="0" w:noVBand="1" w:val="04A0"/>
+      </w:tblPr>
+      <w:tblGrid>
+        <w:gridCol w:w="3628"/>
+        <w:gridCol w:w="5896"/>
+      </w:tblGrid>
+      <w:tr>
+        <w:tc>
+          <w:tcPr>
+            <w:tcW w:type="dxa" w:w="3628"/>
+            <w:shd w:val="clear" w:fill="1D9E4F"/>
+          </w:tcPr>
+          <w:p>
+            <w:r/>
+            <w:r>
+              <w:rPr>
+                <w:b/>
+                <w:color w:val="FFFFFF"/>
+                <w:sz w:val="20"/>
+              </w:rPr>
+              <w:t>Point relevé</w:t>
+            </w:r>
+          </w:p>
+        </w:tc>
+        <w:tc>
+          <w:tcPr>
+            <w:tcW w:type="dxa" w:w="5896"/>
+            <w:shd w:val="clear" w:fill="1D9E4F"/>
+          </w:tcPr>
+          <w:p>
+            <w:r/>
+            <w:r>
+              <w:rPr>
+                <w:b/>
+                <w:color w:val="FFFFFF"/>
+                <w:sz w:val="20"/>
+              </w:rPr>
+              <w:t>Résolution</w:t>
+            </w:r>
+          </w:p>
+        </w:tc>
+      </w:tr>
+      <w:tr>
+        <w:tc>
+          <w:tcPr>
+            <w:tcW w:type="dxa" w:w="3628"/>
+          </w:tcPr>
+          <w:p>
+            <w:r/>
+            <w:r>
+              <w:rPr>
+                <w:b w:val="0"/>
+                <w:sz w:val="19"/>
+              </w:rPr>
+              <w:t>Correctifs sans test automatisé (minuteurs, maintenance, garde de route, design system)</w:t>
+            </w:r>
+          </w:p>
+        </w:tc>
+        <w:tc>
+          <w:tcPr>
+            <w:tcW w:type="dxa" w:w="5896"/>
+          </w:tcPr>
+          <w:p>
+            <w:r/>
+            <w:r>
+              <w:rPr>
+                <w:b w:val="0"/>
+                <w:sz w:val="19"/>
+              </w:rPr>
+              <w:t>20 tests Vitest vus en échec sans leur correctif ; défaut n° 52 (crochets d'AppNavProgress) corrigé</w:t>
+            </w:r>
+          </w:p>
+        </w:tc>
+      </w:tr>
+      <w:tr>
+        <w:tc>
+          <w:tcPr>
+            <w:tcW w:type="dxa" w:w="3628"/>
+          </w:tcPr>
+          <w:p>
+            <w:r/>
+            <w:r>
+              <w:rPr>
+                <w:b w:val="0"/>
+                <w:sz w:val="19"/>
+              </w:rPr>
+              <w:t>Restauration, tri et lockForUpdate testés seulement sous SQLite</w:t>
+            </w:r>
+          </w:p>
+        </w:tc>
+        <w:tc>
+          <w:tcPr>
+            <w:tcW w:type="dxa" w:w="5896"/>
+          </w:tcPr>
+          <w:p>
+            <w:r/>
+            <w:r>
+              <w:rPr>
+                <w:b w:val="0"/>
+                <w:sz w:val="19"/>
+              </w:rPr>
+              <w:t>Groupe Pest mysql et job « Backend · Pest MySQL » (MySQL 8) ; défaut n° 53 (sauvegardes de la même seconde) corrigé</w:t>
+            </w:r>
+          </w:p>
+        </w:tc>
+      </w:tr>
+      <w:tr>
+        <w:tc>
+          <w:tcPr>
+            <w:tcW w:type="dxa" w:w="3628"/>
+          </w:tcPr>
+          <w:p>
+            <w:r/>
+            <w:r>
+              <w:rPr>
+                <w:b w:val="0"/>
+                <w:sz w:val="19"/>
+              </w:rPr>
+              <w:t>Scripts de recette non versionnés</w:t>
+            </w:r>
+          </w:p>
+        </w:tc>
+        <w:tc>
+          <w:tcPr>
+            <w:tcW w:type="dxa" w:w="5896"/>
+          </w:tcPr>
+          <w:p>
+            <w:r/>
+            <w:r>
+              <w:rPr>
+                <w:b w:val="0"/>
+                <w:sz w:val="19"/>
+              </w:rPr>
+              <w:t>scripts/recette/ et job « Recette · API réelle » ; défauts n° 54 et 55 corrigés</w:t>
+            </w:r>
+          </w:p>
+        </w:tc>
+      </w:tr>
+      <w:tr>
+        <w:tc>
+          <w:tcPr>
+            <w:tcW w:type="dxa" w:w="3628"/>
+          </w:tcPr>
+          <w:p>
+            <w:r/>
+            <w:r>
+              <w:rPr>
+                <w:b w:val="0"/>
+                <w:sz w:val="19"/>
+              </w:rPr>
+              <w:t>Trois écrans au message d'échec générique</w:t>
+            </w:r>
+          </w:p>
+        </w:tc>
+        <w:tc>
+          <w:tcPr>
+            <w:tcW w:type="dxa" w:w="5896"/>
+          </w:tcPr>
+          <w:p>
+            <w:r/>
+            <w:r>
+              <w:rPr>
+                <w:b w:val="0"/>
+                <w:sz w:val="19"/>
+              </w:rPr>
+              <w:t>Motif du serveur, message de l'écran en repli (n° 50)</w:t>
+            </w:r>
+          </w:p>
+        </w:tc>
+      </w:tr>
+      <w:tr>
+        <w:tc>
+          <w:tcPr>
+            <w:tcW w:type="dxa" w:w="3628"/>
+          </w:tcPr>
+          <w:p>
+            <w:r/>
+            <w:r>
+              <w:rPr>
+                <w:b w:val="0"/>
+                <w:sz w:val="19"/>
+              </w:rPr>
+              <w:t>Vue 3.6.0-beta.9</w:t>
+            </w:r>
+          </w:p>
+        </w:tc>
+        <w:tc>
+          <w:tcPr>
+            <w:tcW w:type="dxa" w:w="5896"/>
+          </w:tcPr>
+          <w:p>
+            <w:r/>
+            <w:r>
+              <w:rPr>
+                <w:b w:val="0"/>
+                <w:sz w:val="19"/>
+              </w:rPr>
+              <w:t>Vue 3.5.44 stable, épinglée (la 3.6 stable n'est pas parue)</w:t>
+            </w:r>
+          </w:p>
+        </w:tc>
+      </w:tr>
+    </w:tbl>
+    <w:p/>
     <w:p>
       <w:pPr>
         <w:pStyle w:val="ListBullet"/>
       </w:pPr>
       <w:r>
-        <w:t>Correctifs sans test automatisé : minuteurs, page de maintenance, garde de route au rechargement, lockForUpdate sous MySQL.</w:t>
-      </w:r>
-    </w:p>
-    <w:p>
-      <w:pPr>
-        <w:pStyle w:val="ListBullet"/>
-      </w:pPr>
-      <w:r>
-        <w:t>Restauration et tri des sauvegardes couverts seulement par Pest (SQLite, simulation).</w:t>
-      </w:r>
-    </w:p>
-    <w:p>
-      <w:pPr>
-        <w:pStyle w:val="ListBullet"/>
-      </w:pPr>
-      <w:r>
-        <w:t>Scripts de recette (83 contrôles) et de rejeu de la démonstration non versionnés.</w:t>
-      </w:r>
-    </w:p>
-    <w:p>
-      <w:pPr>
-        <w:pStyle w:val="ListBullet"/>
-      </w:pPr>
-      <w:r>
-        <w:t>Trois écrans (barème, exports de rapports) affichent un message d'échec générique à côté du motif réel.</w:t>
-      </w:r>
-    </w:p>
-    <w:p>
-      <w:pPr>
-        <w:pStyle w:val="ListBullet"/>
-      </w:pPr>
-      <w:r>
-        <w:t>Vue reste en 3.6.0-beta.9 (figée par le lock) : passer à la 3.6 stable à sa sortie, CI rejouée.</w:t>
-      </w:r>
-    </w:p>
-    <w:p>
-      <w:pPr>
-        <w:pStyle w:val="ListBullet"/>
-      </w:pPr>
-      <w:r>
-        <w:t>Deux documents historiques (docs/deploiement-circuit-validation.md, docs/plan-validation-daf-dg.md) à archiver si le client le souhaite.</w:t>
+        <w:t>Reste au choix du client : archiver les deux documents historiques (docs/deploiement-circuit-validation.md, docs/plan-validation-daf-dg.md). Passer à Vue 3.6 stable à sa sortie relève d'une évolution ordinaire.</w:t>
       </w:r>
     </w:p>
     <w:p>

</xml_diff>

<commit_message>
Documentation technique : évolutions de la dette, sauvegardes rapprochées, dates inversées
- évolutions 1.4 : « Dette soldée (29/10) » (Vue 3.5.44, tests MySQL et recette
  en CI, défauts n° 50 à 55) et « Documents après la dette » ;
- §2.3 : tests/Mysql et scripts/recette/ dans l'arborescence ;
- §4.1 : dates inversées refusées, motif exact ;
- §4.7 : suffixe -2 des sauvegardes de la même seconde ; restauration
  vérifiée en CI sur MySQL 8, reste à l'éprouver chez l'hébergeur ;
- §9 : correctifs n° 33 à 55, SPA en Vue 3.5.44 ; §11 : galerie.

.docx régénéré ; revue §8.2 et CHANGELOG.

Co-Authored-By: Claude Opus 5.5 <noreply@anthropic.com>
Claude-Session: https://claude.ai/code/session_01MUfkbbz4qHVd6KNyyZzHX8
</commit_message>
<xml_diff>
--- a/docs/ANaTT_Documentation_Technique_Fonctionnelle.docx
+++ b/docs/ANaTT_Documentation_Technique_Fonctionnelle.docx
@@ -1061,7 +1061,7 @@
                 <w:b w:val="0"/>
                 <w:sz w:val="19"/>
               </w:rPr>
-              <w:t>resources/lang/fr/validation.php : en production (APP_LOCALE=fr, APP_FALLBACK_LOCALE=fr), une règle générique renvoyait sa clé brute (« validation.unique »). Messages et noms de champs en français, déployés avec resources/. ValidationFrancaisTest (19 tests). Pest 690, Vitest 210 (691 / 215 le 29/10).</w:t>
+              <w:t>resources/lang/fr/validation.php : en production (APP_LOCALE=fr, APP_FALLBACK_LOCALE=fr), une règle générique renvoyait sa clé brute (« validation.unique »). Messages et noms de champs en français, déployés avec resources/. ValidationFrancaisTest (19 tests, 21 le 29/10). Pest 690, Vitest 210 (702 / 241 le 29/10, après la dette).</w:t>
             </w:r>
           </w:p>
         </w:tc>
@@ -1171,6 +1171,100 @@
                 <w:sz w:val="19"/>
               </w:rPr>
               <w:t>§10, §11</w:t>
+            </w:r>
+          </w:p>
+        </w:tc>
+      </w:tr>
+      <w:tr>
+        <w:tc>
+          <w:tcPr>
+            <w:tcW w:type="dxa" w:w="2041"/>
+          </w:tcPr>
+          <w:p>
+            <w:r/>
+            <w:r>
+              <w:rPr>
+                <w:b w:val="0"/>
+                <w:sz w:val="19"/>
+              </w:rPr>
+              <w:t>Dette soldée (29/10)</w:t>
+            </w:r>
+          </w:p>
+        </w:tc>
+        <w:tc>
+          <w:tcPr>
+            <w:tcW w:type="dxa" w:w="6009"/>
+          </w:tcPr>
+          <w:p>
+            <w:r/>
+            <w:r>
+              <w:rPr>
+                <w:b w:val="0"/>
+                <w:sz w:val="19"/>
+              </w:rPr>
+              <w:t>Vue 3.5.44 stable épinglée (sortie de la 3.6 bêta). Tests des correctifs restés sans test (minuteurs, maintenance, garde de route : 20 Vitest) ; groupe Pest mysql (9 tests) et job CI sur MySQL 8 ; recette sur l'API réelle versionnée (scripts/recette/, 273 contrôles) et exécutée en CI. Défauts relevés en chemin et corrigés : barème et exports au message générique (n° 50), start-dev.ps1 non ASCII (n° 51), crochets d'AppNavProgress (n° 52), sauvegardes de la même seconde qui s'écrasaient (n° 53), motif d'un agent sans indice (n° 54), motif mal accordé des dates (n° 55).</w:t>
+            </w:r>
+          </w:p>
+        </w:tc>
+        <w:tc>
+          <w:tcPr>
+            <w:tcW w:type="dxa" w:w="1474"/>
+          </w:tcPr>
+          <w:p>
+            <w:r/>
+            <w:r>
+              <w:rPr>
+                <w:b w:val="0"/>
+                <w:sz w:val="19"/>
+              </w:rPr>
+              <w:t>§4.1, §4.7, §10, §11</w:t>
+            </w:r>
+          </w:p>
+        </w:tc>
+      </w:tr>
+      <w:tr>
+        <w:tc>
+          <w:tcPr>
+            <w:tcW w:type="dxa" w:w="2041"/>
+          </w:tcPr>
+          <w:p>
+            <w:r/>
+            <w:r>
+              <w:rPr>
+                <w:b w:val="0"/>
+                <w:sz w:val="19"/>
+              </w:rPr>
+              <w:t>Documents après la dette (29/10)</w:t>
+            </w:r>
+          </w:p>
+        </w:tc>
+        <w:tc>
+          <w:tcPr>
+            <w:tcW w:type="dxa" w:w="6009"/>
+          </w:tcPr>
+          <w:p>
+            <w:r/>
+            <w:r>
+              <w:rPr>
+                <w:b w:val="0"/>
+                <w:sz w:val="19"/>
+              </w:rPr>
+              <w:t>Guide utilisateur, scénario de démonstration (rejoué sur MariaDB : 119 contrôles) et README à jour ; galerie recapturée avec le SPA en Vue 3.5.44 (rendu identique), le script de capture attendant désormais les polices Sora et DM Sans.</w:t>
+            </w:r>
+          </w:p>
+        </w:tc>
+        <w:tc>
+          <w:tcPr>
+            <w:tcW w:type="dxa" w:w="1474"/>
+          </w:tcPr>
+          <w:p>
+            <w:r/>
+            <w:r>
+              <w:rPr>
+                <w:b w:val="0"/>
+                <w:sz w:val="19"/>
+              </w:rPr>
+              <w:t>§2.3, §10</w:t>
             </w:r>
           </w:p>
         </w:tc>
@@ -4407,6 +4501,26 @@
                 <w:sz w:val="18"/>
               </w:rPr>
               <w:t xml:space="preserve">    docs/openapi.yaml      Référence API (verrouillée par tests/Feature/OpenApiTest.php)</w:t>
+            </w:r>
+          </w:p>
+          <w:p>
+            <w:r>
+              <w:rPr>
+                <w:rFonts w:ascii="Consolas" w:hAnsi="Consolas"/>
+                <w:color w:val="FFFFFF"/>
+                <w:sz w:val="18"/>
+              </w:rPr>
+              <w:t xml:space="preserve">    tests/{Feature,Unit,Mysql}  Pest (Mysql : groupe mysql sur un vrai MySQL, ignoré ailleurs)</w:t>
+            </w:r>
+          </w:p>
+          <w:p>
+            <w:r>
+              <w:rPr>
+                <w:rFonts w:ascii="Consolas" w:hAnsi="Consolas"/>
+                <w:color w:val="FFFFFF"/>
+                <w:sz w:val="18"/>
+              </w:rPr>
+              <w:t xml:space="preserve">  scripts/recette/         Rejeu du scénario de démo + recette transverse sur l'API réelle (CI)</w:t>
             </w:r>
           </w:p>
           <w:p>
@@ -7204,7 +7318,7 @@
                 <w:b w:val="0"/>
                 <w:sz w:val="19"/>
               </w:rPr>
-              <w:t>Contexte de mission enregistré</w:t>
+              <w:t>Contexte de mission enregistré ; dates inversées refusées (422 « La date de retour doit être postérieure ou égale à la date de départ. »)</w:t>
             </w:r>
           </w:p>
         </w:tc>
@@ -9735,7 +9849,7 @@
                 <w:b w:val="0"/>
                 <w:sz w:val="19"/>
               </w:rPr>
-              <w:t>backups/backup_AAAA-MM-JJ_HHMMSS.sql.gz</w:t>
+              <w:t>backups/backup_AAAA-MM-JJ_HHMMSS.sql.gz (suffixe -2, -3… si le nom est pris : deux sauvegardes de la même seconde ne s'écrasent pas)</w:t>
             </w:r>
           </w:p>
         </w:tc>
@@ -10058,6 +10172,14 @@
       </w:pPr>
       <w:r>
         <w:t>Hors périmètre du dump : storage/app/settings.json (part d'avance, exercice, SMTP…), paraphes des signataires et fichiers produits (PDF, fichiers de paiement) sur le disque local. Une restauration ne les modifie pas ; leur sauvegarde relève de la copie de storage/.</w:t>
+      </w:r>
+    </w:p>
+    <w:p>
+      <w:pPr>
+        <w:pStyle w:val="ListBullet"/>
+      </w:pPr>
+      <w:r>
+        <w:t>Vérifié en CI sur MySQL 8 (tests/Mysql, job « Backend · Pest MySQL ») : aller-retour db:backup / db:restore réel, sauvegarde de sécurité elle-même restaurable, purge de la matrice, dump invalide (erreur du client affichée, cache intact), tri des sauvegardes. Reste à l'éprouver une fois avec les binaires et les droits de l'hébergeur.</w:t>
       </w:r>
     </w:p>
     <w:p>
@@ -18394,7 +18516,7 @@
         <w:pStyle w:val="ListBullet"/>
       </w:pPr>
       <w:r>
-        <w:t>Correctifs des 27-29/10 (n° 33 à 49) : code seul, aucune migration de plus. Relire storage/app/settings.json avant l'envoi du code : les réglages de Paramètres et de Messagerie qu'il contient s'appliquent dès lors. Le nouveau fichier resources/lang/fr/validation.php part avec resources/, déjà envoyé à chaque mise à jour.</w:t>
+        <w:t>Correctifs des 27-29/10 (n° 33 à 55) : code seul, aucune migration de plus. Le SPA se reconstruit en Vue 3.5.44 (npm ci ; dist/ à redéployer comme d'habitude). Relire storage/app/settings.json avant l'envoi du code : les réglages de Paramètres et de Messagerie qu'il contient s'appliquent dès lors. Le nouveau fichier resources/lang/fr/validation.php part avec resources/, déjà envoyé à chaque mise à jour.</w:t>
       </w:r>
     </w:p>
     <w:p>
@@ -19230,7 +19352,7 @@
                 <w:b w:val="0"/>
                 <w:sz w:val="19"/>
               </w:rPr>
-              <w:t>46 écrans recapturés le 29/10 ; 53 pages</w:t>
+              <w:t>46 écrans recapturés le 29/10 avec le SPA en Vue 3.5.44 ; 53 pages</w:t>
             </w:r>
           </w:p>
         </w:tc>

</xml_diff>

<commit_message>
Relecture finale : documents alignés sur les n° 56 à 58, compteurs mesurés, revue close
- checklist, runbook, DEPLOY-CPANEL : cinq fichiers de l'API ; contrôles des
  n° 56 à 58 (étape 1 de l'assistant, barème partiel, import sans indice) ;
- workflows par profil, catégories d'indice : comportement corrigé décrit ;
- recette : API en HTTP seulement (contrôle HSTS), jamais en production ;
- audit de cohérence appliqué : AGENTS.md (défauts n° 1 à 58, §8, Pest 703,
  repli de getErrorMessage), CLAUDE.md (useApplication, utils/notifications),
  README (jobs CI), revue §8 (n° 56 à 58, état des documents, clôture),
  documentation technique (tableau des tests, évolutions) ;
- compteurs mesurés : Pest 703 (694 SQLite + 9 MySQL), Vitest 245 ;
- guide utilisateur : étape 1 et barème partiel ; .docx régénérés ; CHANGELOG.

Co-Authored-By: Claude Opus 5.5 <noreply@anthropic.com>
Claude-Session: https://claude.ai/code/session_01MUfkbbz4qHVd6KNyyZzHX8
</commit_message>
<xml_diff>
--- a/docs/ANaTT_Documentation_Technique_Fonctionnelle.docx
+++ b/docs/ANaTT_Documentation_Technique_Fonctionnelle.docx
@@ -1061,7 +1061,7 @@
                 <w:b w:val="0"/>
                 <w:sz w:val="19"/>
               </w:rPr>
-              <w:t>resources/lang/fr/validation.php : en production (APP_LOCALE=fr, APP_FALLBACK_LOCALE=fr), une règle générique renvoyait sa clé brute (« validation.unique »). Messages et noms de champs en français, déployés avec resources/. ValidationFrancaisTest (19 tests, 21 le 29/10). Pest 690, Vitest 210 (702 / 241 le 29/10, après la dette).</w:t>
+              <w:t>resources/lang/fr/validation.php : en production (APP_LOCALE=fr, APP_FALLBACK_LOCALE=fr), une règle générique renvoyait sa clé brute (« validation.unique »). Messages et noms de champs en français, déployés avec resources/. ValidationFrancaisTest (19 tests, 21 le 29/10). Pest 690, Vitest 210 (703 / 245 le 29/10, après la dette).</w:t>
             </w:r>
           </w:p>
         </w:tc>
@@ -1202,7 +1202,7 @@
                 <w:b w:val="0"/>
                 <w:sz w:val="19"/>
               </w:rPr>
-              <w:t>Vue 3.5.44 stable épinglée (sortie de la 3.6 bêta). Tests des correctifs restés sans test (minuteurs, maintenance, garde de route : 20 Vitest) ; groupe Pest mysql (9 tests) et job CI sur MySQL 8 ; recette sur l'API réelle versionnée (scripts/recette/, 273 contrôles) et exécutée en CI. Défauts relevés en chemin et corrigés : barème et exports au message générique (n° 50), start-dev.ps1 non ASCII (n° 51), crochets d'AppNavProgress (n° 52), sauvegardes de la même seconde qui s'écrasaient (n° 53), motif d'un agent sans indice (n° 54), motif mal accordé des dates (n° 55).</w:t>
+              <w:t>Vue 3.5.44 stable épinglée (sortie de la 3.6 bêta). Tests des correctifs restés sans test (minuteurs, maintenance, garde de route : 20 Vitest) ; groupe Pest mysql (9 tests) et job CI sur MySQL 8 ; recette sur l'API réelle versionnée (scripts/recette/, 273 contrôles) et exécutée en CI. Défauts relevés en chemin et corrigés : barème et exports au message générique (n° 50), start-dev.ps1 non ASCII (n° 51), crochets d'AppNavProgress (n° 52), sauvegardes de la même seconde qui s'écrasaient (n° 53), motif d'un agent sans indice (n° 54), motif mal accordé des dates (n° 55) ; puis, en confrontant les guides au code : dates inversées admises par l'assistant et refus affiché deux fois (n° 56), enregistrement partiel du barème (n° 57), catégorie réclamée en plus à l'import d'agents (n° 58).</w:t>
             </w:r>
           </w:p>
         </w:tc>
@@ -7318,7 +7318,7 @@
                 <w:b w:val="0"/>
                 <w:sz w:val="19"/>
               </w:rPr>
-              <w:t>Contexte de mission enregistré ; dates inversées refusées (422 « La date de retour doit être postérieure ou égale à la date de départ. »)</w:t>
+              <w:t>Contexte de mission enregistré ; dates inversées arrêtées dès cette étape (n° 56) et refusées par l'API (422 « La date de retour doit être postérieure ou égale à la date de départ. »)</w:t>
             </w:r>
           </w:p>
         </w:tc>
@@ -18516,7 +18516,7 @@
         <w:pStyle w:val="ListBullet"/>
       </w:pPr>
       <w:r>
-        <w:t>Correctifs des 27-29/10 (n° 33 à 55) : code seul, aucune migration de plus. Le SPA se reconstruit en Vue 3.5.44 (npm ci ; dist/ à redéployer comme d'habitude). Relire storage/app/settings.json avant l'envoi du code : les réglages de Paramètres et de Messagerie qu'il contient s'appliquent dès lors. Le nouveau fichier resources/lang/fr/validation.php part avec resources/, déjà envoyé à chaque mise à jour.</w:t>
+        <w:t>Correctifs des 27-29/10 (n° 33 à 58) : code seul, aucune migration de plus. Le SPA se reconstruit en Vue 3.5.44 (npm ci ; dist/ à redéployer comme d'habitude). Relire storage/app/settings.json avant l'envoi du code : les réglages de Paramètres et de Messagerie qu'il contient s'appliquent dès lors. Le nouveau fichier resources/lang/fr/validation.php part avec resources/, déjà envoyé à chaque mise à jour.</w:t>
       </w:r>
     </w:p>
     <w:p>
@@ -18730,7 +18730,7 @@
                 <w:b w:val="0"/>
                 <w:sz w:val="19"/>
               </w:rPr>
-              <w:t>702 tests (79 fichiers) : 693 sur SQLite + 9 sur MySQL réel</w:t>
+              <w:t>565 tests (71 fichiers) ; total Pest 703 tests (79 fichiers) : 694 sur SQLite + 9 sur MySQL réel</w:t>
             </w:r>
           </w:p>
         </w:tc>
@@ -18854,7 +18854,7 @@
                 <w:b w:val="0"/>
                 <w:sz w:val="19"/>
               </w:rPr>
-              <w:t>241 tests</w:t>
+              <w:t>245 tests</w:t>
             </w:r>
           </w:p>
         </w:tc>
@@ -19068,7 +19068,7 @@
         <w:pStyle w:val="ListBullet"/>
       </w:pPr>
       <w:r>
-        <w:t>Recette sur l'API réelle (23/10/2026, base SQLite neuve, QUEUE_CONNECTION=sync) : 83/83 contrôles conformes ; scénario de démonstration (docs/SCENARIO-DEMO.md) rejoué, conforme, puis de nouveau le 27/10 en version 1.4 (mêmes fichiers et montants, notifications de chaque signataire). Le 25/10, réponses réelles de l'API confrontées aux schémas d'openapi.yaml (openapi-core) : conformes après le n° 32 ; vérification automatisée en CI depuis le 28/10 (OpenApiReponsesTest). Le 28/10, variantes messagerie et maintenance du scénario rejouées sur l'API réelle (MariaDB, base neuve) : elles ont révélé l'affichage du message générique des 422 à l'écran Messagerie, corrigé. Le 29/10, scénario complet rejoué de nouveau (MariaDB, base neuve, QUEUE_CONNECTION=sync) : état des avances 805 000, aperçus MTN 406 000 et Moov 399 000 ; refus vérifiés avec leur motif en français (agent en double, séparation des tâches, numéro manquant). Depuis le 29/10, ce rejeu et la recette transverse sont versionnés (scripts/recette/) et exécutés à chaque PR (job « Recette · API réelle », API servie par php artisan serve sur une base neuve).</w:t>
+        <w:t>Recette sur l'API réelle (23/10/2026, recette alors hors dépôt, base SQLite neuve, QUEUE_CONNECTION=sync) : 83/83 contrôles conformes ; scénario de démonstration (docs/SCENARIO-DEMO.md) rejoué, conforme, puis de nouveau le 27/10 en version 1.4 (mêmes fichiers et montants, notifications de chaque signataire). Le 25/10, réponses réelles de l'API confrontées aux schémas d'openapi.yaml (openapi-core) : conformes après le n° 32 ; vérification automatisée en CI depuis le 28/10 (OpenApiReponsesTest). Le 28/10, variantes messagerie et maintenance du scénario rejouées sur l'API réelle (MariaDB, base neuve) : elles ont révélé l'affichage du message générique des 422 à l'écran Messagerie, corrigé. Le 29/10, scénario complet rejoué de nouveau (MariaDB, base neuve, QUEUE_CONNECTION=sync) : état des avances 805 000, aperçus MTN 406 000 et Moov 399 000 ; refus vérifiés avec leur motif en français (agent en double, séparation des tâches, numéro manquant). Depuis le 29/10, ce rejeu et la recette transverse sont versionnés (scripts/recette/) et exécutés à chaque PR (job « Recette · API réelle », API servie par php artisan serve sur une base neuve).</w:t>
       </w:r>
     </w:p>
     <w:p>
@@ -19076,7 +19076,7 @@
         <w:pStyle w:val="ListBullet"/>
       </w:pPr>
       <w:r>
-        <w:t>Défauts relevés par la revue d'octobre 2026 : 32, puis 23 de plus du 27 au 29/10 (n° 33 à 55, en confrontant la documentation au code et à l'interface, puis en soldant la dette technique), tous corrigés avec un test vu en échec sans le correctif (index : CHANGELOG.md ; détail : docs/revue-projet-2026-10.md §3 et §8). Les quatre décisions du §7.1 sont appliquées depuis la 1.4.</w:t>
+        <w:t>Défauts relevés par la revue d'octobre 2026 : 32, puis 26 de plus du 27 au 29/10 (n° 33 à 58, en confrontant la documentation au code et à l'interface, puis en soldant la dette technique), tous corrigés avec un test vu en échec sans le correctif (index : CHANGELOG.md ; détail : docs/revue-projet-2026-10.md §3 et §8). Les quatre décisions du §7.1 sont appliquées depuis la 1.4.</w:t>
       </w:r>
     </w:p>
     <w:p>
@@ -19114,7 +19114,7 @@
           <w:b w:val="0"/>
           <w:i w:val="0"/>
         </w:rPr>
-        <w:t>Le développement est terminé : 55 défauts relevés par la revue d'octobre 2026, la relecture des documents et la résorption de la dette (n° 1 à 55), tous corrigés avec un test ; quatre décisions (D1 à D4) appliquées ; dette technique soldée ; aucune décision en attente. Tous les documents sont confrontés au code (détail et cartographie : docs/revue-projet-2026-10.md §8).</w:t>
+        <w:t>Le développement est terminé : 58 défauts relevés par la revue d'octobre 2026, la relecture des documents et la résorption de la dette (n° 1 à 58), tous corrigés avec un test ; quatre décisions (D1 à D4) appliquées ; dette technique soldée ; aucune décision en attente. Tous les documents sont confrontés au code (détail et cartographie : docs/revue-projet-2026-10.md §8).</w:t>
       </w:r>
     </w:p>
     <w:tbl>
@@ -19192,7 +19192,7 @@
                 <w:b w:val="0"/>
                 <w:sz w:val="19"/>
               </w:rPr>
-              <w:t>702 tests, 79 fichiers — API complète sur SQLite (693), contrat OpenAPI vérifié ; sauvegarde, restauration et verrous sur MySQL réel (9)</w:t>
+              <w:t>703 tests, 79 fichiers — API complète sur SQLite (694), contrat OpenAPI vérifié ; sauvegarde, restauration et verrous sur MySQL réel (9)</w:t>
             </w:r>
           </w:p>
         </w:tc>
@@ -19224,7 +19224,7 @@
                 <w:b w:val="0"/>
                 <w:sz w:val="19"/>
               </w:rPr>
-              <w:t>241 tests, 48 fichiers — vues, services, stores, navigation ↔ permissions</w:t>
+              <w:t>245 tests, 48 fichiers — vues, services, stores, navigation ↔ permissions</w:t>
             </w:r>
           </w:p>
         </w:tc>

</xml_diff>